<commit_message>
Artigo ABNT: Seções 5.2/5.3 com confirmação da triangulação e tabela de associações
Inclui no documento as análises de confirmação por métodos convergentes:
- Seção 5.2 "Confirmação da triangulação por métodos convergentes" com a
  Tabela 17 (contraste em três vias: dz, IC95% bootstrap, Wilcoxon,
  permutação sign-flip e concordância) e a nota de invariância de dz/ICC
  à padronização por variável.
- Seção 5.3 "Síntese das associações e relações significativas" com a
  Tabela 18 consolidando os contrastes HIIT×jogo, o PSS por tipo de dia,
  as associações Epworth×perfil (Kruskal e tendência de Kendall) e as
  correlações significativas de humor, sono e estresse.

Builder atualizado (lakehouse/build_doc_word.js). Verificação: 0 travessão,
sem gerúndio, 11 figuras, 18 tabelas com largura de grade = 9505.

Co-Authored-By: Claude Opus 4.8 <noreply@anthropic.com>
Claude-Session: https://claude.ai/code/session_01P7yGiDeoGDyjWvPWQVsUrj
</commit_message>
<xml_diff>
--- a/Artigos/Analise_Descritiva_Triangulacao_ABNT.docx
+++ b/Artigos/Analise_Descritiva_Triangulacao_ABNT.docx
@@ -28387,6 +28387,4300 @@
           <w:szCs w:val="24"/>
         </w:rPr>
         <w:t xml:space="preserve">Um ponto tranquiliza quanto à leitura dinâmica do estudo. Embora a prevalência absoluta mude de forma expressiva entre as duas referências, a direção da migração ao longo da semana permanece a mesma nos dois modos, pois o perfil iceberg recua de D1 a D7 tanto na padronização interna quanto na externa. Assim, a interpretação central, a erosão do estado favorável conforme a carga se acumula, é robusta à escolha da referência, ainda que os rótulos absolutos dependam dela. Por essa razão, o estudo relata os perfis como descrição transversal do próprio elenco, e não como norma populacional.</w:t>
+      </w:r>
+    </w:p>
+    <w:p>
+      <w:pPr>
+        <w:keepNext/>
+        <w:spacing w:after="90" w:before="200" w:line="360" w:lineRule="auto"/>
+      </w:pPr>
+      <w:r>
+        <w:rPr>
+          <w:rFonts w:ascii="Times New Roman" w:cs="Times New Roman" w:eastAsia="Times New Roman" w:hAnsi="Times New Roman"/>
+          <w:b/>
+          <w:bCs/>
+          <w:color w:val="000000"/>
+          <w:sz w:val="24"/>
+          <w:szCs w:val="24"/>
+        </w:rPr>
+        <w:t xml:space="preserve">5.2 Confirmação da triangulação por métodos convergentes</w:t>
+      </w:r>
+    </w:p>
+    <w:p>
+      <w:pPr>
+        <w:spacing w:after="0" w:before="0" w:line="360" w:lineRule="auto"/>
+        <w:ind w:firstLine="709"/>
+        <w:jc w:val="both"/>
+      </w:pPr>
+      <w:r>
+        <w:rPr>
+          <w:rFonts w:ascii="Times New Roman" w:cs="Times New Roman" w:eastAsia="Times New Roman" w:hAnsi="Times New Roman"/>
+          <w:color w:val="000000"/>
+          <w:sz w:val="24"/>
+          <w:szCs w:val="24"/>
+        </w:rPr>
+        <w:t xml:space="preserve">A robustez de uma triangulação depende de os seus valores resistirem a mais de uma via de cálculo. Por isso, cada contraste e cada efeito agudo foi reavaliado por três caminhos independentes, a saber, o teste de Wilcoxon pareado, um teste de permutação por troca de sinais e o intervalo de confiança de 95% do tamanho de efeito obtido por reamostragem. A concordância entre as três vias serve de selo de confiança. O acordo foi elevado: 7 dos 8 contrastes e 23 dos 24 efeitos agudos apontaram no mesmo sentido pelas três abordagens.</w:t>
+      </w:r>
+    </w:p>
+    <w:p>
+      <w:pPr>
+        <w:keepNext/>
+        <w:spacing w:after="40" w:before="160" w:line="240"/>
+        <w:jc w:val="left"/>
+      </w:pPr>
+      <w:r>
+        <w:rPr>
+          <w:rFonts w:ascii="Times New Roman" w:cs="Times New Roman" w:eastAsia="Times New Roman" w:hAnsi="Times New Roman"/>
+          <w:b/>
+          <w:bCs/>
+          <w:color w:val="000000"/>
+          <w:sz w:val="20"/>
+          <w:szCs w:val="20"/>
+        </w:rPr>
+        <w:t xml:space="preserve">Tabela 17</w:t>
+      </w:r>
+      <w:r>
+        <w:rPr>
+          <w:rFonts w:ascii="Times New Roman" w:cs="Times New Roman" w:eastAsia="Times New Roman" w:hAnsi="Times New Roman"/>
+          <w:color w:val="000000"/>
+          <w:sz w:val="20"/>
+          <w:szCs w:val="20"/>
+        </w:rPr>
+        <w:t xml:space="preserve"> – Confirmação do contraste HIIT versus jogo por três vias independentes</w:t>
+      </w:r>
+    </w:p>
+    <w:tbl>
+      <w:tblPr>
+        <w:tblW w:type="dxa" w:w="9505"/>
+        <w:tblBorders>
+          <w:top w:val="single" w:color="000000" w:sz="6"/>
+          <w:left w:val="none"/>
+          <w:bottom w:val="single" w:color="000000" w:sz="6"/>
+          <w:right w:val="none"/>
+          <w:insideH w:val="none"/>
+          <w:insideV w:val="none"/>
+        </w:tblBorders>
+      </w:tblPr>
+      <w:tblGrid>
+        <w:gridCol w:w="2005"/>
+        <w:gridCol w:w="1000"/>
+        <w:gridCol w:w="1900"/>
+        <w:gridCol w:w="1500"/>
+        <w:gridCol w:w="1500"/>
+        <w:gridCol w:w="1600"/>
+      </w:tblGrid>
+      <w:tr>
+        <w:trPr>
+          <w:tblHeader/>
+        </w:trPr>
+        <w:tc>
+          <w:tcPr>
+            <w:tcW w:type="dxa" w:w="2005"/>
+            <w:tcBorders>
+              <w:top w:val="single" w:color="000000" w:sz="6"/>
+              <w:left w:val="none"/>
+              <w:bottom w:val="single" w:color="000000" w:sz="6"/>
+              <w:right w:val="none"/>
+            </w:tcBorders>
+            <w:tcMar>
+              <w:top w:type="dxa" w:w="40"/>
+              <w:left w:type="dxa" w:w="70"/>
+              <w:bottom w:type="dxa" w:w="40"/>
+              <w:right w:type="dxa" w:w="70"/>
+            </w:tcMar>
+            <w:vAlign w:val="center"/>
+          </w:tcPr>
+          <w:p>
+            <w:pPr>
+              <w:spacing w:after="0" w:line="240"/>
+              <w:jc w:val="left"/>
+            </w:pPr>
+            <w:r>
+              <w:rPr>
+                <w:rFonts w:ascii="Times New Roman" w:cs="Times New Roman" w:eastAsia="Times New Roman" w:hAnsi="Times New Roman"/>
+                <w:b/>
+                <w:bCs/>
+                <w:color w:val="000000"/>
+                <w:sz w:val="20"/>
+                <w:szCs w:val="20"/>
+              </w:rPr>
+              <w:t xml:space="preserve">Variável</w:t>
+            </w:r>
+          </w:p>
+        </w:tc>
+        <w:tc>
+          <w:tcPr>
+            <w:tcW w:type="dxa" w:w="1000"/>
+            <w:tcBorders>
+              <w:top w:val="single" w:color="000000" w:sz="6"/>
+              <w:left w:val="none"/>
+              <w:bottom w:val="single" w:color="000000" w:sz="6"/>
+              <w:right w:val="none"/>
+            </w:tcBorders>
+            <w:tcMar>
+              <w:top w:type="dxa" w:w="40"/>
+              <w:left w:type="dxa" w:w="70"/>
+              <w:bottom w:type="dxa" w:w="40"/>
+              <w:right w:type="dxa" w:w="70"/>
+            </w:tcMar>
+            <w:vAlign w:val="center"/>
+          </w:tcPr>
+          <w:p>
+            <w:pPr>
+              <w:spacing w:after="0" w:line="240"/>
+              <w:jc w:val="center"/>
+            </w:pPr>
+            <w:r>
+              <w:rPr>
+                <w:rFonts w:ascii="Times New Roman" w:cs="Times New Roman" w:eastAsia="Times New Roman" w:hAnsi="Times New Roman"/>
+                <w:b/>
+                <w:bCs/>
+                <w:color w:val="000000"/>
+                <w:sz w:val="20"/>
+                <w:szCs w:val="20"/>
+              </w:rPr>
+              <w:t xml:space="preserve">dz</w:t>
+            </w:r>
+          </w:p>
+        </w:tc>
+        <w:tc>
+          <w:tcPr>
+            <w:tcW w:type="dxa" w:w="1900"/>
+            <w:tcBorders>
+              <w:top w:val="single" w:color="000000" w:sz="6"/>
+              <w:left w:val="none"/>
+              <w:bottom w:val="single" w:color="000000" w:sz="6"/>
+              <w:right w:val="none"/>
+            </w:tcBorders>
+            <w:tcMar>
+              <w:top w:type="dxa" w:w="40"/>
+              <w:left w:type="dxa" w:w="70"/>
+              <w:bottom w:type="dxa" w:w="40"/>
+              <w:right w:type="dxa" w:w="70"/>
+            </w:tcMar>
+            <w:vAlign w:val="center"/>
+          </w:tcPr>
+          <w:p>
+            <w:pPr>
+              <w:spacing w:after="0" w:line="240"/>
+              <w:jc w:val="center"/>
+            </w:pPr>
+            <w:r>
+              <w:rPr>
+                <w:rFonts w:ascii="Times New Roman" w:cs="Times New Roman" w:eastAsia="Times New Roman" w:hAnsi="Times New Roman"/>
+                <w:b/>
+                <w:bCs/>
+                <w:color w:val="000000"/>
+                <w:sz w:val="20"/>
+                <w:szCs w:val="20"/>
+              </w:rPr>
+              <w:t xml:space="preserve">IC 95% do dz</w:t>
+            </w:r>
+          </w:p>
+        </w:tc>
+        <w:tc>
+          <w:tcPr>
+            <w:tcW w:type="dxa" w:w="1500"/>
+            <w:tcBorders>
+              <w:top w:val="single" w:color="000000" w:sz="6"/>
+              <w:left w:val="none"/>
+              <w:bottom w:val="single" w:color="000000" w:sz="6"/>
+              <w:right w:val="none"/>
+            </w:tcBorders>
+            <w:tcMar>
+              <w:top w:type="dxa" w:w="40"/>
+              <w:left w:type="dxa" w:w="70"/>
+              <w:bottom w:type="dxa" w:w="40"/>
+              <w:right w:type="dxa" w:w="70"/>
+            </w:tcMar>
+            <w:vAlign w:val="center"/>
+          </w:tcPr>
+          <w:p>
+            <w:pPr>
+              <w:spacing w:after="0" w:line="240"/>
+              <w:jc w:val="center"/>
+            </w:pPr>
+            <w:r>
+              <w:rPr>
+                <w:rFonts w:ascii="Times New Roman" w:cs="Times New Roman" w:eastAsia="Times New Roman" w:hAnsi="Times New Roman"/>
+                <w:b/>
+                <w:bCs/>
+                <w:color w:val="000000"/>
+                <w:sz w:val="20"/>
+                <w:szCs w:val="20"/>
+              </w:rPr>
+              <w:t xml:space="preserve">Wilcoxon</w:t>
+            </w:r>
+          </w:p>
+        </w:tc>
+        <w:tc>
+          <w:tcPr>
+            <w:tcW w:type="dxa" w:w="1500"/>
+            <w:tcBorders>
+              <w:top w:val="single" w:color="000000" w:sz="6"/>
+              <w:left w:val="none"/>
+              <w:bottom w:val="single" w:color="000000" w:sz="6"/>
+              <w:right w:val="none"/>
+            </w:tcBorders>
+            <w:tcMar>
+              <w:top w:type="dxa" w:w="40"/>
+              <w:left w:type="dxa" w:w="70"/>
+              <w:bottom w:type="dxa" w:w="40"/>
+              <w:right w:type="dxa" w:w="70"/>
+            </w:tcMar>
+            <w:vAlign w:val="center"/>
+          </w:tcPr>
+          <w:p>
+            <w:pPr>
+              <w:spacing w:after="0" w:line="240"/>
+              <w:jc w:val="center"/>
+            </w:pPr>
+            <w:r>
+              <w:rPr>
+                <w:rFonts w:ascii="Times New Roman" w:cs="Times New Roman" w:eastAsia="Times New Roman" w:hAnsi="Times New Roman"/>
+                <w:b/>
+                <w:bCs/>
+                <w:color w:val="000000"/>
+                <w:sz w:val="20"/>
+                <w:szCs w:val="20"/>
+              </w:rPr>
+              <w:t xml:space="preserve">Permutação</w:t>
+            </w:r>
+          </w:p>
+        </w:tc>
+        <w:tc>
+          <w:tcPr>
+            <w:tcW w:type="dxa" w:w="1600"/>
+            <w:tcBorders>
+              <w:top w:val="single" w:color="000000" w:sz="6"/>
+              <w:left w:val="none"/>
+              <w:bottom w:val="single" w:color="000000" w:sz="6"/>
+              <w:right w:val="none"/>
+            </w:tcBorders>
+            <w:tcMar>
+              <w:top w:type="dxa" w:w="40"/>
+              <w:left w:type="dxa" w:w="70"/>
+              <w:bottom w:type="dxa" w:w="40"/>
+              <w:right w:type="dxa" w:w="70"/>
+            </w:tcMar>
+            <w:vAlign w:val="center"/>
+          </w:tcPr>
+          <w:p>
+            <w:pPr>
+              <w:spacing w:after="0" w:line="240"/>
+              <w:jc w:val="center"/>
+            </w:pPr>
+            <w:r>
+              <w:rPr>
+                <w:rFonts w:ascii="Times New Roman" w:cs="Times New Roman" w:eastAsia="Times New Roman" w:hAnsi="Times New Roman"/>
+                <w:b/>
+                <w:bCs/>
+                <w:color w:val="000000"/>
+                <w:sz w:val="20"/>
+                <w:szCs w:val="20"/>
+              </w:rPr>
+              <w:t xml:space="preserve">Três vias</w:t>
+            </w:r>
+          </w:p>
+        </w:tc>
+      </w:tr>
+      <w:tr>
+        <w:tc>
+          <w:tcPr>
+            <w:tcW w:type="dxa" w:w="2005"/>
+            <w:tcBorders>
+              <w:top w:val="none"/>
+              <w:left w:val="none"/>
+              <w:bottom w:val="none"/>
+              <w:right w:val="none"/>
+            </w:tcBorders>
+            <w:tcMar>
+              <w:top w:type="dxa" w:w="30"/>
+              <w:left w:type="dxa" w:w="70"/>
+              <w:bottom w:type="dxa" w:w="30"/>
+              <w:right w:type="dxa" w:w="70"/>
+            </w:tcMar>
+            <w:vAlign w:val="center"/>
+          </w:tcPr>
+          <w:p>
+            <w:pPr>
+              <w:spacing w:after="0" w:line="240"/>
+              <w:jc w:val="left"/>
+            </w:pPr>
+            <w:r>
+              <w:rPr>
+                <w:rFonts w:ascii="Times New Roman" w:cs="Times New Roman" w:eastAsia="Times New Roman" w:hAnsi="Times New Roman"/>
+                <w:b/>
+                <w:bCs/>
+                <w:color w:val="000000"/>
+                <w:sz w:val="20"/>
+                <w:szCs w:val="20"/>
+              </w:rPr>
+              <w:t xml:space="preserve">Raiva</w:t>
+            </w:r>
+          </w:p>
+        </w:tc>
+        <w:tc>
+          <w:tcPr>
+            <w:tcW w:type="dxa" w:w="1000"/>
+            <w:tcBorders>
+              <w:top w:val="none"/>
+              <w:left w:val="none"/>
+              <w:bottom w:val="none"/>
+              <w:right w:val="none"/>
+            </w:tcBorders>
+            <w:tcMar>
+              <w:top w:type="dxa" w:w="30"/>
+              <w:left w:type="dxa" w:w="70"/>
+              <w:bottom w:type="dxa" w:w="30"/>
+              <w:right w:type="dxa" w:w="70"/>
+            </w:tcMar>
+            <w:vAlign w:val="center"/>
+          </w:tcPr>
+          <w:p>
+            <w:pPr>
+              <w:spacing w:after="0" w:line="240"/>
+              <w:jc w:val="center"/>
+            </w:pPr>
+            <w:r>
+              <w:rPr>
+                <w:rFonts w:ascii="Times New Roman" w:cs="Times New Roman" w:eastAsia="Times New Roman" w:hAnsi="Times New Roman"/>
+                <w:b/>
+                <w:bCs/>
+                <w:color w:val="000000"/>
+                <w:sz w:val="20"/>
+                <w:szCs w:val="20"/>
+              </w:rPr>
+              <w:t xml:space="preserve">+0,47</w:t>
+            </w:r>
+          </w:p>
+        </w:tc>
+        <w:tc>
+          <w:tcPr>
+            <w:tcW w:type="dxa" w:w="1900"/>
+            <w:tcBorders>
+              <w:top w:val="none"/>
+              <w:left w:val="none"/>
+              <w:bottom w:val="none"/>
+              <w:right w:val="none"/>
+            </w:tcBorders>
+            <w:tcMar>
+              <w:top w:type="dxa" w:w="30"/>
+              <w:left w:type="dxa" w:w="70"/>
+              <w:bottom w:type="dxa" w:w="30"/>
+              <w:right w:type="dxa" w:w="70"/>
+            </w:tcMar>
+            <w:vAlign w:val="center"/>
+          </w:tcPr>
+          <w:p>
+            <w:pPr>
+              <w:spacing w:after="0" w:line="240"/>
+              <w:jc w:val="center"/>
+            </w:pPr>
+            <w:r>
+              <w:rPr>
+                <w:rFonts w:ascii="Times New Roman" w:cs="Times New Roman" w:eastAsia="Times New Roman" w:hAnsi="Times New Roman"/>
+                <w:color w:val="000000"/>
+                <w:sz w:val="20"/>
+                <w:szCs w:val="20"/>
+              </w:rPr>
+              <w:t xml:space="preserve">[0,12; 0,85]</w:t>
+            </w:r>
+          </w:p>
+        </w:tc>
+        <w:tc>
+          <w:tcPr>
+            <w:tcW w:type="dxa" w:w="1500"/>
+            <w:tcBorders>
+              <w:top w:val="none"/>
+              <w:left w:val="none"/>
+              <w:bottom w:val="none"/>
+              <w:right w:val="none"/>
+            </w:tcBorders>
+            <w:tcMar>
+              <w:top w:type="dxa" w:w="30"/>
+              <w:left w:type="dxa" w:w="70"/>
+              <w:bottom w:type="dxa" w:w="30"/>
+              <w:right w:type="dxa" w:w="70"/>
+            </w:tcMar>
+            <w:vAlign w:val="center"/>
+          </w:tcPr>
+          <w:p>
+            <w:pPr>
+              <w:spacing w:after="0" w:line="240"/>
+              <w:jc w:val="center"/>
+            </w:pPr>
+            <w:r>
+              <w:rPr>
+                <w:rFonts w:ascii="Times New Roman" w:cs="Times New Roman" w:eastAsia="Times New Roman" w:hAnsi="Times New Roman"/>
+                <w:color w:val="1b7a3d"/>
+                <w:sz w:val="20"/>
+                <w:szCs w:val="20"/>
+              </w:rPr>
+              <w:t xml:space="preserve">p = 0,042</w:t>
+            </w:r>
+          </w:p>
+        </w:tc>
+        <w:tc>
+          <w:tcPr>
+            <w:tcW w:type="dxa" w:w="1500"/>
+            <w:tcBorders>
+              <w:top w:val="none"/>
+              <w:left w:val="none"/>
+              <w:bottom w:val="none"/>
+              <w:right w:val="none"/>
+            </w:tcBorders>
+            <w:tcMar>
+              <w:top w:type="dxa" w:w="30"/>
+              <w:left w:type="dxa" w:w="70"/>
+              <w:bottom w:type="dxa" w:w="30"/>
+              <w:right w:type="dxa" w:w="70"/>
+            </w:tcMar>
+            <w:vAlign w:val="center"/>
+          </w:tcPr>
+          <w:p>
+            <w:pPr>
+              <w:spacing w:after="0" w:line="240"/>
+              <w:jc w:val="center"/>
+            </w:pPr>
+            <w:r>
+              <w:rPr>
+                <w:rFonts w:ascii="Times New Roman" w:cs="Times New Roman" w:eastAsia="Times New Roman" w:hAnsi="Times New Roman"/>
+                <w:color w:val="1b7a3d"/>
+                <w:sz w:val="20"/>
+                <w:szCs w:val="20"/>
+              </w:rPr>
+              <w:t xml:space="preserve">p = 0,027</w:t>
+            </w:r>
+          </w:p>
+        </w:tc>
+        <w:tc>
+          <w:tcPr>
+            <w:tcW w:type="dxa" w:w="1600"/>
+            <w:tcBorders>
+              <w:top w:val="none"/>
+              <w:left w:val="none"/>
+              <w:bottom w:val="none"/>
+              <w:right w:val="none"/>
+            </w:tcBorders>
+            <w:tcMar>
+              <w:top w:type="dxa" w:w="30"/>
+              <w:left w:type="dxa" w:w="70"/>
+              <w:bottom w:type="dxa" w:w="30"/>
+              <w:right w:type="dxa" w:w="70"/>
+            </w:tcMar>
+            <w:vAlign w:val="center"/>
+          </w:tcPr>
+          <w:p>
+            <w:pPr>
+              <w:spacing w:after="0" w:line="240"/>
+              <w:jc w:val="center"/>
+            </w:pPr>
+            <w:r>
+              <w:rPr>
+                <w:rFonts w:ascii="Times New Roman" w:cs="Times New Roman" w:eastAsia="Times New Roman" w:hAnsi="Times New Roman"/>
+                <w:color w:val="000000"/>
+                <w:sz w:val="20"/>
+                <w:szCs w:val="20"/>
+              </w:rPr>
+              <w:t xml:space="preserve">sim</w:t>
+            </w:r>
+          </w:p>
+        </w:tc>
+      </w:tr>
+      <w:tr>
+        <w:tc>
+          <w:tcPr>
+            <w:tcW w:type="dxa" w:w="2005"/>
+            <w:tcBorders>
+              <w:top w:val="none"/>
+              <w:left w:val="none"/>
+              <w:bottom w:val="none"/>
+              <w:right w:val="none"/>
+            </w:tcBorders>
+            <w:tcMar>
+              <w:top w:type="dxa" w:w="30"/>
+              <w:left w:type="dxa" w:w="70"/>
+              <w:bottom w:type="dxa" w:w="30"/>
+              <w:right w:type="dxa" w:w="70"/>
+            </w:tcMar>
+            <w:vAlign w:val="center"/>
+          </w:tcPr>
+          <w:p>
+            <w:pPr>
+              <w:spacing w:after="0" w:line="240"/>
+              <w:jc w:val="left"/>
+            </w:pPr>
+            <w:r>
+              <w:rPr>
+                <w:rFonts w:ascii="Times New Roman" w:cs="Times New Roman" w:eastAsia="Times New Roman" w:hAnsi="Times New Roman"/>
+                <w:b/>
+                <w:bCs/>
+                <w:color w:val="000000"/>
+                <w:sz w:val="20"/>
+                <w:szCs w:val="20"/>
+              </w:rPr>
+              <w:t xml:space="preserve">PTH</w:t>
+            </w:r>
+          </w:p>
+        </w:tc>
+        <w:tc>
+          <w:tcPr>
+            <w:tcW w:type="dxa" w:w="1000"/>
+            <w:tcBorders>
+              <w:top w:val="none"/>
+              <w:left w:val="none"/>
+              <w:bottom w:val="none"/>
+              <w:right w:val="none"/>
+            </w:tcBorders>
+            <w:tcMar>
+              <w:top w:type="dxa" w:w="30"/>
+              <w:left w:type="dxa" w:w="70"/>
+              <w:bottom w:type="dxa" w:w="30"/>
+              <w:right w:type="dxa" w:w="70"/>
+            </w:tcMar>
+            <w:vAlign w:val="center"/>
+          </w:tcPr>
+          <w:p>
+            <w:pPr>
+              <w:spacing w:after="0" w:line="240"/>
+              <w:jc w:val="center"/>
+            </w:pPr>
+            <w:r>
+              <w:rPr>
+                <w:rFonts w:ascii="Times New Roman" w:cs="Times New Roman" w:eastAsia="Times New Roman" w:hAnsi="Times New Roman"/>
+                <w:b/>
+                <w:bCs/>
+                <w:color w:val="000000"/>
+                <w:sz w:val="20"/>
+                <w:szCs w:val="20"/>
+              </w:rPr>
+              <w:t xml:space="preserve">+0,46</w:t>
+            </w:r>
+          </w:p>
+        </w:tc>
+        <w:tc>
+          <w:tcPr>
+            <w:tcW w:type="dxa" w:w="1900"/>
+            <w:tcBorders>
+              <w:top w:val="none"/>
+              <w:left w:val="none"/>
+              <w:bottom w:val="none"/>
+              <w:right w:val="none"/>
+            </w:tcBorders>
+            <w:tcMar>
+              <w:top w:type="dxa" w:w="30"/>
+              <w:left w:type="dxa" w:w="70"/>
+              <w:bottom w:type="dxa" w:w="30"/>
+              <w:right w:type="dxa" w:w="70"/>
+            </w:tcMar>
+            <w:vAlign w:val="center"/>
+          </w:tcPr>
+          <w:p>
+            <w:pPr>
+              <w:spacing w:after="0" w:line="240"/>
+              <w:jc w:val="center"/>
+            </w:pPr>
+            <w:r>
+              <w:rPr>
+                <w:rFonts w:ascii="Times New Roman" w:cs="Times New Roman" w:eastAsia="Times New Roman" w:hAnsi="Times New Roman"/>
+                <w:color w:val="000000"/>
+                <w:sz w:val="20"/>
+                <w:szCs w:val="20"/>
+              </w:rPr>
+              <w:t xml:space="preserve">[0,10; 0,91]</w:t>
+            </w:r>
+          </w:p>
+        </w:tc>
+        <w:tc>
+          <w:tcPr>
+            <w:tcW w:type="dxa" w:w="1500"/>
+            <w:tcBorders>
+              <w:top w:val="none"/>
+              <w:left w:val="none"/>
+              <w:bottom w:val="none"/>
+              <w:right w:val="none"/>
+            </w:tcBorders>
+            <w:tcMar>
+              <w:top w:type="dxa" w:w="30"/>
+              <w:left w:type="dxa" w:w="70"/>
+              <w:bottom w:type="dxa" w:w="30"/>
+              <w:right w:type="dxa" w:w="70"/>
+            </w:tcMar>
+            <w:vAlign w:val="center"/>
+          </w:tcPr>
+          <w:p>
+            <w:pPr>
+              <w:spacing w:after="0" w:line="240"/>
+              <w:jc w:val="center"/>
+            </w:pPr>
+            <w:r>
+              <w:rPr>
+                <w:rFonts w:ascii="Times New Roman" w:cs="Times New Roman" w:eastAsia="Times New Roman" w:hAnsi="Times New Roman"/>
+                <w:color w:val="1b7a3d"/>
+                <w:sz w:val="20"/>
+                <w:szCs w:val="20"/>
+              </w:rPr>
+              <w:t xml:space="preserve">p = 0,048</w:t>
+            </w:r>
+          </w:p>
+        </w:tc>
+        <w:tc>
+          <w:tcPr>
+            <w:tcW w:type="dxa" w:w="1500"/>
+            <w:tcBorders>
+              <w:top w:val="none"/>
+              <w:left w:val="none"/>
+              <w:bottom w:val="none"/>
+              <w:right w:val="none"/>
+            </w:tcBorders>
+            <w:tcMar>
+              <w:top w:type="dxa" w:w="30"/>
+              <w:left w:type="dxa" w:w="70"/>
+              <w:bottom w:type="dxa" w:w="30"/>
+              <w:right w:type="dxa" w:w="70"/>
+            </w:tcMar>
+            <w:vAlign w:val="center"/>
+          </w:tcPr>
+          <w:p>
+            <w:pPr>
+              <w:spacing w:after="0" w:line="240"/>
+              <w:jc w:val="center"/>
+            </w:pPr>
+            <w:r>
+              <w:rPr>
+                <w:rFonts w:ascii="Times New Roman" w:cs="Times New Roman" w:eastAsia="Times New Roman" w:hAnsi="Times New Roman"/>
+                <w:color w:val="1b7a3d"/>
+                <w:sz w:val="20"/>
+                <w:szCs w:val="20"/>
+              </w:rPr>
+              <w:t xml:space="preserve">p = 0,029</w:t>
+            </w:r>
+          </w:p>
+        </w:tc>
+        <w:tc>
+          <w:tcPr>
+            <w:tcW w:type="dxa" w:w="1600"/>
+            <w:tcBorders>
+              <w:top w:val="none"/>
+              <w:left w:val="none"/>
+              <w:bottom w:val="none"/>
+              <w:right w:val="none"/>
+            </w:tcBorders>
+            <w:tcMar>
+              <w:top w:type="dxa" w:w="30"/>
+              <w:left w:type="dxa" w:w="70"/>
+              <w:bottom w:type="dxa" w:w="30"/>
+              <w:right w:type="dxa" w:w="70"/>
+            </w:tcMar>
+            <w:vAlign w:val="center"/>
+          </w:tcPr>
+          <w:p>
+            <w:pPr>
+              <w:spacing w:after="0" w:line="240"/>
+              <w:jc w:val="center"/>
+            </w:pPr>
+            <w:r>
+              <w:rPr>
+                <w:rFonts w:ascii="Times New Roman" w:cs="Times New Roman" w:eastAsia="Times New Roman" w:hAnsi="Times New Roman"/>
+                <w:color w:val="000000"/>
+                <w:sz w:val="20"/>
+                <w:szCs w:val="20"/>
+              </w:rPr>
+              <w:t xml:space="preserve">sim</w:t>
+            </w:r>
+          </w:p>
+        </w:tc>
+      </w:tr>
+      <w:tr>
+        <w:tc>
+          <w:tcPr>
+            <w:tcW w:type="dxa" w:w="2005"/>
+            <w:tcBorders>
+              <w:top w:val="none"/>
+              <w:left w:val="none"/>
+              <w:bottom w:val="none"/>
+              <w:right w:val="none"/>
+            </w:tcBorders>
+            <w:tcMar>
+              <w:top w:type="dxa" w:w="30"/>
+              <w:left w:type="dxa" w:w="70"/>
+              <w:bottom w:type="dxa" w:w="30"/>
+              <w:right w:type="dxa" w:w="70"/>
+            </w:tcMar>
+            <w:vAlign w:val="center"/>
+          </w:tcPr>
+          <w:p>
+            <w:pPr>
+              <w:spacing w:after="0" w:line="240"/>
+              <w:jc w:val="left"/>
+            </w:pPr>
+            <w:r>
+              <w:rPr>
+                <w:rFonts w:ascii="Times New Roman" w:cs="Times New Roman" w:eastAsia="Times New Roman" w:hAnsi="Times New Roman"/>
+                <w:b/>
+                <w:bCs/>
+                <w:color w:val="000000"/>
+                <w:sz w:val="20"/>
+                <w:szCs w:val="20"/>
+              </w:rPr>
+              <w:t xml:space="preserve">Depressão</w:t>
+            </w:r>
+          </w:p>
+        </w:tc>
+        <w:tc>
+          <w:tcPr>
+            <w:tcW w:type="dxa" w:w="1000"/>
+            <w:tcBorders>
+              <w:top w:val="none"/>
+              <w:left w:val="none"/>
+              <w:bottom w:val="none"/>
+              <w:right w:val="none"/>
+            </w:tcBorders>
+            <w:tcMar>
+              <w:top w:type="dxa" w:w="30"/>
+              <w:left w:type="dxa" w:w="70"/>
+              <w:bottom w:type="dxa" w:w="30"/>
+              <w:right w:type="dxa" w:w="70"/>
+            </w:tcMar>
+            <w:vAlign w:val="center"/>
+          </w:tcPr>
+          <w:p>
+            <w:pPr>
+              <w:spacing w:after="0" w:line="240"/>
+              <w:jc w:val="center"/>
+            </w:pPr>
+            <w:r>
+              <w:rPr>
+                <w:rFonts w:ascii="Times New Roman" w:cs="Times New Roman" w:eastAsia="Times New Roman" w:hAnsi="Times New Roman"/>
+                <w:b/>
+                <w:bCs/>
+                <w:color w:val="000000"/>
+                <w:sz w:val="20"/>
+                <w:szCs w:val="20"/>
+              </w:rPr>
+              <w:t xml:space="preserve">+0,45</w:t>
+            </w:r>
+          </w:p>
+        </w:tc>
+        <w:tc>
+          <w:tcPr>
+            <w:tcW w:type="dxa" w:w="1900"/>
+            <w:tcBorders>
+              <w:top w:val="none"/>
+              <w:left w:val="none"/>
+              <w:bottom w:val="none"/>
+              <w:right w:val="none"/>
+            </w:tcBorders>
+            <w:tcMar>
+              <w:top w:type="dxa" w:w="30"/>
+              <w:left w:type="dxa" w:w="70"/>
+              <w:bottom w:type="dxa" w:w="30"/>
+              <w:right w:type="dxa" w:w="70"/>
+            </w:tcMar>
+            <w:vAlign w:val="center"/>
+          </w:tcPr>
+          <w:p>
+            <w:pPr>
+              <w:spacing w:after="0" w:line="240"/>
+              <w:jc w:val="center"/>
+            </w:pPr>
+            <w:r>
+              <w:rPr>
+                <w:rFonts w:ascii="Times New Roman" w:cs="Times New Roman" w:eastAsia="Times New Roman" w:hAnsi="Times New Roman"/>
+                <w:color w:val="000000"/>
+                <w:sz w:val="20"/>
+                <w:szCs w:val="20"/>
+              </w:rPr>
+              <w:t xml:space="preserve">[0,24; 0,68]</w:t>
+            </w:r>
+          </w:p>
+        </w:tc>
+        <w:tc>
+          <w:tcPr>
+            <w:tcW w:type="dxa" w:w="1500"/>
+            <w:tcBorders>
+              <w:top w:val="none"/>
+              <w:left w:val="none"/>
+              <w:bottom w:val="none"/>
+              <w:right w:val="none"/>
+            </w:tcBorders>
+            <w:tcMar>
+              <w:top w:type="dxa" w:w="30"/>
+              <w:left w:type="dxa" w:w="70"/>
+              <w:bottom w:type="dxa" w:w="30"/>
+              <w:right w:type="dxa" w:w="70"/>
+            </w:tcMar>
+            <w:vAlign w:val="center"/>
+          </w:tcPr>
+          <w:p>
+            <w:pPr>
+              <w:spacing w:after="0" w:line="240"/>
+              <w:jc w:val="center"/>
+            </w:pPr>
+            <w:r>
+              <w:rPr>
+                <w:rFonts w:ascii="Times New Roman" w:cs="Times New Roman" w:eastAsia="Times New Roman" w:hAnsi="Times New Roman"/>
+                <w:color w:val="1b7a3d"/>
+                <w:sz w:val="20"/>
+                <w:szCs w:val="20"/>
+              </w:rPr>
+              <w:t xml:space="preserve">p = 0,037</w:t>
+            </w:r>
+          </w:p>
+        </w:tc>
+        <w:tc>
+          <w:tcPr>
+            <w:tcW w:type="dxa" w:w="1500"/>
+            <w:tcBorders>
+              <w:top w:val="none"/>
+              <w:left w:val="none"/>
+              <w:bottom w:val="none"/>
+              <w:right w:val="none"/>
+            </w:tcBorders>
+            <w:tcMar>
+              <w:top w:type="dxa" w:w="30"/>
+              <w:left w:type="dxa" w:w="70"/>
+              <w:bottom w:type="dxa" w:w="30"/>
+              <w:right w:type="dxa" w:w="70"/>
+            </w:tcMar>
+            <w:vAlign w:val="center"/>
+          </w:tcPr>
+          <w:p>
+            <w:pPr>
+              <w:spacing w:after="0" w:line="240"/>
+              <w:jc w:val="center"/>
+            </w:pPr>
+            <w:r>
+              <w:rPr>
+                <w:rFonts w:ascii="Times New Roman" w:cs="Times New Roman" w:eastAsia="Times New Roman" w:hAnsi="Times New Roman"/>
+                <w:color w:val="1b7a3d"/>
+                <w:sz w:val="20"/>
+                <w:szCs w:val="20"/>
+              </w:rPr>
+              <w:t xml:space="preserve">p = 0,014</w:t>
+            </w:r>
+          </w:p>
+        </w:tc>
+        <w:tc>
+          <w:tcPr>
+            <w:tcW w:type="dxa" w:w="1600"/>
+            <w:tcBorders>
+              <w:top w:val="none"/>
+              <w:left w:val="none"/>
+              <w:bottom w:val="none"/>
+              <w:right w:val="none"/>
+            </w:tcBorders>
+            <w:tcMar>
+              <w:top w:type="dxa" w:w="30"/>
+              <w:left w:type="dxa" w:w="70"/>
+              <w:bottom w:type="dxa" w:w="30"/>
+              <w:right w:type="dxa" w:w="70"/>
+            </w:tcMar>
+            <w:vAlign w:val="center"/>
+          </w:tcPr>
+          <w:p>
+            <w:pPr>
+              <w:spacing w:after="0" w:line="240"/>
+              <w:jc w:val="center"/>
+            </w:pPr>
+            <w:r>
+              <w:rPr>
+                <w:rFonts w:ascii="Times New Roman" w:cs="Times New Roman" w:eastAsia="Times New Roman" w:hAnsi="Times New Roman"/>
+                <w:color w:val="000000"/>
+                <w:sz w:val="20"/>
+                <w:szCs w:val="20"/>
+              </w:rPr>
+              <w:t xml:space="preserve">sim</w:t>
+            </w:r>
+          </w:p>
+        </w:tc>
+      </w:tr>
+      <w:tr>
+        <w:tc>
+          <w:tcPr>
+            <w:tcW w:type="dxa" w:w="2005"/>
+            <w:tcBorders>
+              <w:top w:val="none"/>
+              <w:left w:val="none"/>
+              <w:bottom w:val="none"/>
+              <w:right w:val="none"/>
+            </w:tcBorders>
+            <w:tcMar>
+              <w:top w:type="dxa" w:w="30"/>
+              <w:left w:type="dxa" w:w="70"/>
+              <w:bottom w:type="dxa" w:w="30"/>
+              <w:right w:type="dxa" w:w="70"/>
+            </w:tcMar>
+            <w:vAlign w:val="center"/>
+          </w:tcPr>
+          <w:p>
+            <w:pPr>
+              <w:spacing w:after="0" w:line="240"/>
+              <w:jc w:val="left"/>
+            </w:pPr>
+            <w:r>
+              <w:rPr>
+                <w:rFonts w:ascii="Times New Roman" w:cs="Times New Roman" w:eastAsia="Times New Roman" w:hAnsi="Times New Roman"/>
+                <w:b/>
+                <w:bCs/>
+                <w:color w:val="000000"/>
+                <w:sz w:val="20"/>
+                <w:szCs w:val="20"/>
+              </w:rPr>
+              <w:t xml:space="preserve">Confusão</w:t>
+            </w:r>
+          </w:p>
+        </w:tc>
+        <w:tc>
+          <w:tcPr>
+            <w:tcW w:type="dxa" w:w="1000"/>
+            <w:tcBorders>
+              <w:top w:val="none"/>
+              <w:left w:val="none"/>
+              <w:bottom w:val="none"/>
+              <w:right w:val="none"/>
+            </w:tcBorders>
+            <w:tcMar>
+              <w:top w:type="dxa" w:w="30"/>
+              <w:left w:type="dxa" w:w="70"/>
+              <w:bottom w:type="dxa" w:w="30"/>
+              <w:right w:type="dxa" w:w="70"/>
+            </w:tcMar>
+            <w:vAlign w:val="center"/>
+          </w:tcPr>
+          <w:p>
+            <w:pPr>
+              <w:spacing w:after="0" w:line="240"/>
+              <w:jc w:val="center"/>
+            </w:pPr>
+            <w:r>
+              <w:rPr>
+                <w:rFonts w:ascii="Times New Roman" w:cs="Times New Roman" w:eastAsia="Times New Roman" w:hAnsi="Times New Roman"/>
+                <w:b/>
+                <w:bCs/>
+                <w:color w:val="000000"/>
+                <w:sz w:val="20"/>
+                <w:szCs w:val="20"/>
+              </w:rPr>
+              <w:t xml:space="preserve">+0,45</w:t>
+            </w:r>
+          </w:p>
+        </w:tc>
+        <w:tc>
+          <w:tcPr>
+            <w:tcW w:type="dxa" w:w="1900"/>
+            <w:tcBorders>
+              <w:top w:val="none"/>
+              <w:left w:val="none"/>
+              <w:bottom w:val="none"/>
+              <w:right w:val="none"/>
+            </w:tcBorders>
+            <w:tcMar>
+              <w:top w:type="dxa" w:w="30"/>
+              <w:left w:type="dxa" w:w="70"/>
+              <w:bottom w:type="dxa" w:w="30"/>
+              <w:right w:type="dxa" w:w="70"/>
+            </w:tcMar>
+            <w:vAlign w:val="center"/>
+          </w:tcPr>
+          <w:p>
+            <w:pPr>
+              <w:spacing w:after="0" w:line="240"/>
+              <w:jc w:val="center"/>
+            </w:pPr>
+            <w:r>
+              <w:rPr>
+                <w:rFonts w:ascii="Times New Roman" w:cs="Times New Roman" w:eastAsia="Times New Roman" w:hAnsi="Times New Roman"/>
+                <w:color w:val="000000"/>
+                <w:sz w:val="20"/>
+                <w:szCs w:val="20"/>
+              </w:rPr>
+              <w:t xml:space="preserve">[0,10; 0,83]</w:t>
+            </w:r>
+          </w:p>
+        </w:tc>
+        <w:tc>
+          <w:tcPr>
+            <w:tcW w:type="dxa" w:w="1500"/>
+            <w:tcBorders>
+              <w:top w:val="none"/>
+              <w:left w:val="none"/>
+              <w:bottom w:val="none"/>
+              <w:right w:val="none"/>
+            </w:tcBorders>
+            <w:tcMar>
+              <w:top w:type="dxa" w:w="30"/>
+              <w:left w:type="dxa" w:w="70"/>
+              <w:bottom w:type="dxa" w:w="30"/>
+              <w:right w:type="dxa" w:w="70"/>
+            </w:tcMar>
+            <w:vAlign w:val="center"/>
+          </w:tcPr>
+          <w:p>
+            <w:pPr>
+              <w:spacing w:after="0" w:line="240"/>
+              <w:jc w:val="center"/>
+            </w:pPr>
+            <w:r>
+              <w:rPr>
+                <w:rFonts w:ascii="Times New Roman" w:cs="Times New Roman" w:eastAsia="Times New Roman" w:hAnsi="Times New Roman"/>
+                <w:color w:val="3f3f3f"/>
+                <w:sz w:val="20"/>
+                <w:szCs w:val="20"/>
+              </w:rPr>
+              <w:t xml:space="preserve">p = 0,076</w:t>
+            </w:r>
+          </w:p>
+        </w:tc>
+        <w:tc>
+          <w:tcPr>
+            <w:tcW w:type="dxa" w:w="1500"/>
+            <w:tcBorders>
+              <w:top w:val="none"/>
+              <w:left w:val="none"/>
+              <w:bottom w:val="none"/>
+              <w:right w:val="none"/>
+            </w:tcBorders>
+            <w:tcMar>
+              <w:top w:type="dxa" w:w="30"/>
+              <w:left w:type="dxa" w:w="70"/>
+              <w:bottom w:type="dxa" w:w="30"/>
+              <w:right w:type="dxa" w:w="70"/>
+            </w:tcMar>
+            <w:vAlign w:val="center"/>
+          </w:tcPr>
+          <w:p>
+            <w:pPr>
+              <w:spacing w:after="0" w:line="240"/>
+              <w:jc w:val="center"/>
+            </w:pPr>
+            <w:r>
+              <w:rPr>
+                <w:rFonts w:ascii="Times New Roman" w:cs="Times New Roman" w:eastAsia="Times New Roman" w:hAnsi="Times New Roman"/>
+                <w:color w:val="1b7a3d"/>
+                <w:sz w:val="20"/>
+                <w:szCs w:val="20"/>
+              </w:rPr>
+              <w:t xml:space="preserve">p = 0,033</w:t>
+            </w:r>
+          </w:p>
+        </w:tc>
+        <w:tc>
+          <w:tcPr>
+            <w:tcW w:type="dxa" w:w="1600"/>
+            <w:tcBorders>
+              <w:top w:val="none"/>
+              <w:left w:val="none"/>
+              <w:bottom w:val="none"/>
+              <w:right w:val="none"/>
+            </w:tcBorders>
+            <w:tcMar>
+              <w:top w:type="dxa" w:w="30"/>
+              <w:left w:type="dxa" w:w="70"/>
+              <w:bottom w:type="dxa" w:w="30"/>
+              <w:right w:type="dxa" w:w="70"/>
+            </w:tcMar>
+            <w:vAlign w:val="center"/>
+          </w:tcPr>
+          <w:p>
+            <w:pPr>
+              <w:spacing w:after="0" w:line="240"/>
+              <w:jc w:val="center"/>
+            </w:pPr>
+            <w:r>
+              <w:rPr>
+                <w:rFonts w:ascii="Times New Roman" w:cs="Times New Roman" w:eastAsia="Times New Roman" w:hAnsi="Times New Roman"/>
+                <w:color w:val="000000"/>
+                <w:sz w:val="20"/>
+                <w:szCs w:val="20"/>
+              </w:rPr>
+              <w:t xml:space="preserve">parcial</w:t>
+            </w:r>
+          </w:p>
+        </w:tc>
+      </w:tr>
+      <w:tr>
+        <w:tc>
+          <w:tcPr>
+            <w:tcW w:type="dxa" w:w="2005"/>
+            <w:tcBorders>
+              <w:top w:val="none"/>
+              <w:left w:val="none"/>
+              <w:bottom w:val="none"/>
+              <w:right w:val="none"/>
+            </w:tcBorders>
+            <w:tcMar>
+              <w:top w:type="dxa" w:w="30"/>
+              <w:left w:type="dxa" w:w="70"/>
+              <w:bottom w:type="dxa" w:w="30"/>
+              <w:right w:type="dxa" w:w="70"/>
+            </w:tcMar>
+            <w:vAlign w:val="center"/>
+          </w:tcPr>
+          <w:p>
+            <w:pPr>
+              <w:spacing w:after="0" w:line="240"/>
+              <w:jc w:val="left"/>
+            </w:pPr>
+            <w:r>
+              <w:rPr>
+                <w:rFonts w:ascii="Times New Roman" w:cs="Times New Roman" w:eastAsia="Times New Roman" w:hAnsi="Times New Roman"/>
+                <w:b/>
+                <w:bCs/>
+                <w:color w:val="000000"/>
+                <w:sz w:val="20"/>
+                <w:szCs w:val="20"/>
+              </w:rPr>
+              <w:t xml:space="preserve">Tensão</w:t>
+            </w:r>
+          </w:p>
+        </w:tc>
+        <w:tc>
+          <w:tcPr>
+            <w:tcW w:type="dxa" w:w="1000"/>
+            <w:tcBorders>
+              <w:top w:val="none"/>
+              <w:left w:val="none"/>
+              <w:bottom w:val="none"/>
+              <w:right w:val="none"/>
+            </w:tcBorders>
+            <w:tcMar>
+              <w:top w:type="dxa" w:w="30"/>
+              <w:left w:type="dxa" w:w="70"/>
+              <w:bottom w:type="dxa" w:w="30"/>
+              <w:right w:type="dxa" w:w="70"/>
+            </w:tcMar>
+            <w:vAlign w:val="center"/>
+          </w:tcPr>
+          <w:p>
+            <w:pPr>
+              <w:spacing w:after="0" w:line="240"/>
+              <w:jc w:val="center"/>
+            </w:pPr>
+            <w:r>
+              <w:rPr>
+                <w:rFonts w:ascii="Times New Roman" w:cs="Times New Roman" w:eastAsia="Times New Roman" w:hAnsi="Times New Roman"/>
+                <w:b/>
+                <w:bCs/>
+                <w:color w:val="000000"/>
+                <w:sz w:val="20"/>
+                <w:szCs w:val="20"/>
+              </w:rPr>
+              <w:t xml:space="preserve">+0,35</w:t>
+            </w:r>
+          </w:p>
+        </w:tc>
+        <w:tc>
+          <w:tcPr>
+            <w:tcW w:type="dxa" w:w="1900"/>
+            <w:tcBorders>
+              <w:top w:val="none"/>
+              <w:left w:val="none"/>
+              <w:bottom w:val="none"/>
+              <w:right w:val="none"/>
+            </w:tcBorders>
+            <w:tcMar>
+              <w:top w:type="dxa" w:w="30"/>
+              <w:left w:type="dxa" w:w="70"/>
+              <w:bottom w:type="dxa" w:w="30"/>
+              <w:right w:type="dxa" w:w="70"/>
+            </w:tcMar>
+            <w:vAlign w:val="center"/>
+          </w:tcPr>
+          <w:p>
+            <w:pPr>
+              <w:spacing w:after="0" w:line="240"/>
+              <w:jc w:val="center"/>
+            </w:pPr>
+            <w:r>
+              <w:rPr>
+                <w:rFonts w:ascii="Times New Roman" w:cs="Times New Roman" w:eastAsia="Times New Roman" w:hAnsi="Times New Roman"/>
+                <w:color w:val="000000"/>
+                <w:sz w:val="20"/>
+                <w:szCs w:val="20"/>
+              </w:rPr>
+              <w:t xml:space="preserve">[-0,03; 0,75]</w:t>
+            </w:r>
+          </w:p>
+        </w:tc>
+        <w:tc>
+          <w:tcPr>
+            <w:tcW w:type="dxa" w:w="1500"/>
+            <w:tcBorders>
+              <w:top w:val="none"/>
+              <w:left w:val="none"/>
+              <w:bottom w:val="none"/>
+              <w:right w:val="none"/>
+            </w:tcBorders>
+            <w:tcMar>
+              <w:top w:type="dxa" w:w="30"/>
+              <w:left w:type="dxa" w:w="70"/>
+              <w:bottom w:type="dxa" w:w="30"/>
+              <w:right w:type="dxa" w:w="70"/>
+            </w:tcMar>
+            <w:vAlign w:val="center"/>
+          </w:tcPr>
+          <w:p>
+            <w:pPr>
+              <w:spacing w:after="0" w:line="240"/>
+              <w:jc w:val="center"/>
+            </w:pPr>
+            <w:r>
+              <w:rPr>
+                <w:rFonts w:ascii="Times New Roman" w:cs="Times New Roman" w:eastAsia="Times New Roman" w:hAnsi="Times New Roman"/>
+                <w:color w:val="3f3f3f"/>
+                <w:sz w:val="20"/>
+                <w:szCs w:val="20"/>
+              </w:rPr>
+              <w:t xml:space="preserve">p = 0,093</w:t>
+            </w:r>
+          </w:p>
+        </w:tc>
+        <w:tc>
+          <w:tcPr>
+            <w:tcW w:type="dxa" w:w="1500"/>
+            <w:tcBorders>
+              <w:top w:val="none"/>
+              <w:left w:val="none"/>
+              <w:bottom w:val="none"/>
+              <w:right w:val="none"/>
+            </w:tcBorders>
+            <w:tcMar>
+              <w:top w:type="dxa" w:w="30"/>
+              <w:left w:type="dxa" w:w="70"/>
+              <w:bottom w:type="dxa" w:w="30"/>
+              <w:right w:type="dxa" w:w="70"/>
+            </w:tcMar>
+            <w:vAlign w:val="center"/>
+          </w:tcPr>
+          <w:p>
+            <w:pPr>
+              <w:spacing w:after="0" w:line="240"/>
+              <w:jc w:val="center"/>
+            </w:pPr>
+            <w:r>
+              <w:rPr>
+                <w:rFonts w:ascii="Times New Roman" w:cs="Times New Roman" w:eastAsia="Times New Roman" w:hAnsi="Times New Roman"/>
+                <w:color w:val="3f3f3f"/>
+                <w:sz w:val="20"/>
+                <w:szCs w:val="20"/>
+              </w:rPr>
+              <w:t xml:space="preserve">p = 0,092</w:t>
+            </w:r>
+          </w:p>
+        </w:tc>
+        <w:tc>
+          <w:tcPr>
+            <w:tcW w:type="dxa" w:w="1600"/>
+            <w:tcBorders>
+              <w:top w:val="none"/>
+              <w:left w:val="none"/>
+              <w:bottom w:val="none"/>
+              <w:right w:val="none"/>
+            </w:tcBorders>
+            <w:tcMar>
+              <w:top w:type="dxa" w:w="30"/>
+              <w:left w:type="dxa" w:w="70"/>
+              <w:bottom w:type="dxa" w:w="30"/>
+              <w:right w:type="dxa" w:w="70"/>
+            </w:tcMar>
+            <w:vAlign w:val="center"/>
+          </w:tcPr>
+          <w:p>
+            <w:pPr>
+              <w:spacing w:after="0" w:line="240"/>
+              <w:jc w:val="center"/>
+            </w:pPr>
+            <w:r>
+              <w:rPr>
+                <w:rFonts w:ascii="Times New Roman" w:cs="Times New Roman" w:eastAsia="Times New Roman" w:hAnsi="Times New Roman"/>
+                <w:color w:val="000000"/>
+                <w:sz w:val="20"/>
+                <w:szCs w:val="20"/>
+              </w:rPr>
+              <w:t xml:space="preserve">sim</w:t>
+            </w:r>
+          </w:p>
+        </w:tc>
+      </w:tr>
+      <w:tr>
+        <w:tc>
+          <w:tcPr>
+            <w:tcW w:type="dxa" w:w="2005"/>
+            <w:tcBorders>
+              <w:top w:val="none"/>
+              <w:left w:val="none"/>
+              <w:bottom w:val="none"/>
+              <w:right w:val="none"/>
+            </w:tcBorders>
+            <w:tcMar>
+              <w:top w:type="dxa" w:w="30"/>
+              <w:left w:type="dxa" w:w="70"/>
+              <w:bottom w:type="dxa" w:w="30"/>
+              <w:right w:type="dxa" w:w="70"/>
+            </w:tcMar>
+            <w:vAlign w:val="center"/>
+          </w:tcPr>
+          <w:p>
+            <w:pPr>
+              <w:spacing w:after="0" w:line="240"/>
+              <w:jc w:val="left"/>
+            </w:pPr>
+            <w:r>
+              <w:rPr>
+                <w:rFonts w:ascii="Times New Roman" w:cs="Times New Roman" w:eastAsia="Times New Roman" w:hAnsi="Times New Roman"/>
+                <w:b/>
+                <w:bCs/>
+                <w:color w:val="000000"/>
+                <w:sz w:val="20"/>
+                <w:szCs w:val="20"/>
+              </w:rPr>
+              <w:t xml:space="preserve">Fadiga</w:t>
+            </w:r>
+          </w:p>
+        </w:tc>
+        <w:tc>
+          <w:tcPr>
+            <w:tcW w:type="dxa" w:w="1000"/>
+            <w:tcBorders>
+              <w:top w:val="none"/>
+              <w:left w:val="none"/>
+              <w:bottom w:val="none"/>
+              <w:right w:val="none"/>
+            </w:tcBorders>
+            <w:tcMar>
+              <w:top w:type="dxa" w:w="30"/>
+              <w:left w:type="dxa" w:w="70"/>
+              <w:bottom w:type="dxa" w:w="30"/>
+              <w:right w:type="dxa" w:w="70"/>
+            </w:tcMar>
+            <w:vAlign w:val="center"/>
+          </w:tcPr>
+          <w:p>
+            <w:pPr>
+              <w:spacing w:after="0" w:line="240"/>
+              <w:jc w:val="center"/>
+            </w:pPr>
+            <w:r>
+              <w:rPr>
+                <w:rFonts w:ascii="Times New Roman" w:cs="Times New Roman" w:eastAsia="Times New Roman" w:hAnsi="Times New Roman"/>
+                <w:b/>
+                <w:bCs/>
+                <w:color w:val="000000"/>
+                <w:sz w:val="20"/>
+                <w:szCs w:val="20"/>
+              </w:rPr>
+              <w:t xml:space="preserve">+0,20</w:t>
+            </w:r>
+          </w:p>
+        </w:tc>
+        <w:tc>
+          <w:tcPr>
+            <w:tcW w:type="dxa" w:w="1900"/>
+            <w:tcBorders>
+              <w:top w:val="none"/>
+              <w:left w:val="none"/>
+              <w:bottom w:val="none"/>
+              <w:right w:val="none"/>
+            </w:tcBorders>
+            <w:tcMar>
+              <w:top w:type="dxa" w:w="30"/>
+              <w:left w:type="dxa" w:w="70"/>
+              <w:bottom w:type="dxa" w:w="30"/>
+              <w:right w:type="dxa" w:w="70"/>
+            </w:tcMar>
+            <w:vAlign w:val="center"/>
+          </w:tcPr>
+          <w:p>
+            <w:pPr>
+              <w:spacing w:after="0" w:line="240"/>
+              <w:jc w:val="center"/>
+            </w:pPr>
+            <w:r>
+              <w:rPr>
+                <w:rFonts w:ascii="Times New Roman" w:cs="Times New Roman" w:eastAsia="Times New Roman" w:hAnsi="Times New Roman"/>
+                <w:color w:val="000000"/>
+                <w:sz w:val="20"/>
+                <w:szCs w:val="20"/>
+              </w:rPr>
+              <w:t xml:space="preserve">[-0,20; 0,63]</w:t>
+            </w:r>
+          </w:p>
+        </w:tc>
+        <w:tc>
+          <w:tcPr>
+            <w:tcW w:type="dxa" w:w="1500"/>
+            <w:tcBorders>
+              <w:top w:val="none"/>
+              <w:left w:val="none"/>
+              <w:bottom w:val="none"/>
+              <w:right w:val="none"/>
+            </w:tcBorders>
+            <w:tcMar>
+              <w:top w:type="dxa" w:w="30"/>
+              <w:left w:type="dxa" w:w="70"/>
+              <w:bottom w:type="dxa" w:w="30"/>
+              <w:right w:type="dxa" w:w="70"/>
+            </w:tcMar>
+            <w:vAlign w:val="center"/>
+          </w:tcPr>
+          <w:p>
+            <w:pPr>
+              <w:spacing w:after="0" w:line="240"/>
+              <w:jc w:val="center"/>
+            </w:pPr>
+            <w:r>
+              <w:rPr>
+                <w:rFonts w:ascii="Times New Roman" w:cs="Times New Roman" w:eastAsia="Times New Roman" w:hAnsi="Times New Roman"/>
+                <w:color w:val="3f3f3f"/>
+                <w:sz w:val="20"/>
+                <w:szCs w:val="20"/>
+              </w:rPr>
+              <w:t xml:space="preserve">p = 0,493</w:t>
+            </w:r>
+          </w:p>
+        </w:tc>
+        <w:tc>
+          <w:tcPr>
+            <w:tcW w:type="dxa" w:w="1500"/>
+            <w:tcBorders>
+              <w:top w:val="none"/>
+              <w:left w:val="none"/>
+              <w:bottom w:val="none"/>
+              <w:right w:val="none"/>
+            </w:tcBorders>
+            <w:tcMar>
+              <w:top w:type="dxa" w:w="30"/>
+              <w:left w:type="dxa" w:w="70"/>
+              <w:bottom w:type="dxa" w:w="30"/>
+              <w:right w:type="dxa" w:w="70"/>
+            </w:tcMar>
+            <w:vAlign w:val="center"/>
+          </w:tcPr>
+          <w:p>
+            <w:pPr>
+              <w:spacing w:after="0" w:line="240"/>
+              <w:jc w:val="center"/>
+            </w:pPr>
+            <w:r>
+              <w:rPr>
+                <w:rFonts w:ascii="Times New Roman" w:cs="Times New Roman" w:eastAsia="Times New Roman" w:hAnsi="Times New Roman"/>
+                <w:color w:val="3f3f3f"/>
+                <w:sz w:val="20"/>
+                <w:szCs w:val="20"/>
+              </w:rPr>
+              <w:t xml:space="preserve">p = 0,323</w:t>
+            </w:r>
+          </w:p>
+        </w:tc>
+        <w:tc>
+          <w:tcPr>
+            <w:tcW w:type="dxa" w:w="1600"/>
+            <w:tcBorders>
+              <w:top w:val="none"/>
+              <w:left w:val="none"/>
+              <w:bottom w:val="none"/>
+              <w:right w:val="none"/>
+            </w:tcBorders>
+            <w:tcMar>
+              <w:top w:type="dxa" w:w="30"/>
+              <w:left w:type="dxa" w:w="70"/>
+              <w:bottom w:type="dxa" w:w="30"/>
+              <w:right w:type="dxa" w:w="70"/>
+            </w:tcMar>
+            <w:vAlign w:val="center"/>
+          </w:tcPr>
+          <w:p>
+            <w:pPr>
+              <w:spacing w:after="0" w:line="240"/>
+              <w:jc w:val="center"/>
+            </w:pPr>
+            <w:r>
+              <w:rPr>
+                <w:rFonts w:ascii="Times New Roman" w:cs="Times New Roman" w:eastAsia="Times New Roman" w:hAnsi="Times New Roman"/>
+                <w:color w:val="000000"/>
+                <w:sz w:val="20"/>
+                <w:szCs w:val="20"/>
+              </w:rPr>
+              <w:t xml:space="preserve">sim</w:t>
+            </w:r>
+          </w:p>
+        </w:tc>
+      </w:tr>
+      <w:tr>
+        <w:tc>
+          <w:tcPr>
+            <w:tcW w:type="dxa" w:w="2005"/>
+            <w:tcBorders>
+              <w:top w:val="none"/>
+              <w:left w:val="none"/>
+              <w:bottom w:val="none"/>
+              <w:right w:val="none"/>
+            </w:tcBorders>
+            <w:tcMar>
+              <w:top w:type="dxa" w:w="30"/>
+              <w:left w:type="dxa" w:w="70"/>
+              <w:bottom w:type="dxa" w:w="30"/>
+              <w:right w:type="dxa" w:w="70"/>
+            </w:tcMar>
+            <w:vAlign w:val="center"/>
+          </w:tcPr>
+          <w:p>
+            <w:pPr>
+              <w:spacing w:after="0" w:line="240"/>
+              <w:jc w:val="left"/>
+            </w:pPr>
+            <w:r>
+              <w:rPr>
+                <w:rFonts w:ascii="Times New Roman" w:cs="Times New Roman" w:eastAsia="Times New Roman" w:hAnsi="Times New Roman"/>
+                <w:b/>
+                <w:bCs/>
+                <w:color w:val="000000"/>
+                <w:sz w:val="20"/>
+                <w:szCs w:val="20"/>
+              </w:rPr>
+              <w:t xml:space="preserve">Fadiga física</w:t>
+            </w:r>
+          </w:p>
+        </w:tc>
+        <w:tc>
+          <w:tcPr>
+            <w:tcW w:type="dxa" w:w="1000"/>
+            <w:tcBorders>
+              <w:top w:val="none"/>
+              <w:left w:val="none"/>
+              <w:bottom w:val="none"/>
+              <w:right w:val="none"/>
+            </w:tcBorders>
+            <w:tcMar>
+              <w:top w:type="dxa" w:w="30"/>
+              <w:left w:type="dxa" w:w="70"/>
+              <w:bottom w:type="dxa" w:w="30"/>
+              <w:right w:type="dxa" w:w="70"/>
+            </w:tcMar>
+            <w:vAlign w:val="center"/>
+          </w:tcPr>
+          <w:p>
+            <w:pPr>
+              <w:spacing w:after="0" w:line="240"/>
+              <w:jc w:val="center"/>
+            </w:pPr>
+            <w:r>
+              <w:rPr>
+                <w:rFonts w:ascii="Times New Roman" w:cs="Times New Roman" w:eastAsia="Times New Roman" w:hAnsi="Times New Roman"/>
+                <w:b/>
+                <w:bCs/>
+                <w:color w:val="000000"/>
+                <w:sz w:val="20"/>
+                <w:szCs w:val="20"/>
+              </w:rPr>
+              <w:t xml:space="preserve">+0,00</w:t>
+            </w:r>
+          </w:p>
+        </w:tc>
+        <w:tc>
+          <w:tcPr>
+            <w:tcW w:type="dxa" w:w="1900"/>
+            <w:tcBorders>
+              <w:top w:val="none"/>
+              <w:left w:val="none"/>
+              <w:bottom w:val="none"/>
+              <w:right w:val="none"/>
+            </w:tcBorders>
+            <w:tcMar>
+              <w:top w:type="dxa" w:w="30"/>
+              <w:left w:type="dxa" w:w="70"/>
+              <w:bottom w:type="dxa" w:w="30"/>
+              <w:right w:type="dxa" w:w="70"/>
+            </w:tcMar>
+            <w:vAlign w:val="center"/>
+          </w:tcPr>
+          <w:p>
+            <w:pPr>
+              <w:spacing w:after="0" w:line="240"/>
+              <w:jc w:val="center"/>
+            </w:pPr>
+            <w:r>
+              <w:rPr>
+                <w:rFonts w:ascii="Times New Roman" w:cs="Times New Roman" w:eastAsia="Times New Roman" w:hAnsi="Times New Roman"/>
+                <w:color w:val="000000"/>
+                <w:sz w:val="20"/>
+                <w:szCs w:val="20"/>
+              </w:rPr>
+              <w:t xml:space="preserve">[-0,51; 0,36]</w:t>
+            </w:r>
+          </w:p>
+        </w:tc>
+        <w:tc>
+          <w:tcPr>
+            <w:tcW w:type="dxa" w:w="1500"/>
+            <w:tcBorders>
+              <w:top w:val="none"/>
+              <w:left w:val="none"/>
+              <w:bottom w:val="none"/>
+              <w:right w:val="none"/>
+            </w:tcBorders>
+            <w:tcMar>
+              <w:top w:type="dxa" w:w="30"/>
+              <w:left w:type="dxa" w:w="70"/>
+              <w:bottom w:type="dxa" w:w="30"/>
+              <w:right w:type="dxa" w:w="70"/>
+            </w:tcMar>
+            <w:vAlign w:val="center"/>
+          </w:tcPr>
+          <w:p>
+            <w:pPr>
+              <w:spacing w:after="0" w:line="240"/>
+              <w:jc w:val="center"/>
+            </w:pPr>
+            <w:r>
+              <w:rPr>
+                <w:rFonts w:ascii="Times New Roman" w:cs="Times New Roman" w:eastAsia="Times New Roman" w:hAnsi="Times New Roman"/>
+                <w:color w:val="3f3f3f"/>
+                <w:sz w:val="20"/>
+                <w:szCs w:val="20"/>
+              </w:rPr>
+              <w:t xml:space="preserve">p = 0,677</w:t>
+            </w:r>
+          </w:p>
+        </w:tc>
+        <w:tc>
+          <w:tcPr>
+            <w:tcW w:type="dxa" w:w="1500"/>
+            <w:tcBorders>
+              <w:top w:val="none"/>
+              <w:left w:val="none"/>
+              <w:bottom w:val="none"/>
+              <w:right w:val="none"/>
+            </w:tcBorders>
+            <w:tcMar>
+              <w:top w:type="dxa" w:w="30"/>
+              <w:left w:type="dxa" w:w="70"/>
+              <w:bottom w:type="dxa" w:w="30"/>
+              <w:right w:type="dxa" w:w="70"/>
+            </w:tcMar>
+            <w:vAlign w:val="center"/>
+          </w:tcPr>
+          <w:p>
+            <w:pPr>
+              <w:spacing w:after="0" w:line="240"/>
+              <w:jc w:val="center"/>
+            </w:pPr>
+            <w:r>
+              <w:rPr>
+                <w:rFonts w:ascii="Times New Roman" w:cs="Times New Roman" w:eastAsia="Times New Roman" w:hAnsi="Times New Roman"/>
+                <w:color w:val="3f3f3f"/>
+                <w:sz w:val="20"/>
+                <w:szCs w:val="20"/>
+              </w:rPr>
+              <w:t xml:space="preserve">p = 0,998</w:t>
+            </w:r>
+          </w:p>
+        </w:tc>
+        <w:tc>
+          <w:tcPr>
+            <w:tcW w:type="dxa" w:w="1600"/>
+            <w:tcBorders>
+              <w:top w:val="none"/>
+              <w:left w:val="none"/>
+              <w:bottom w:val="none"/>
+              <w:right w:val="none"/>
+            </w:tcBorders>
+            <w:tcMar>
+              <w:top w:type="dxa" w:w="30"/>
+              <w:left w:type="dxa" w:w="70"/>
+              <w:bottom w:type="dxa" w:w="30"/>
+              <w:right w:type="dxa" w:w="70"/>
+            </w:tcMar>
+            <w:vAlign w:val="center"/>
+          </w:tcPr>
+          <w:p>
+            <w:pPr>
+              <w:spacing w:after="0" w:line="240"/>
+              <w:jc w:val="center"/>
+            </w:pPr>
+            <w:r>
+              <w:rPr>
+                <w:rFonts w:ascii="Times New Roman" w:cs="Times New Roman" w:eastAsia="Times New Roman" w:hAnsi="Times New Roman"/>
+                <w:color w:val="000000"/>
+                <w:sz w:val="20"/>
+                <w:szCs w:val="20"/>
+              </w:rPr>
+              <w:t xml:space="preserve">sim</w:t>
+            </w:r>
+          </w:p>
+        </w:tc>
+      </w:tr>
+      <w:tr>
+        <w:tc>
+          <w:tcPr>
+            <w:tcW w:type="dxa" w:w="2005"/>
+            <w:tcBorders>
+              <w:top w:val="none"/>
+              <w:left w:val="none"/>
+              <w:bottom w:val="single" w:color="000000" w:sz="6"/>
+              <w:right w:val="none"/>
+            </w:tcBorders>
+            <w:tcMar>
+              <w:top w:type="dxa" w:w="30"/>
+              <w:left w:type="dxa" w:w="70"/>
+              <w:bottom w:type="dxa" w:w="30"/>
+              <w:right w:type="dxa" w:w="70"/>
+            </w:tcMar>
+            <w:vAlign w:val="center"/>
+          </w:tcPr>
+          <w:p>
+            <w:pPr>
+              <w:spacing w:after="0" w:line="240"/>
+              <w:jc w:val="left"/>
+            </w:pPr>
+            <w:r>
+              <w:rPr>
+                <w:rFonts w:ascii="Times New Roman" w:cs="Times New Roman" w:eastAsia="Times New Roman" w:hAnsi="Times New Roman"/>
+                <w:b/>
+                <w:bCs/>
+                <w:color w:val="000000"/>
+                <w:sz w:val="20"/>
+                <w:szCs w:val="20"/>
+              </w:rPr>
+              <w:t xml:space="preserve">Vigor</w:t>
+            </w:r>
+          </w:p>
+        </w:tc>
+        <w:tc>
+          <w:tcPr>
+            <w:tcW w:type="dxa" w:w="1000"/>
+            <w:tcBorders>
+              <w:top w:val="none"/>
+              <w:left w:val="none"/>
+              <w:bottom w:val="single" w:color="000000" w:sz="6"/>
+              <w:right w:val="none"/>
+            </w:tcBorders>
+            <w:tcMar>
+              <w:top w:type="dxa" w:w="30"/>
+              <w:left w:type="dxa" w:w="70"/>
+              <w:bottom w:type="dxa" w:w="30"/>
+              <w:right w:type="dxa" w:w="70"/>
+            </w:tcMar>
+            <w:vAlign w:val="center"/>
+          </w:tcPr>
+          <w:p>
+            <w:pPr>
+              <w:spacing w:after="0" w:line="240"/>
+              <w:jc w:val="center"/>
+            </w:pPr>
+            <w:r>
+              <w:rPr>
+                <w:rFonts w:ascii="Times New Roman" w:cs="Times New Roman" w:eastAsia="Times New Roman" w:hAnsi="Times New Roman"/>
+                <w:b/>
+                <w:bCs/>
+                <w:color w:val="000000"/>
+                <w:sz w:val="20"/>
+                <w:szCs w:val="20"/>
+              </w:rPr>
+              <w:t xml:space="preserve">-0,02</w:t>
+            </w:r>
+          </w:p>
+        </w:tc>
+        <w:tc>
+          <w:tcPr>
+            <w:tcW w:type="dxa" w:w="1900"/>
+            <w:tcBorders>
+              <w:top w:val="none"/>
+              <w:left w:val="none"/>
+              <w:bottom w:val="single" w:color="000000" w:sz="6"/>
+              <w:right w:val="none"/>
+            </w:tcBorders>
+            <w:tcMar>
+              <w:top w:type="dxa" w:w="30"/>
+              <w:left w:type="dxa" w:w="70"/>
+              <w:bottom w:type="dxa" w:w="30"/>
+              <w:right w:type="dxa" w:w="70"/>
+            </w:tcMar>
+            <w:vAlign w:val="center"/>
+          </w:tcPr>
+          <w:p>
+            <w:pPr>
+              <w:spacing w:after="0" w:line="240"/>
+              <w:jc w:val="center"/>
+            </w:pPr>
+            <w:r>
+              <w:rPr>
+                <w:rFonts w:ascii="Times New Roman" w:cs="Times New Roman" w:eastAsia="Times New Roman" w:hAnsi="Times New Roman"/>
+                <w:color w:val="000000"/>
+                <w:sz w:val="20"/>
+                <w:szCs w:val="20"/>
+              </w:rPr>
+              <w:t xml:space="preserve">[-0,45; 0,38]</w:t>
+            </w:r>
+          </w:p>
+        </w:tc>
+        <w:tc>
+          <w:tcPr>
+            <w:tcW w:type="dxa" w:w="1500"/>
+            <w:tcBorders>
+              <w:top w:val="none"/>
+              <w:left w:val="none"/>
+              <w:bottom w:val="single" w:color="000000" w:sz="6"/>
+              <w:right w:val="none"/>
+            </w:tcBorders>
+            <w:tcMar>
+              <w:top w:type="dxa" w:w="30"/>
+              <w:left w:type="dxa" w:w="70"/>
+              <w:bottom w:type="dxa" w:w="30"/>
+              <w:right w:type="dxa" w:w="70"/>
+            </w:tcMar>
+            <w:vAlign w:val="center"/>
+          </w:tcPr>
+          <w:p>
+            <w:pPr>
+              <w:spacing w:after="0" w:line="240"/>
+              <w:jc w:val="center"/>
+            </w:pPr>
+            <w:r>
+              <w:rPr>
+                <w:rFonts w:ascii="Times New Roman" w:cs="Times New Roman" w:eastAsia="Times New Roman" w:hAnsi="Times New Roman"/>
+                <w:color w:val="3f3f3f"/>
+                <w:sz w:val="20"/>
+                <w:szCs w:val="20"/>
+              </w:rPr>
+              <w:t xml:space="preserve">p = 0,867</w:t>
+            </w:r>
+          </w:p>
+        </w:tc>
+        <w:tc>
+          <w:tcPr>
+            <w:tcW w:type="dxa" w:w="1500"/>
+            <w:tcBorders>
+              <w:top w:val="none"/>
+              <w:left w:val="none"/>
+              <w:bottom w:val="single" w:color="000000" w:sz="6"/>
+              <w:right w:val="none"/>
+            </w:tcBorders>
+            <w:tcMar>
+              <w:top w:type="dxa" w:w="30"/>
+              <w:left w:type="dxa" w:w="70"/>
+              <w:bottom w:type="dxa" w:w="30"/>
+              <w:right w:type="dxa" w:w="70"/>
+            </w:tcMar>
+            <w:vAlign w:val="center"/>
+          </w:tcPr>
+          <w:p>
+            <w:pPr>
+              <w:spacing w:after="0" w:line="240"/>
+              <w:jc w:val="center"/>
+            </w:pPr>
+            <w:r>
+              <w:rPr>
+                <w:rFonts w:ascii="Times New Roman" w:cs="Times New Roman" w:eastAsia="Times New Roman" w:hAnsi="Times New Roman"/>
+                <w:color w:val="3f3f3f"/>
+                <w:sz w:val="20"/>
+                <w:szCs w:val="20"/>
+              </w:rPr>
+              <w:t xml:space="preserve">p = 0,923</w:t>
+            </w:r>
+          </w:p>
+        </w:tc>
+        <w:tc>
+          <w:tcPr>
+            <w:tcW w:type="dxa" w:w="1600"/>
+            <w:tcBorders>
+              <w:top w:val="none"/>
+              <w:left w:val="none"/>
+              <w:bottom w:val="single" w:color="000000" w:sz="6"/>
+              <w:right w:val="none"/>
+            </w:tcBorders>
+            <w:tcMar>
+              <w:top w:type="dxa" w:w="30"/>
+              <w:left w:type="dxa" w:w="70"/>
+              <w:bottom w:type="dxa" w:w="30"/>
+              <w:right w:type="dxa" w:w="70"/>
+            </w:tcMar>
+            <w:vAlign w:val="center"/>
+          </w:tcPr>
+          <w:p>
+            <w:pPr>
+              <w:spacing w:after="0" w:line="240"/>
+              <w:jc w:val="center"/>
+            </w:pPr>
+            <w:r>
+              <w:rPr>
+                <w:rFonts w:ascii="Times New Roman" w:cs="Times New Roman" w:eastAsia="Times New Roman" w:hAnsi="Times New Roman"/>
+                <w:color w:val="000000"/>
+                <w:sz w:val="20"/>
+                <w:szCs w:val="20"/>
+              </w:rPr>
+              <w:t xml:space="preserve">sim</w:t>
+            </w:r>
+          </w:p>
+        </w:tc>
+      </w:tr>
+    </w:tbl>
+    <w:p>
+      <w:pPr>
+        <w:spacing w:after="180" w:before="40" w:line="240"/>
+        <w:jc w:val="left"/>
+      </w:pPr>
+      <w:r>
+        <w:rPr>
+          <w:rFonts w:ascii="Times New Roman" w:cs="Times New Roman" w:eastAsia="Times New Roman" w:hAnsi="Times New Roman"/>
+          <w:color w:val="3f3f3f"/>
+          <w:sz w:val="20"/>
+          <w:szCs w:val="20"/>
+        </w:rPr>
+        <w:t xml:space="preserve">Nota: dz positivo indica escore maior no HIIT; IC 95% por bootstrap; permutação por troca de sinais (sign-flip). Fonte: Dados da pesquisa (2026).</w:t>
+      </w:r>
+    </w:p>
+    <w:p>
+      <w:pPr>
+        <w:spacing w:after="0" w:before="0" w:line="360" w:lineRule="auto"/>
+        <w:ind w:firstLine="709"/>
+        <w:jc w:val="both"/>
+      </w:pPr>
+      <w:r>
+        <w:rPr>
+          <w:rFonts w:ascii="Times New Roman" w:cs="Times New Roman" w:eastAsia="Times New Roman" w:hAnsi="Times New Roman"/>
+          <w:color w:val="000000"/>
+          <w:sz w:val="24"/>
+          <w:szCs w:val="24"/>
+        </w:rPr>
+        <w:t xml:space="preserve">As três dimensões afetivas que separam os estímulos, a raiva, a perturbação total do humor e a depressão, apresentaram intervalo de confiança do tamanho de efeito inteiramente acima de zero e permutação significativa, o que reforça o achado para além do teste original. A confusão ficou no limiar, com concordância apenas parcial entre as vias. Nenhum contraste sobrevive à correção por comparações múltiplas, resultado esperado com oito testes, de modo que o conjunto vale como padrão convergente e não como diferença individual confirmada. A associação entre sono e perfil recebeu igual reforço: além do teste de Kruskal-Wallis, uma prova de tendência de Kendall para grupos ordenados confirmou que o grupo de risco é o mais sonolento.</w:t>
+      </w:r>
+    </w:p>
+    <w:p>
+      <w:pPr>
+        <w:spacing w:after="0" w:before="0" w:line="360" w:lineRule="auto"/>
+        <w:ind w:firstLine="709"/>
+        <w:jc w:val="both"/>
+      </w:pPr>
+      <w:r>
+        <w:rPr>
+          <w:rFonts w:ascii="Times New Roman" w:cs="Times New Roman" w:eastAsia="Times New Roman" w:hAnsi="Times New Roman"/>
+          <w:color w:val="000000"/>
+          <w:sz w:val="24"/>
+          <w:szCs w:val="24"/>
+        </w:rPr>
+        <w:t xml:space="preserve">Uma propriedade matemática esclarece o alcance da análise de padronização apresentada na Seção 5.1. Os tamanhos de efeito padronizados e o coeficiente intraclasse são invariantes à padronização linear por variável, pois subtrair uma média e dividir por um desvio padrão constante cancela no numerador e no denominador do dz. A verificação numérica confirmou a igualdade: raiva, perturbação do humor e depressão produzem o mesmo dz nos escores brutos e nos escores padronizados por referência externa, com diferença inferior a um milésimo de milésimo. Assim, apenas as partes que dependem do rótulo do perfil variam com a referência adotada, ao passo que o núcleo quantitativo da triangulação permanece o mesmo.</w:t>
+      </w:r>
+    </w:p>
+    <w:p>
+      <w:pPr>
+        <w:keepNext/>
+        <w:spacing w:after="90" w:before="200" w:line="360" w:lineRule="auto"/>
+      </w:pPr>
+      <w:r>
+        <w:rPr>
+          <w:rFonts w:ascii="Times New Roman" w:cs="Times New Roman" w:eastAsia="Times New Roman" w:hAnsi="Times New Roman"/>
+          <w:b/>
+          <w:bCs/>
+          <w:color w:val="000000"/>
+          <w:sz w:val="24"/>
+          <w:szCs w:val="24"/>
+        </w:rPr>
+        <w:t xml:space="preserve">5.3 Síntese das associações e relações significativas</w:t>
+      </w:r>
+    </w:p>
+    <w:p>
+      <w:pPr>
+        <w:spacing w:after="0" w:before="0" w:line="360" w:lineRule="auto"/>
+        <w:ind w:firstLine="709"/>
+        <w:jc w:val="both"/>
+      </w:pPr>
+      <w:r>
+        <w:rPr>
+          <w:rFonts w:ascii="Times New Roman" w:cs="Times New Roman" w:eastAsia="Times New Roman" w:hAnsi="Times New Roman"/>
+          <w:color w:val="000000"/>
+          <w:sz w:val="24"/>
+          <w:szCs w:val="24"/>
+        </w:rPr>
+        <w:t xml:space="preserve">A Tabela 18 reúne, em um único quadro, as associações e as relações que alcançaram significância estatística ao longo do estudo. A consolidação facilita a leitura de conjunto e evidencia que os achados relevantes se concentram em três frentes: o contraste afetivo entre estímulos, o acoplamento entre sono e humor e a coesão interna das dimensões negativas.</w:t>
+      </w:r>
+    </w:p>
+    <w:p>
+      <w:pPr>
+        <w:keepNext/>
+        <w:spacing w:after="40" w:before="160" w:line="240"/>
+        <w:jc w:val="left"/>
+      </w:pPr>
+      <w:r>
+        <w:rPr>
+          <w:rFonts w:ascii="Times New Roman" w:cs="Times New Roman" w:eastAsia="Times New Roman" w:hAnsi="Times New Roman"/>
+          <w:b/>
+          <w:bCs/>
+          <w:color w:val="000000"/>
+          <w:sz w:val="20"/>
+          <w:szCs w:val="20"/>
+        </w:rPr>
+        <w:t xml:space="preserve">Tabela 18</w:t>
+      </w:r>
+      <w:r>
+        <w:rPr>
+          <w:rFonts w:ascii="Times New Roman" w:cs="Times New Roman" w:eastAsia="Times New Roman" w:hAnsi="Times New Roman"/>
+          <w:color w:val="000000"/>
+          <w:sz w:val="20"/>
+          <w:szCs w:val="20"/>
+        </w:rPr>
+        <w:t xml:space="preserve"> – Associações e relações estatisticamente significativas do estudo</w:t>
+      </w:r>
+    </w:p>
+    <w:tbl>
+      <w:tblPr>
+        <w:tblW w:type="dxa" w:w="9505"/>
+        <w:tblBorders>
+          <w:top w:val="single" w:color="000000" w:sz="6"/>
+          <w:left w:val="none"/>
+          <w:bottom w:val="single" w:color="000000" w:sz="6"/>
+          <w:right w:val="none"/>
+          <w:insideH w:val="none"/>
+          <w:insideV w:val="none"/>
+        </w:tblBorders>
+      </w:tblPr>
+      <w:tblGrid>
+        <w:gridCol w:w="3205"/>
+        <w:gridCol w:w="1300"/>
+        <w:gridCol w:w="1300"/>
+        <w:gridCol w:w="2400"/>
+        <w:gridCol w:w="1300"/>
+      </w:tblGrid>
+      <w:tr>
+        <w:trPr>
+          <w:tblHeader/>
+        </w:trPr>
+        <w:tc>
+          <w:tcPr>
+            <w:tcW w:type="dxa" w:w="3205"/>
+            <w:tcBorders>
+              <w:top w:val="single" w:color="000000" w:sz="6"/>
+              <w:left w:val="none"/>
+              <w:bottom w:val="single" w:color="000000" w:sz="6"/>
+              <w:right w:val="none"/>
+            </w:tcBorders>
+            <w:tcMar>
+              <w:top w:type="dxa" w:w="40"/>
+              <w:left w:type="dxa" w:w="70"/>
+              <w:bottom w:type="dxa" w:w="40"/>
+              <w:right w:type="dxa" w:w="70"/>
+            </w:tcMar>
+            <w:vAlign w:val="center"/>
+          </w:tcPr>
+          <w:p>
+            <w:pPr>
+              <w:spacing w:after="0" w:line="240"/>
+              <w:jc w:val="left"/>
+            </w:pPr>
+            <w:r>
+              <w:rPr>
+                <w:rFonts w:ascii="Times New Roman" w:cs="Times New Roman" w:eastAsia="Times New Roman" w:hAnsi="Times New Roman"/>
+                <w:b/>
+                <w:bCs/>
+                <w:color w:val="000000"/>
+                <w:sz w:val="20"/>
+                <w:szCs w:val="20"/>
+              </w:rPr>
+              <w:t xml:space="preserve">Relação</w:t>
+            </w:r>
+          </w:p>
+        </w:tc>
+        <w:tc>
+          <w:tcPr>
+            <w:tcW w:type="dxa" w:w="1300"/>
+            <w:tcBorders>
+              <w:top w:val="single" w:color="000000" w:sz="6"/>
+              <w:left w:val="none"/>
+              <w:bottom w:val="single" w:color="000000" w:sz="6"/>
+              <w:right w:val="none"/>
+            </w:tcBorders>
+            <w:tcMar>
+              <w:top w:type="dxa" w:w="40"/>
+              <w:left w:type="dxa" w:w="70"/>
+              <w:bottom w:type="dxa" w:w="40"/>
+              <w:right w:type="dxa" w:w="70"/>
+            </w:tcMar>
+            <w:vAlign w:val="center"/>
+          </w:tcPr>
+          <w:p>
+            <w:pPr>
+              <w:spacing w:after="0" w:line="240"/>
+              <w:jc w:val="center"/>
+            </w:pPr>
+            <w:r>
+              <w:rPr>
+                <w:rFonts w:ascii="Times New Roman" w:cs="Times New Roman" w:eastAsia="Times New Roman" w:hAnsi="Times New Roman"/>
+                <w:b/>
+                <w:bCs/>
+                <w:color w:val="000000"/>
+                <w:sz w:val="20"/>
+                <w:szCs w:val="20"/>
+              </w:rPr>
+              <w:t xml:space="preserve">Tipo</w:t>
+            </w:r>
+          </w:p>
+        </w:tc>
+        <w:tc>
+          <w:tcPr>
+            <w:tcW w:type="dxa" w:w="1300"/>
+            <w:tcBorders>
+              <w:top w:val="single" w:color="000000" w:sz="6"/>
+              <w:left w:val="none"/>
+              <w:bottom w:val="single" w:color="000000" w:sz="6"/>
+              <w:right w:val="none"/>
+            </w:tcBorders>
+            <w:tcMar>
+              <w:top w:type="dxa" w:w="40"/>
+              <w:left w:type="dxa" w:w="70"/>
+              <w:bottom w:type="dxa" w:w="40"/>
+              <w:right w:type="dxa" w:w="70"/>
+            </w:tcMar>
+            <w:vAlign w:val="center"/>
+          </w:tcPr>
+          <w:p>
+            <w:pPr>
+              <w:spacing w:after="0" w:line="240"/>
+              <w:jc w:val="center"/>
+            </w:pPr>
+            <w:r>
+              <w:rPr>
+                <w:rFonts w:ascii="Times New Roman" w:cs="Times New Roman" w:eastAsia="Times New Roman" w:hAnsi="Times New Roman"/>
+                <w:b/>
+                <w:bCs/>
+                <w:color w:val="000000"/>
+                <w:sz w:val="20"/>
+                <w:szCs w:val="20"/>
+              </w:rPr>
+              <w:t xml:space="preserve">Estimativa</w:t>
+            </w:r>
+          </w:p>
+        </w:tc>
+        <w:tc>
+          <w:tcPr>
+            <w:tcW w:type="dxa" w:w="2400"/>
+            <w:tcBorders>
+              <w:top w:val="single" w:color="000000" w:sz="6"/>
+              <w:left w:val="none"/>
+              <w:bottom w:val="single" w:color="000000" w:sz="6"/>
+              <w:right w:val="none"/>
+            </w:tcBorders>
+            <w:tcMar>
+              <w:top w:type="dxa" w:w="40"/>
+              <w:left w:type="dxa" w:w="70"/>
+              <w:bottom w:type="dxa" w:w="40"/>
+              <w:right w:type="dxa" w:w="70"/>
+            </w:tcMar>
+            <w:vAlign w:val="center"/>
+          </w:tcPr>
+          <w:p>
+            <w:pPr>
+              <w:spacing w:after="0" w:line="240"/>
+              <w:jc w:val="center"/>
+            </w:pPr>
+            <w:r>
+              <w:rPr>
+                <w:rFonts w:ascii="Times New Roman" w:cs="Times New Roman" w:eastAsia="Times New Roman" w:hAnsi="Times New Roman"/>
+                <w:b/>
+                <w:bCs/>
+                <w:color w:val="000000"/>
+                <w:sz w:val="20"/>
+                <w:szCs w:val="20"/>
+              </w:rPr>
+              <w:t xml:space="preserve">IC / p</w:t>
+            </w:r>
+          </w:p>
+        </w:tc>
+        <w:tc>
+          <w:tcPr>
+            <w:tcW w:type="dxa" w:w="1300"/>
+            <w:tcBorders>
+              <w:top w:val="single" w:color="000000" w:sz="6"/>
+              <w:left w:val="none"/>
+              <w:bottom w:val="single" w:color="000000" w:sz="6"/>
+              <w:right w:val="none"/>
+            </w:tcBorders>
+            <w:tcMar>
+              <w:top w:type="dxa" w:w="40"/>
+              <w:left w:type="dxa" w:w="70"/>
+              <w:bottom w:type="dxa" w:w="40"/>
+              <w:right w:type="dxa" w:w="70"/>
+            </w:tcMar>
+            <w:vAlign w:val="center"/>
+          </w:tcPr>
+          <w:p>
+            <w:pPr>
+              <w:spacing w:after="0" w:line="240"/>
+              <w:jc w:val="center"/>
+            </w:pPr>
+            <w:r>
+              <w:rPr>
+                <w:rFonts w:ascii="Times New Roman" w:cs="Times New Roman" w:eastAsia="Times New Roman" w:hAnsi="Times New Roman"/>
+                <w:b/>
+                <w:bCs/>
+                <w:color w:val="000000"/>
+                <w:sz w:val="20"/>
+                <w:szCs w:val="20"/>
+              </w:rPr>
+              <w:t xml:space="preserve">Método</w:t>
+            </w:r>
+          </w:p>
+        </w:tc>
+      </w:tr>
+      <w:tr>
+        <w:tc>
+          <w:tcPr>
+            <w:tcW w:type="dxa" w:w="3205"/>
+            <w:tcBorders>
+              <w:top w:val="none"/>
+              <w:left w:val="none"/>
+              <w:bottom w:val="none"/>
+              <w:right w:val="none"/>
+            </w:tcBorders>
+            <w:tcMar>
+              <w:top w:type="dxa" w:w="30"/>
+              <w:left w:type="dxa" w:w="70"/>
+              <w:bottom w:type="dxa" w:w="30"/>
+              <w:right w:type="dxa" w:w="70"/>
+            </w:tcMar>
+            <w:vAlign w:val="center"/>
+          </w:tcPr>
+          <w:p>
+            <w:pPr>
+              <w:spacing w:after="0" w:line="240"/>
+              <w:jc w:val="left"/>
+            </w:pPr>
+            <w:r>
+              <w:rPr>
+                <w:rFonts w:ascii="Times New Roman" w:cs="Times New Roman" w:eastAsia="Times New Roman" w:hAnsi="Times New Roman"/>
+                <w:color w:val="000000"/>
+                <w:sz w:val="20"/>
+                <w:szCs w:val="20"/>
+              </w:rPr>
+              <w:t xml:space="preserve">Depressão (HIIT × jogo)</w:t>
+            </w:r>
+          </w:p>
+        </w:tc>
+        <w:tc>
+          <w:tcPr>
+            <w:tcW w:type="dxa" w:w="1300"/>
+            <w:tcBorders>
+              <w:top w:val="none"/>
+              <w:left w:val="none"/>
+              <w:bottom w:val="none"/>
+              <w:right w:val="none"/>
+            </w:tcBorders>
+            <w:tcMar>
+              <w:top w:type="dxa" w:w="30"/>
+              <w:left w:type="dxa" w:w="70"/>
+              <w:bottom w:type="dxa" w:w="30"/>
+              <w:right w:type="dxa" w:w="70"/>
+            </w:tcMar>
+            <w:vAlign w:val="center"/>
+          </w:tcPr>
+          <w:p>
+            <w:pPr>
+              <w:spacing w:after="0" w:line="240"/>
+              <w:jc w:val="center"/>
+            </w:pPr>
+            <w:r>
+              <w:rPr>
+                <w:rFonts w:ascii="Times New Roman" w:cs="Times New Roman" w:eastAsia="Times New Roman" w:hAnsi="Times New Roman"/>
+                <w:color w:val="000000"/>
+                <w:sz w:val="20"/>
+                <w:szCs w:val="20"/>
+              </w:rPr>
+              <w:t xml:space="preserve">contraste</w:t>
+            </w:r>
+          </w:p>
+        </w:tc>
+        <w:tc>
+          <w:tcPr>
+            <w:tcW w:type="dxa" w:w="1300"/>
+            <w:tcBorders>
+              <w:top w:val="none"/>
+              <w:left w:val="none"/>
+              <w:bottom w:val="none"/>
+              <w:right w:val="none"/>
+            </w:tcBorders>
+            <w:tcMar>
+              <w:top w:type="dxa" w:w="30"/>
+              <w:left w:type="dxa" w:w="70"/>
+              <w:bottom w:type="dxa" w:w="30"/>
+              <w:right w:type="dxa" w:w="70"/>
+            </w:tcMar>
+            <w:vAlign w:val="center"/>
+          </w:tcPr>
+          <w:p>
+            <w:pPr>
+              <w:spacing w:after="0" w:line="240"/>
+              <w:jc w:val="center"/>
+            </w:pPr>
+            <w:r>
+              <w:rPr>
+                <w:rFonts w:ascii="Times New Roman" w:cs="Times New Roman" w:eastAsia="Times New Roman" w:hAnsi="Times New Roman"/>
+                <w:b/>
+                <w:bCs/>
+                <w:color w:val="000000"/>
+                <w:sz w:val="20"/>
+                <w:szCs w:val="20"/>
+              </w:rPr>
+              <w:t xml:space="preserve">dz +0,45</w:t>
+            </w:r>
+          </w:p>
+        </w:tc>
+        <w:tc>
+          <w:tcPr>
+            <w:tcW w:type="dxa" w:w="2400"/>
+            <w:tcBorders>
+              <w:top w:val="none"/>
+              <w:left w:val="none"/>
+              <w:bottom w:val="none"/>
+              <w:right w:val="none"/>
+            </w:tcBorders>
+            <w:tcMar>
+              <w:top w:type="dxa" w:w="30"/>
+              <w:left w:type="dxa" w:w="70"/>
+              <w:bottom w:type="dxa" w:w="30"/>
+              <w:right w:type="dxa" w:w="70"/>
+            </w:tcMar>
+            <w:vAlign w:val="center"/>
+          </w:tcPr>
+          <w:p>
+            <w:pPr>
+              <w:spacing w:after="0" w:line="240"/>
+              <w:jc w:val="center"/>
+            </w:pPr>
+            <w:r>
+              <w:rPr>
+                <w:rFonts w:ascii="Times New Roman" w:cs="Times New Roman" w:eastAsia="Times New Roman" w:hAnsi="Times New Roman"/>
+                <w:color w:val="000000"/>
+                <w:sz w:val="20"/>
+                <w:szCs w:val="20"/>
+              </w:rPr>
+              <w:t xml:space="preserve">IC [0,24; 0,68]</w:t>
+            </w:r>
+          </w:p>
+        </w:tc>
+        <w:tc>
+          <w:tcPr>
+            <w:tcW w:type="dxa" w:w="1300"/>
+            <w:tcBorders>
+              <w:top w:val="none"/>
+              <w:left w:val="none"/>
+              <w:bottom w:val="none"/>
+              <w:right w:val="none"/>
+            </w:tcBorders>
+            <w:tcMar>
+              <w:top w:type="dxa" w:w="30"/>
+              <w:left w:type="dxa" w:w="70"/>
+              <w:bottom w:type="dxa" w:w="30"/>
+              <w:right w:type="dxa" w:w="70"/>
+            </w:tcMar>
+            <w:vAlign w:val="center"/>
+          </w:tcPr>
+          <w:p>
+            <w:pPr>
+              <w:spacing w:after="0" w:line="240"/>
+              <w:jc w:val="center"/>
+            </w:pPr>
+            <w:r>
+              <w:rPr>
+                <w:rFonts w:ascii="Times New Roman" w:cs="Times New Roman" w:eastAsia="Times New Roman" w:hAnsi="Times New Roman"/>
+                <w:color w:val="000000"/>
+                <w:sz w:val="20"/>
+                <w:szCs w:val="20"/>
+              </w:rPr>
+              <w:t xml:space="preserve">Wilcoxon+perm.+IC</w:t>
+            </w:r>
+          </w:p>
+        </w:tc>
+      </w:tr>
+      <w:tr>
+        <w:tc>
+          <w:tcPr>
+            <w:tcW w:type="dxa" w:w="3205"/>
+            <w:tcBorders>
+              <w:top w:val="none"/>
+              <w:left w:val="none"/>
+              <w:bottom w:val="none"/>
+              <w:right w:val="none"/>
+            </w:tcBorders>
+            <w:tcMar>
+              <w:top w:type="dxa" w:w="30"/>
+              <w:left w:type="dxa" w:w="70"/>
+              <w:bottom w:type="dxa" w:w="30"/>
+              <w:right w:type="dxa" w:w="70"/>
+            </w:tcMar>
+            <w:vAlign w:val="center"/>
+          </w:tcPr>
+          <w:p>
+            <w:pPr>
+              <w:spacing w:after="0" w:line="240"/>
+              <w:jc w:val="left"/>
+            </w:pPr>
+            <w:r>
+              <w:rPr>
+                <w:rFonts w:ascii="Times New Roman" w:cs="Times New Roman" w:eastAsia="Times New Roman" w:hAnsi="Times New Roman"/>
+                <w:color w:val="000000"/>
+                <w:sz w:val="20"/>
+                <w:szCs w:val="20"/>
+              </w:rPr>
+              <w:t xml:space="preserve">Raiva (HIIT × jogo)</w:t>
+            </w:r>
+          </w:p>
+        </w:tc>
+        <w:tc>
+          <w:tcPr>
+            <w:tcW w:type="dxa" w:w="1300"/>
+            <w:tcBorders>
+              <w:top w:val="none"/>
+              <w:left w:val="none"/>
+              <w:bottom w:val="none"/>
+              <w:right w:val="none"/>
+            </w:tcBorders>
+            <w:tcMar>
+              <w:top w:type="dxa" w:w="30"/>
+              <w:left w:type="dxa" w:w="70"/>
+              <w:bottom w:type="dxa" w:w="30"/>
+              <w:right w:type="dxa" w:w="70"/>
+            </w:tcMar>
+            <w:vAlign w:val="center"/>
+          </w:tcPr>
+          <w:p>
+            <w:pPr>
+              <w:spacing w:after="0" w:line="240"/>
+              <w:jc w:val="center"/>
+            </w:pPr>
+            <w:r>
+              <w:rPr>
+                <w:rFonts w:ascii="Times New Roman" w:cs="Times New Roman" w:eastAsia="Times New Roman" w:hAnsi="Times New Roman"/>
+                <w:color w:val="000000"/>
+                <w:sz w:val="20"/>
+                <w:szCs w:val="20"/>
+              </w:rPr>
+              <w:t xml:space="preserve">contraste</w:t>
+            </w:r>
+          </w:p>
+        </w:tc>
+        <w:tc>
+          <w:tcPr>
+            <w:tcW w:type="dxa" w:w="1300"/>
+            <w:tcBorders>
+              <w:top w:val="none"/>
+              <w:left w:val="none"/>
+              <w:bottom w:val="none"/>
+              <w:right w:val="none"/>
+            </w:tcBorders>
+            <w:tcMar>
+              <w:top w:type="dxa" w:w="30"/>
+              <w:left w:type="dxa" w:w="70"/>
+              <w:bottom w:type="dxa" w:w="30"/>
+              <w:right w:type="dxa" w:w="70"/>
+            </w:tcMar>
+            <w:vAlign w:val="center"/>
+          </w:tcPr>
+          <w:p>
+            <w:pPr>
+              <w:spacing w:after="0" w:line="240"/>
+              <w:jc w:val="center"/>
+            </w:pPr>
+            <w:r>
+              <w:rPr>
+                <w:rFonts w:ascii="Times New Roman" w:cs="Times New Roman" w:eastAsia="Times New Roman" w:hAnsi="Times New Roman"/>
+                <w:b/>
+                <w:bCs/>
+                <w:color w:val="000000"/>
+                <w:sz w:val="20"/>
+                <w:szCs w:val="20"/>
+              </w:rPr>
+              <w:t xml:space="preserve">dz +0,47</w:t>
+            </w:r>
+          </w:p>
+        </w:tc>
+        <w:tc>
+          <w:tcPr>
+            <w:tcW w:type="dxa" w:w="2400"/>
+            <w:tcBorders>
+              <w:top w:val="none"/>
+              <w:left w:val="none"/>
+              <w:bottom w:val="none"/>
+              <w:right w:val="none"/>
+            </w:tcBorders>
+            <w:tcMar>
+              <w:top w:type="dxa" w:w="30"/>
+              <w:left w:type="dxa" w:w="70"/>
+              <w:bottom w:type="dxa" w:w="30"/>
+              <w:right w:type="dxa" w:w="70"/>
+            </w:tcMar>
+            <w:vAlign w:val="center"/>
+          </w:tcPr>
+          <w:p>
+            <w:pPr>
+              <w:spacing w:after="0" w:line="240"/>
+              <w:jc w:val="center"/>
+            </w:pPr>
+            <w:r>
+              <w:rPr>
+                <w:rFonts w:ascii="Times New Roman" w:cs="Times New Roman" w:eastAsia="Times New Roman" w:hAnsi="Times New Roman"/>
+                <w:color w:val="000000"/>
+                <w:sz w:val="20"/>
+                <w:szCs w:val="20"/>
+              </w:rPr>
+              <w:t xml:space="preserve">IC [0,12; 0,85]</w:t>
+            </w:r>
+          </w:p>
+        </w:tc>
+        <w:tc>
+          <w:tcPr>
+            <w:tcW w:type="dxa" w:w="1300"/>
+            <w:tcBorders>
+              <w:top w:val="none"/>
+              <w:left w:val="none"/>
+              <w:bottom w:val="none"/>
+              <w:right w:val="none"/>
+            </w:tcBorders>
+            <w:tcMar>
+              <w:top w:type="dxa" w:w="30"/>
+              <w:left w:type="dxa" w:w="70"/>
+              <w:bottom w:type="dxa" w:w="30"/>
+              <w:right w:type="dxa" w:w="70"/>
+            </w:tcMar>
+            <w:vAlign w:val="center"/>
+          </w:tcPr>
+          <w:p>
+            <w:pPr>
+              <w:spacing w:after="0" w:line="240"/>
+              <w:jc w:val="center"/>
+            </w:pPr>
+            <w:r>
+              <w:rPr>
+                <w:rFonts w:ascii="Times New Roman" w:cs="Times New Roman" w:eastAsia="Times New Roman" w:hAnsi="Times New Roman"/>
+                <w:color w:val="000000"/>
+                <w:sz w:val="20"/>
+                <w:szCs w:val="20"/>
+              </w:rPr>
+              <w:t xml:space="preserve">Wilcoxon+perm.+IC</w:t>
+            </w:r>
+          </w:p>
+        </w:tc>
+      </w:tr>
+      <w:tr>
+        <w:tc>
+          <w:tcPr>
+            <w:tcW w:type="dxa" w:w="3205"/>
+            <w:tcBorders>
+              <w:top w:val="none"/>
+              <w:left w:val="none"/>
+              <w:bottom w:val="none"/>
+              <w:right w:val="none"/>
+            </w:tcBorders>
+            <w:tcMar>
+              <w:top w:type="dxa" w:w="30"/>
+              <w:left w:type="dxa" w:w="70"/>
+              <w:bottom w:type="dxa" w:w="30"/>
+              <w:right w:type="dxa" w:w="70"/>
+            </w:tcMar>
+            <w:vAlign w:val="center"/>
+          </w:tcPr>
+          <w:p>
+            <w:pPr>
+              <w:spacing w:after="0" w:line="240"/>
+              <w:jc w:val="left"/>
+            </w:pPr>
+            <w:r>
+              <w:rPr>
+                <w:rFonts w:ascii="Times New Roman" w:cs="Times New Roman" w:eastAsia="Times New Roman" w:hAnsi="Times New Roman"/>
+                <w:color w:val="000000"/>
+                <w:sz w:val="20"/>
+                <w:szCs w:val="20"/>
+              </w:rPr>
+              <w:t xml:space="preserve">PTH (HIIT × jogo)</w:t>
+            </w:r>
+          </w:p>
+        </w:tc>
+        <w:tc>
+          <w:tcPr>
+            <w:tcW w:type="dxa" w:w="1300"/>
+            <w:tcBorders>
+              <w:top w:val="none"/>
+              <w:left w:val="none"/>
+              <w:bottom w:val="none"/>
+              <w:right w:val="none"/>
+            </w:tcBorders>
+            <w:tcMar>
+              <w:top w:type="dxa" w:w="30"/>
+              <w:left w:type="dxa" w:w="70"/>
+              <w:bottom w:type="dxa" w:w="30"/>
+              <w:right w:type="dxa" w:w="70"/>
+            </w:tcMar>
+            <w:vAlign w:val="center"/>
+          </w:tcPr>
+          <w:p>
+            <w:pPr>
+              <w:spacing w:after="0" w:line="240"/>
+              <w:jc w:val="center"/>
+            </w:pPr>
+            <w:r>
+              <w:rPr>
+                <w:rFonts w:ascii="Times New Roman" w:cs="Times New Roman" w:eastAsia="Times New Roman" w:hAnsi="Times New Roman"/>
+                <w:color w:val="000000"/>
+                <w:sz w:val="20"/>
+                <w:szCs w:val="20"/>
+              </w:rPr>
+              <w:t xml:space="preserve">contraste</w:t>
+            </w:r>
+          </w:p>
+        </w:tc>
+        <w:tc>
+          <w:tcPr>
+            <w:tcW w:type="dxa" w:w="1300"/>
+            <w:tcBorders>
+              <w:top w:val="none"/>
+              <w:left w:val="none"/>
+              <w:bottom w:val="none"/>
+              <w:right w:val="none"/>
+            </w:tcBorders>
+            <w:tcMar>
+              <w:top w:type="dxa" w:w="30"/>
+              <w:left w:type="dxa" w:w="70"/>
+              <w:bottom w:type="dxa" w:w="30"/>
+              <w:right w:type="dxa" w:w="70"/>
+            </w:tcMar>
+            <w:vAlign w:val="center"/>
+          </w:tcPr>
+          <w:p>
+            <w:pPr>
+              <w:spacing w:after="0" w:line="240"/>
+              <w:jc w:val="center"/>
+            </w:pPr>
+            <w:r>
+              <w:rPr>
+                <w:rFonts w:ascii="Times New Roman" w:cs="Times New Roman" w:eastAsia="Times New Roman" w:hAnsi="Times New Roman"/>
+                <w:b/>
+                <w:bCs/>
+                <w:color w:val="000000"/>
+                <w:sz w:val="20"/>
+                <w:szCs w:val="20"/>
+              </w:rPr>
+              <w:t xml:space="preserve">dz +0,46</w:t>
+            </w:r>
+          </w:p>
+        </w:tc>
+        <w:tc>
+          <w:tcPr>
+            <w:tcW w:type="dxa" w:w="2400"/>
+            <w:tcBorders>
+              <w:top w:val="none"/>
+              <w:left w:val="none"/>
+              <w:bottom w:val="none"/>
+              <w:right w:val="none"/>
+            </w:tcBorders>
+            <w:tcMar>
+              <w:top w:type="dxa" w:w="30"/>
+              <w:left w:type="dxa" w:w="70"/>
+              <w:bottom w:type="dxa" w:w="30"/>
+              <w:right w:type="dxa" w:w="70"/>
+            </w:tcMar>
+            <w:vAlign w:val="center"/>
+          </w:tcPr>
+          <w:p>
+            <w:pPr>
+              <w:spacing w:after="0" w:line="240"/>
+              <w:jc w:val="center"/>
+            </w:pPr>
+            <w:r>
+              <w:rPr>
+                <w:rFonts w:ascii="Times New Roman" w:cs="Times New Roman" w:eastAsia="Times New Roman" w:hAnsi="Times New Roman"/>
+                <w:color w:val="000000"/>
+                <w:sz w:val="20"/>
+                <w:szCs w:val="20"/>
+              </w:rPr>
+              <w:t xml:space="preserve">IC [0,10; 0,91]</w:t>
+            </w:r>
+          </w:p>
+        </w:tc>
+        <w:tc>
+          <w:tcPr>
+            <w:tcW w:type="dxa" w:w="1300"/>
+            <w:tcBorders>
+              <w:top w:val="none"/>
+              <w:left w:val="none"/>
+              <w:bottom w:val="none"/>
+              <w:right w:val="none"/>
+            </w:tcBorders>
+            <w:tcMar>
+              <w:top w:type="dxa" w:w="30"/>
+              <w:left w:type="dxa" w:w="70"/>
+              <w:bottom w:type="dxa" w:w="30"/>
+              <w:right w:type="dxa" w:w="70"/>
+            </w:tcMar>
+            <w:vAlign w:val="center"/>
+          </w:tcPr>
+          <w:p>
+            <w:pPr>
+              <w:spacing w:after="0" w:line="240"/>
+              <w:jc w:val="center"/>
+            </w:pPr>
+            <w:r>
+              <w:rPr>
+                <w:rFonts w:ascii="Times New Roman" w:cs="Times New Roman" w:eastAsia="Times New Roman" w:hAnsi="Times New Roman"/>
+                <w:color w:val="000000"/>
+                <w:sz w:val="20"/>
+                <w:szCs w:val="20"/>
+              </w:rPr>
+              <w:t xml:space="preserve">Wilcoxon+perm.+IC</w:t>
+            </w:r>
+          </w:p>
+        </w:tc>
+      </w:tr>
+      <w:tr>
+        <w:tc>
+          <w:tcPr>
+            <w:tcW w:type="dxa" w:w="3205"/>
+            <w:tcBorders>
+              <w:top w:val="none"/>
+              <w:left w:val="none"/>
+              <w:bottom w:val="none"/>
+              <w:right w:val="none"/>
+            </w:tcBorders>
+            <w:tcMar>
+              <w:top w:type="dxa" w:w="30"/>
+              <w:left w:type="dxa" w:w="70"/>
+              <w:bottom w:type="dxa" w:w="30"/>
+              <w:right w:type="dxa" w:w="70"/>
+            </w:tcMar>
+            <w:vAlign w:val="center"/>
+          </w:tcPr>
+          <w:p>
+            <w:pPr>
+              <w:spacing w:after="0" w:line="240"/>
+              <w:jc w:val="left"/>
+            </w:pPr>
+            <w:r>
+              <w:rPr>
+                <w:rFonts w:ascii="Times New Roman" w:cs="Times New Roman" w:eastAsia="Times New Roman" w:hAnsi="Times New Roman"/>
+                <w:color w:val="000000"/>
+                <w:sz w:val="20"/>
+                <w:szCs w:val="20"/>
+              </w:rPr>
+              <w:t xml:space="preserve">Estresse (PSS): jogo &lt; HIIT</w:t>
+            </w:r>
+          </w:p>
+        </w:tc>
+        <w:tc>
+          <w:tcPr>
+            <w:tcW w:type="dxa" w:w="1300"/>
+            <w:tcBorders>
+              <w:top w:val="none"/>
+              <w:left w:val="none"/>
+              <w:bottom w:val="none"/>
+              <w:right w:val="none"/>
+            </w:tcBorders>
+            <w:tcMar>
+              <w:top w:type="dxa" w:w="30"/>
+              <w:left w:type="dxa" w:w="70"/>
+              <w:bottom w:type="dxa" w:w="30"/>
+              <w:right w:type="dxa" w:w="70"/>
+            </w:tcMar>
+            <w:vAlign w:val="center"/>
+          </w:tcPr>
+          <w:p>
+            <w:pPr>
+              <w:spacing w:after="0" w:line="240"/>
+              <w:jc w:val="center"/>
+            </w:pPr>
+            <w:r>
+              <w:rPr>
+                <w:rFonts w:ascii="Times New Roman" w:cs="Times New Roman" w:eastAsia="Times New Roman" w:hAnsi="Times New Roman"/>
+                <w:color w:val="000000"/>
+                <w:sz w:val="20"/>
+                <w:szCs w:val="20"/>
+              </w:rPr>
+              <w:t xml:space="preserve">contraste</w:t>
+            </w:r>
+          </w:p>
+        </w:tc>
+        <w:tc>
+          <w:tcPr>
+            <w:tcW w:type="dxa" w:w="1300"/>
+            <w:tcBorders>
+              <w:top w:val="none"/>
+              <w:left w:val="none"/>
+              <w:bottom w:val="none"/>
+              <w:right w:val="none"/>
+            </w:tcBorders>
+            <w:tcMar>
+              <w:top w:type="dxa" w:w="30"/>
+              <w:left w:type="dxa" w:w="70"/>
+              <w:bottom w:type="dxa" w:w="30"/>
+              <w:right w:type="dxa" w:w="70"/>
+            </w:tcMar>
+            <w:vAlign w:val="center"/>
+          </w:tcPr>
+          <w:p>
+            <w:pPr>
+              <w:spacing w:after="0" w:line="240"/>
+              <w:jc w:val="center"/>
+            </w:pPr>
+            <w:r>
+              <w:rPr>
+                <w:rFonts w:ascii="Times New Roman" w:cs="Times New Roman" w:eastAsia="Times New Roman" w:hAnsi="Times New Roman"/>
+                <w:b/>
+                <w:bCs/>
+                <w:color w:val="000000"/>
+                <w:sz w:val="20"/>
+                <w:szCs w:val="20"/>
+              </w:rPr>
+              <w:t xml:space="preserve">dz +0,40</w:t>
+            </w:r>
+          </w:p>
+        </w:tc>
+        <w:tc>
+          <w:tcPr>
+            <w:tcW w:type="dxa" w:w="2400"/>
+            <w:tcBorders>
+              <w:top w:val="none"/>
+              <w:left w:val="none"/>
+              <w:bottom w:val="none"/>
+              <w:right w:val="none"/>
+            </w:tcBorders>
+            <w:tcMar>
+              <w:top w:type="dxa" w:w="30"/>
+              <w:left w:type="dxa" w:w="70"/>
+              <w:bottom w:type="dxa" w:w="30"/>
+              <w:right w:type="dxa" w:w="70"/>
+            </w:tcMar>
+            <w:vAlign w:val="center"/>
+          </w:tcPr>
+          <w:p>
+            <w:pPr>
+              <w:spacing w:after="0" w:line="240"/>
+              <w:jc w:val="center"/>
+            </w:pPr>
+            <w:r>
+              <w:rPr>
+                <w:rFonts w:ascii="Times New Roman" w:cs="Times New Roman" w:eastAsia="Times New Roman" w:hAnsi="Times New Roman"/>
+                <w:color w:val="000000"/>
+                <w:sz w:val="20"/>
+                <w:szCs w:val="20"/>
+              </w:rPr>
+              <w:t xml:space="preserve">p = 0,006</w:t>
+            </w:r>
+          </w:p>
+        </w:tc>
+        <w:tc>
+          <w:tcPr>
+            <w:tcW w:type="dxa" w:w="1300"/>
+            <w:tcBorders>
+              <w:top w:val="none"/>
+              <w:left w:val="none"/>
+              <w:bottom w:val="none"/>
+              <w:right w:val="none"/>
+            </w:tcBorders>
+            <w:tcMar>
+              <w:top w:type="dxa" w:w="30"/>
+              <w:left w:type="dxa" w:w="70"/>
+              <w:bottom w:type="dxa" w:w="30"/>
+              <w:right w:type="dxa" w:w="70"/>
+            </w:tcMar>
+            <w:vAlign w:val="center"/>
+          </w:tcPr>
+          <w:p>
+            <w:pPr>
+              <w:spacing w:after="0" w:line="240"/>
+              <w:jc w:val="center"/>
+            </w:pPr>
+            <w:r>
+              <w:rPr>
+                <w:rFonts w:ascii="Times New Roman" w:cs="Times New Roman" w:eastAsia="Times New Roman" w:hAnsi="Times New Roman"/>
+                <w:color w:val="000000"/>
+                <w:sz w:val="20"/>
+                <w:szCs w:val="20"/>
+              </w:rPr>
+              <w:t xml:space="preserve">Wilcoxon pareado</w:t>
+            </w:r>
+          </w:p>
+        </w:tc>
+      </w:tr>
+      <w:tr>
+        <w:tc>
+          <w:tcPr>
+            <w:tcW w:type="dxa" w:w="3205"/>
+            <w:tcBorders>
+              <w:top w:val="none"/>
+              <w:left w:val="none"/>
+              <w:bottom w:val="none"/>
+              <w:right w:val="none"/>
+            </w:tcBorders>
+            <w:tcMar>
+              <w:top w:type="dxa" w:w="30"/>
+              <w:left w:type="dxa" w:w="70"/>
+              <w:bottom w:type="dxa" w:w="30"/>
+              <w:right w:type="dxa" w:w="70"/>
+            </w:tcMar>
+            <w:vAlign w:val="center"/>
+          </w:tcPr>
+          <w:p>
+            <w:pPr>
+              <w:spacing w:after="0" w:line="240"/>
+              <w:jc w:val="left"/>
+            </w:pPr>
+            <w:r>
+              <w:rPr>
+                <w:rFonts w:ascii="Times New Roman" w:cs="Times New Roman" w:eastAsia="Times New Roman" w:hAnsi="Times New Roman"/>
+                <w:color w:val="000000"/>
+                <w:sz w:val="20"/>
+                <w:szCs w:val="20"/>
+              </w:rPr>
+              <w:t xml:space="preserve">Sonolência (Epworth) × grupo de perfil</w:t>
+            </w:r>
+          </w:p>
+        </w:tc>
+        <w:tc>
+          <w:tcPr>
+            <w:tcW w:type="dxa" w:w="1300"/>
+            <w:tcBorders>
+              <w:top w:val="none"/>
+              <w:left w:val="none"/>
+              <w:bottom w:val="none"/>
+              <w:right w:val="none"/>
+            </w:tcBorders>
+            <w:tcMar>
+              <w:top w:type="dxa" w:w="30"/>
+              <w:left w:type="dxa" w:w="70"/>
+              <w:bottom w:type="dxa" w:w="30"/>
+              <w:right w:type="dxa" w:w="70"/>
+            </w:tcMar>
+            <w:vAlign w:val="center"/>
+          </w:tcPr>
+          <w:p>
+            <w:pPr>
+              <w:spacing w:after="0" w:line="240"/>
+              <w:jc w:val="center"/>
+            </w:pPr>
+            <w:r>
+              <w:rPr>
+                <w:rFonts w:ascii="Times New Roman" w:cs="Times New Roman" w:eastAsia="Times New Roman" w:hAnsi="Times New Roman"/>
+                <w:color w:val="000000"/>
+                <w:sz w:val="20"/>
+                <w:szCs w:val="20"/>
+              </w:rPr>
+              <w:t xml:space="preserve">tendência</w:t>
+            </w:r>
+          </w:p>
+        </w:tc>
+        <w:tc>
+          <w:tcPr>
+            <w:tcW w:type="dxa" w:w="1300"/>
+            <w:tcBorders>
+              <w:top w:val="none"/>
+              <w:left w:val="none"/>
+              <w:bottom w:val="none"/>
+              <w:right w:val="none"/>
+            </w:tcBorders>
+            <w:tcMar>
+              <w:top w:type="dxa" w:w="30"/>
+              <w:left w:type="dxa" w:w="70"/>
+              <w:bottom w:type="dxa" w:w="30"/>
+              <w:right w:type="dxa" w:w="70"/>
+            </w:tcMar>
+            <w:vAlign w:val="center"/>
+          </w:tcPr>
+          <w:p>
+            <w:pPr>
+              <w:spacing w:after="0" w:line="240"/>
+              <w:jc w:val="center"/>
+            </w:pPr>
+            <w:r>
+              <w:rPr>
+                <w:rFonts w:ascii="Times New Roman" w:cs="Times New Roman" w:eastAsia="Times New Roman" w:hAnsi="Times New Roman"/>
+                <w:b/>
+                <w:bCs/>
+                <w:color w:val="000000"/>
+                <w:sz w:val="20"/>
+                <w:szCs w:val="20"/>
+              </w:rPr>
+              <w:t xml:space="preserve">τ +0,18</w:t>
+            </w:r>
+          </w:p>
+        </w:tc>
+        <w:tc>
+          <w:tcPr>
+            <w:tcW w:type="dxa" w:w="2400"/>
+            <w:tcBorders>
+              <w:top w:val="none"/>
+              <w:left w:val="none"/>
+              <w:bottom w:val="none"/>
+              <w:right w:val="none"/>
+            </w:tcBorders>
+            <w:tcMar>
+              <w:top w:type="dxa" w:w="30"/>
+              <w:left w:type="dxa" w:w="70"/>
+              <w:bottom w:type="dxa" w:w="30"/>
+              <w:right w:type="dxa" w:w="70"/>
+            </w:tcMar>
+            <w:vAlign w:val="center"/>
+          </w:tcPr>
+          <w:p>
+            <w:pPr>
+              <w:spacing w:after="0" w:line="240"/>
+              <w:jc w:val="center"/>
+            </w:pPr>
+            <w:r>
+              <w:rPr>
+                <w:rFonts w:ascii="Times New Roman" w:cs="Times New Roman" w:eastAsia="Times New Roman" w:hAnsi="Times New Roman"/>
+                <w:color w:val="000000"/>
+                <w:sz w:val="20"/>
+                <w:szCs w:val="20"/>
+              </w:rPr>
+              <w:t xml:space="preserve">p = 0,007 · Kruskal = 0,017</w:t>
+            </w:r>
+          </w:p>
+        </w:tc>
+        <w:tc>
+          <w:tcPr>
+            <w:tcW w:type="dxa" w:w="1300"/>
+            <w:tcBorders>
+              <w:top w:val="none"/>
+              <w:left w:val="none"/>
+              <w:bottom w:val="none"/>
+              <w:right w:val="none"/>
+            </w:tcBorders>
+            <w:tcMar>
+              <w:top w:type="dxa" w:w="30"/>
+              <w:left w:type="dxa" w:w="70"/>
+              <w:bottom w:type="dxa" w:w="30"/>
+              <w:right w:type="dxa" w:w="70"/>
+            </w:tcMar>
+            <w:vAlign w:val="center"/>
+          </w:tcPr>
+          <w:p>
+            <w:pPr>
+              <w:spacing w:after="0" w:line="240"/>
+              <w:jc w:val="center"/>
+            </w:pPr>
+            <w:r>
+              <w:rPr>
+                <w:rFonts w:ascii="Times New Roman" w:cs="Times New Roman" w:eastAsia="Times New Roman" w:hAnsi="Times New Roman"/>
+                <w:color w:val="000000"/>
+                <w:sz w:val="20"/>
+                <w:szCs w:val="20"/>
+              </w:rPr>
+              <w:t xml:space="preserve">Kendall + Kruskal</w:t>
+            </w:r>
+          </w:p>
+        </w:tc>
+      </w:tr>
+      <w:tr>
+        <w:tc>
+          <w:tcPr>
+            <w:tcW w:type="dxa" w:w="3205"/>
+            <w:tcBorders>
+              <w:top w:val="none"/>
+              <w:left w:val="none"/>
+              <w:bottom w:val="none"/>
+              <w:right w:val="none"/>
+            </w:tcBorders>
+            <w:tcMar>
+              <w:top w:type="dxa" w:w="30"/>
+              <w:left w:type="dxa" w:w="70"/>
+              <w:bottom w:type="dxa" w:w="30"/>
+              <w:right w:type="dxa" w:w="70"/>
+            </w:tcMar>
+            <w:vAlign w:val="center"/>
+          </w:tcPr>
+          <w:p>
+            <w:pPr>
+              <w:spacing w:after="0" w:line="240"/>
+              <w:jc w:val="left"/>
+            </w:pPr>
+            <w:r>
+              <w:rPr>
+                <w:rFonts w:ascii="Times New Roman" w:cs="Times New Roman" w:eastAsia="Times New Roman" w:hAnsi="Times New Roman"/>
+                <w:color w:val="000000"/>
+                <w:sz w:val="20"/>
+                <w:szCs w:val="20"/>
+              </w:rPr>
+              <w:t xml:space="preserve">depressão × raiva</w:t>
+            </w:r>
+          </w:p>
+        </w:tc>
+        <w:tc>
+          <w:tcPr>
+            <w:tcW w:type="dxa" w:w="1300"/>
+            <w:tcBorders>
+              <w:top w:val="none"/>
+              <w:left w:val="none"/>
+              <w:bottom w:val="none"/>
+              <w:right w:val="none"/>
+            </w:tcBorders>
+            <w:tcMar>
+              <w:top w:type="dxa" w:w="30"/>
+              <w:left w:type="dxa" w:w="70"/>
+              <w:bottom w:type="dxa" w:w="30"/>
+              <w:right w:type="dxa" w:w="70"/>
+            </w:tcMar>
+            <w:vAlign w:val="center"/>
+          </w:tcPr>
+          <w:p>
+            <w:pPr>
+              <w:spacing w:after="0" w:line="240"/>
+              <w:jc w:val="center"/>
+            </w:pPr>
+            <w:r>
+              <w:rPr>
+                <w:rFonts w:ascii="Times New Roman" w:cs="Times New Roman" w:eastAsia="Times New Roman" w:hAnsi="Times New Roman"/>
+                <w:color w:val="000000"/>
+                <w:sz w:val="20"/>
+                <w:szCs w:val="20"/>
+              </w:rPr>
+              <w:t xml:space="preserve">correlação</w:t>
+            </w:r>
+          </w:p>
+        </w:tc>
+        <w:tc>
+          <w:tcPr>
+            <w:tcW w:type="dxa" w:w="1300"/>
+            <w:tcBorders>
+              <w:top w:val="none"/>
+              <w:left w:val="none"/>
+              <w:bottom w:val="none"/>
+              <w:right w:val="none"/>
+            </w:tcBorders>
+            <w:tcMar>
+              <w:top w:type="dxa" w:w="30"/>
+              <w:left w:type="dxa" w:w="70"/>
+              <w:bottom w:type="dxa" w:w="30"/>
+              <w:right w:type="dxa" w:w="70"/>
+            </w:tcMar>
+            <w:vAlign w:val="center"/>
+          </w:tcPr>
+          <w:p>
+            <w:pPr>
+              <w:spacing w:after="0" w:line="240"/>
+              <w:jc w:val="center"/>
+            </w:pPr>
+            <w:r>
+              <w:rPr>
+                <w:rFonts w:ascii="Times New Roman" w:cs="Times New Roman" w:eastAsia="Times New Roman" w:hAnsi="Times New Roman"/>
+                <w:b/>
+                <w:bCs/>
+                <w:color w:val="000000"/>
+                <w:sz w:val="20"/>
+                <w:szCs w:val="20"/>
+              </w:rPr>
+              <w:t xml:space="preserve">ρ +0,55</w:t>
+            </w:r>
+          </w:p>
+        </w:tc>
+        <w:tc>
+          <w:tcPr>
+            <w:tcW w:type="dxa" w:w="2400"/>
+            <w:tcBorders>
+              <w:top w:val="none"/>
+              <w:left w:val="none"/>
+              <w:bottom w:val="none"/>
+              <w:right w:val="none"/>
+            </w:tcBorders>
+            <w:tcMar>
+              <w:top w:type="dxa" w:w="30"/>
+              <w:left w:type="dxa" w:w="70"/>
+              <w:bottom w:type="dxa" w:w="30"/>
+              <w:right w:type="dxa" w:w="70"/>
+            </w:tcMar>
+            <w:vAlign w:val="center"/>
+          </w:tcPr>
+          <w:p>
+            <w:pPr>
+              <w:spacing w:after="0" w:line="240"/>
+              <w:jc w:val="center"/>
+            </w:pPr>
+            <w:r>
+              <w:rPr>
+                <w:rFonts w:ascii="Times New Roman" w:cs="Times New Roman" w:eastAsia="Times New Roman" w:hAnsi="Times New Roman"/>
+                <w:color w:val="000000"/>
+                <w:sz w:val="20"/>
+                <w:szCs w:val="20"/>
+              </w:rPr>
+              <w:t xml:space="preserve">p = 0,003</w:t>
+            </w:r>
+          </w:p>
+        </w:tc>
+        <w:tc>
+          <w:tcPr>
+            <w:tcW w:type="dxa" w:w="1300"/>
+            <w:tcBorders>
+              <w:top w:val="none"/>
+              <w:left w:val="none"/>
+              <w:bottom w:val="none"/>
+              <w:right w:val="none"/>
+            </w:tcBorders>
+            <w:tcMar>
+              <w:top w:type="dxa" w:w="30"/>
+              <w:left w:type="dxa" w:w="70"/>
+              <w:bottom w:type="dxa" w:w="30"/>
+              <w:right w:type="dxa" w:w="70"/>
+            </w:tcMar>
+            <w:vAlign w:val="center"/>
+          </w:tcPr>
+          <w:p>
+            <w:pPr>
+              <w:spacing w:after="0" w:line="240"/>
+              <w:jc w:val="center"/>
+            </w:pPr>
+            <w:r>
+              <w:rPr>
+                <w:rFonts w:ascii="Times New Roman" w:cs="Times New Roman" w:eastAsia="Times New Roman" w:hAnsi="Times New Roman"/>
+                <w:color w:val="000000"/>
+                <w:sz w:val="20"/>
+                <w:szCs w:val="20"/>
+              </w:rPr>
+              <w:t xml:space="preserve">Spearman (atleta)</w:t>
+            </w:r>
+          </w:p>
+        </w:tc>
+      </w:tr>
+      <w:tr>
+        <w:tc>
+          <w:tcPr>
+            <w:tcW w:type="dxa" w:w="3205"/>
+            <w:tcBorders>
+              <w:top w:val="none"/>
+              <w:left w:val="none"/>
+              <w:bottom w:val="none"/>
+              <w:right w:val="none"/>
+            </w:tcBorders>
+            <w:tcMar>
+              <w:top w:type="dxa" w:w="30"/>
+              <w:left w:type="dxa" w:w="70"/>
+              <w:bottom w:type="dxa" w:w="30"/>
+              <w:right w:type="dxa" w:w="70"/>
+            </w:tcMar>
+            <w:vAlign w:val="center"/>
+          </w:tcPr>
+          <w:p>
+            <w:pPr>
+              <w:spacing w:after="0" w:line="240"/>
+              <w:jc w:val="left"/>
+            </w:pPr>
+            <w:r>
+              <w:rPr>
+                <w:rFonts w:ascii="Times New Roman" w:cs="Times New Roman" w:eastAsia="Times New Roman" w:hAnsi="Times New Roman"/>
+                <w:color w:val="000000"/>
+                <w:sz w:val="20"/>
+                <w:szCs w:val="20"/>
+              </w:rPr>
+              <w:t xml:space="preserve">fadiga × raiva</w:t>
+            </w:r>
+          </w:p>
+        </w:tc>
+        <w:tc>
+          <w:tcPr>
+            <w:tcW w:type="dxa" w:w="1300"/>
+            <w:tcBorders>
+              <w:top w:val="none"/>
+              <w:left w:val="none"/>
+              <w:bottom w:val="none"/>
+              <w:right w:val="none"/>
+            </w:tcBorders>
+            <w:tcMar>
+              <w:top w:type="dxa" w:w="30"/>
+              <w:left w:type="dxa" w:w="70"/>
+              <w:bottom w:type="dxa" w:w="30"/>
+              <w:right w:type="dxa" w:w="70"/>
+            </w:tcMar>
+            <w:vAlign w:val="center"/>
+          </w:tcPr>
+          <w:p>
+            <w:pPr>
+              <w:spacing w:after="0" w:line="240"/>
+              <w:jc w:val="center"/>
+            </w:pPr>
+            <w:r>
+              <w:rPr>
+                <w:rFonts w:ascii="Times New Roman" w:cs="Times New Roman" w:eastAsia="Times New Roman" w:hAnsi="Times New Roman"/>
+                <w:color w:val="000000"/>
+                <w:sz w:val="20"/>
+                <w:szCs w:val="20"/>
+              </w:rPr>
+              <w:t xml:space="preserve">correlação</w:t>
+            </w:r>
+          </w:p>
+        </w:tc>
+        <w:tc>
+          <w:tcPr>
+            <w:tcW w:type="dxa" w:w="1300"/>
+            <w:tcBorders>
+              <w:top w:val="none"/>
+              <w:left w:val="none"/>
+              <w:bottom w:val="none"/>
+              <w:right w:val="none"/>
+            </w:tcBorders>
+            <w:tcMar>
+              <w:top w:type="dxa" w:w="30"/>
+              <w:left w:type="dxa" w:w="70"/>
+              <w:bottom w:type="dxa" w:w="30"/>
+              <w:right w:type="dxa" w:w="70"/>
+            </w:tcMar>
+            <w:vAlign w:val="center"/>
+          </w:tcPr>
+          <w:p>
+            <w:pPr>
+              <w:spacing w:after="0" w:line="240"/>
+              <w:jc w:val="center"/>
+            </w:pPr>
+            <w:r>
+              <w:rPr>
+                <w:rFonts w:ascii="Times New Roman" w:cs="Times New Roman" w:eastAsia="Times New Roman" w:hAnsi="Times New Roman"/>
+                <w:b/>
+                <w:bCs/>
+                <w:color w:val="000000"/>
+                <w:sz w:val="20"/>
+                <w:szCs w:val="20"/>
+              </w:rPr>
+              <w:t xml:space="preserve">ρ +0,48</w:t>
+            </w:r>
+          </w:p>
+        </w:tc>
+        <w:tc>
+          <w:tcPr>
+            <w:tcW w:type="dxa" w:w="2400"/>
+            <w:tcBorders>
+              <w:top w:val="none"/>
+              <w:left w:val="none"/>
+              <w:bottom w:val="none"/>
+              <w:right w:val="none"/>
+            </w:tcBorders>
+            <w:tcMar>
+              <w:top w:type="dxa" w:w="30"/>
+              <w:left w:type="dxa" w:w="70"/>
+              <w:bottom w:type="dxa" w:w="30"/>
+              <w:right w:type="dxa" w:w="70"/>
+            </w:tcMar>
+            <w:vAlign w:val="center"/>
+          </w:tcPr>
+          <w:p>
+            <w:pPr>
+              <w:spacing w:after="0" w:line="240"/>
+              <w:jc w:val="center"/>
+            </w:pPr>
+            <w:r>
+              <w:rPr>
+                <w:rFonts w:ascii="Times New Roman" w:cs="Times New Roman" w:eastAsia="Times New Roman" w:hAnsi="Times New Roman"/>
+                <w:color w:val="000000"/>
+                <w:sz w:val="20"/>
+                <w:szCs w:val="20"/>
+              </w:rPr>
+              <w:t xml:space="preserve">p = 0,011</w:t>
+            </w:r>
+          </w:p>
+        </w:tc>
+        <w:tc>
+          <w:tcPr>
+            <w:tcW w:type="dxa" w:w="1300"/>
+            <w:tcBorders>
+              <w:top w:val="none"/>
+              <w:left w:val="none"/>
+              <w:bottom w:val="none"/>
+              <w:right w:val="none"/>
+            </w:tcBorders>
+            <w:tcMar>
+              <w:top w:type="dxa" w:w="30"/>
+              <w:left w:type="dxa" w:w="70"/>
+              <w:bottom w:type="dxa" w:w="30"/>
+              <w:right w:type="dxa" w:w="70"/>
+            </w:tcMar>
+            <w:vAlign w:val="center"/>
+          </w:tcPr>
+          <w:p>
+            <w:pPr>
+              <w:spacing w:after="0" w:line="240"/>
+              <w:jc w:val="center"/>
+            </w:pPr>
+            <w:r>
+              <w:rPr>
+                <w:rFonts w:ascii="Times New Roman" w:cs="Times New Roman" w:eastAsia="Times New Roman" w:hAnsi="Times New Roman"/>
+                <w:color w:val="000000"/>
+                <w:sz w:val="20"/>
+                <w:szCs w:val="20"/>
+              </w:rPr>
+              <w:t xml:space="preserve">Spearman (atleta)</w:t>
+            </w:r>
+          </w:p>
+        </w:tc>
+      </w:tr>
+      <w:tr>
+        <w:tc>
+          <w:tcPr>
+            <w:tcW w:type="dxa" w:w="3205"/>
+            <w:tcBorders>
+              <w:top w:val="none"/>
+              <w:left w:val="none"/>
+              <w:bottom w:val="none"/>
+              <w:right w:val="none"/>
+            </w:tcBorders>
+            <w:tcMar>
+              <w:top w:type="dxa" w:w="30"/>
+              <w:left w:type="dxa" w:w="70"/>
+              <w:bottom w:type="dxa" w:w="30"/>
+              <w:right w:type="dxa" w:w="70"/>
+            </w:tcMar>
+            <w:vAlign w:val="center"/>
+          </w:tcPr>
+          <w:p>
+            <w:pPr>
+              <w:spacing w:after="0" w:line="240"/>
+              <w:jc w:val="left"/>
+            </w:pPr>
+            <w:r>
+              <w:rPr>
+                <w:rFonts w:ascii="Times New Roman" w:cs="Times New Roman" w:eastAsia="Times New Roman" w:hAnsi="Times New Roman"/>
+                <w:color w:val="000000"/>
+                <w:sz w:val="20"/>
+                <w:szCs w:val="20"/>
+              </w:rPr>
+              <w:t xml:space="preserve">fadiga × depressão</w:t>
+            </w:r>
+          </w:p>
+        </w:tc>
+        <w:tc>
+          <w:tcPr>
+            <w:tcW w:type="dxa" w:w="1300"/>
+            <w:tcBorders>
+              <w:top w:val="none"/>
+              <w:left w:val="none"/>
+              <w:bottom w:val="none"/>
+              <w:right w:val="none"/>
+            </w:tcBorders>
+            <w:tcMar>
+              <w:top w:type="dxa" w:w="30"/>
+              <w:left w:type="dxa" w:w="70"/>
+              <w:bottom w:type="dxa" w:w="30"/>
+              <w:right w:type="dxa" w:w="70"/>
+            </w:tcMar>
+            <w:vAlign w:val="center"/>
+          </w:tcPr>
+          <w:p>
+            <w:pPr>
+              <w:spacing w:after="0" w:line="240"/>
+              <w:jc w:val="center"/>
+            </w:pPr>
+            <w:r>
+              <w:rPr>
+                <w:rFonts w:ascii="Times New Roman" w:cs="Times New Roman" w:eastAsia="Times New Roman" w:hAnsi="Times New Roman"/>
+                <w:color w:val="000000"/>
+                <w:sz w:val="20"/>
+                <w:szCs w:val="20"/>
+              </w:rPr>
+              <w:t xml:space="preserve">correlação</w:t>
+            </w:r>
+          </w:p>
+        </w:tc>
+        <w:tc>
+          <w:tcPr>
+            <w:tcW w:type="dxa" w:w="1300"/>
+            <w:tcBorders>
+              <w:top w:val="none"/>
+              <w:left w:val="none"/>
+              <w:bottom w:val="none"/>
+              <w:right w:val="none"/>
+            </w:tcBorders>
+            <w:tcMar>
+              <w:top w:type="dxa" w:w="30"/>
+              <w:left w:type="dxa" w:w="70"/>
+              <w:bottom w:type="dxa" w:w="30"/>
+              <w:right w:type="dxa" w:w="70"/>
+            </w:tcMar>
+            <w:vAlign w:val="center"/>
+          </w:tcPr>
+          <w:p>
+            <w:pPr>
+              <w:spacing w:after="0" w:line="240"/>
+              <w:jc w:val="center"/>
+            </w:pPr>
+            <w:r>
+              <w:rPr>
+                <w:rFonts w:ascii="Times New Roman" w:cs="Times New Roman" w:eastAsia="Times New Roman" w:hAnsi="Times New Roman"/>
+                <w:b/>
+                <w:bCs/>
+                <w:color w:val="000000"/>
+                <w:sz w:val="20"/>
+                <w:szCs w:val="20"/>
+              </w:rPr>
+              <w:t xml:space="preserve">ρ +0,45</w:t>
+            </w:r>
+          </w:p>
+        </w:tc>
+        <w:tc>
+          <w:tcPr>
+            <w:tcW w:type="dxa" w:w="2400"/>
+            <w:tcBorders>
+              <w:top w:val="none"/>
+              <w:left w:val="none"/>
+              <w:bottom w:val="none"/>
+              <w:right w:val="none"/>
+            </w:tcBorders>
+            <w:tcMar>
+              <w:top w:type="dxa" w:w="30"/>
+              <w:left w:type="dxa" w:w="70"/>
+              <w:bottom w:type="dxa" w:w="30"/>
+              <w:right w:type="dxa" w:w="70"/>
+            </w:tcMar>
+            <w:vAlign w:val="center"/>
+          </w:tcPr>
+          <w:p>
+            <w:pPr>
+              <w:spacing w:after="0" w:line="240"/>
+              <w:jc w:val="center"/>
+            </w:pPr>
+            <w:r>
+              <w:rPr>
+                <w:rFonts w:ascii="Times New Roman" w:cs="Times New Roman" w:eastAsia="Times New Roman" w:hAnsi="Times New Roman"/>
+                <w:color w:val="000000"/>
+                <w:sz w:val="20"/>
+                <w:szCs w:val="20"/>
+              </w:rPr>
+              <w:t xml:space="preserve">p = 0,019</w:t>
+            </w:r>
+          </w:p>
+        </w:tc>
+        <w:tc>
+          <w:tcPr>
+            <w:tcW w:type="dxa" w:w="1300"/>
+            <w:tcBorders>
+              <w:top w:val="none"/>
+              <w:left w:val="none"/>
+              <w:bottom w:val="none"/>
+              <w:right w:val="none"/>
+            </w:tcBorders>
+            <w:tcMar>
+              <w:top w:type="dxa" w:w="30"/>
+              <w:left w:type="dxa" w:w="70"/>
+              <w:bottom w:type="dxa" w:w="30"/>
+              <w:right w:type="dxa" w:w="70"/>
+            </w:tcMar>
+            <w:vAlign w:val="center"/>
+          </w:tcPr>
+          <w:p>
+            <w:pPr>
+              <w:spacing w:after="0" w:line="240"/>
+              <w:jc w:val="center"/>
+            </w:pPr>
+            <w:r>
+              <w:rPr>
+                <w:rFonts w:ascii="Times New Roman" w:cs="Times New Roman" w:eastAsia="Times New Roman" w:hAnsi="Times New Roman"/>
+                <w:color w:val="000000"/>
+                <w:sz w:val="20"/>
+                <w:szCs w:val="20"/>
+              </w:rPr>
+              <w:t xml:space="preserve">Spearman (atleta)</w:t>
+            </w:r>
+          </w:p>
+        </w:tc>
+      </w:tr>
+      <w:tr>
+        <w:tc>
+          <w:tcPr>
+            <w:tcW w:type="dxa" w:w="3205"/>
+            <w:tcBorders>
+              <w:top w:val="none"/>
+              <w:left w:val="none"/>
+              <w:bottom w:val="none"/>
+              <w:right w:val="none"/>
+            </w:tcBorders>
+            <w:tcMar>
+              <w:top w:type="dxa" w:w="30"/>
+              <w:left w:type="dxa" w:w="70"/>
+              <w:bottom w:type="dxa" w:w="30"/>
+              <w:right w:type="dxa" w:w="70"/>
+            </w:tcMar>
+            <w:vAlign w:val="center"/>
+          </w:tcPr>
+          <w:p>
+            <w:pPr>
+              <w:spacing w:after="0" w:line="240"/>
+              <w:jc w:val="left"/>
+            </w:pPr>
+            <w:r>
+              <w:rPr>
+                <w:rFonts w:ascii="Times New Roman" w:cs="Times New Roman" w:eastAsia="Times New Roman" w:hAnsi="Times New Roman"/>
+                <w:color w:val="000000"/>
+                <w:sz w:val="20"/>
+                <w:szCs w:val="20"/>
+              </w:rPr>
+              <w:t xml:space="preserve">depressão × confusão</w:t>
+            </w:r>
+          </w:p>
+        </w:tc>
+        <w:tc>
+          <w:tcPr>
+            <w:tcW w:type="dxa" w:w="1300"/>
+            <w:tcBorders>
+              <w:top w:val="none"/>
+              <w:left w:val="none"/>
+              <w:bottom w:val="none"/>
+              <w:right w:val="none"/>
+            </w:tcBorders>
+            <w:tcMar>
+              <w:top w:type="dxa" w:w="30"/>
+              <w:left w:type="dxa" w:w="70"/>
+              <w:bottom w:type="dxa" w:w="30"/>
+              <w:right w:type="dxa" w:w="70"/>
+            </w:tcMar>
+            <w:vAlign w:val="center"/>
+          </w:tcPr>
+          <w:p>
+            <w:pPr>
+              <w:spacing w:after="0" w:line="240"/>
+              <w:jc w:val="center"/>
+            </w:pPr>
+            <w:r>
+              <w:rPr>
+                <w:rFonts w:ascii="Times New Roman" w:cs="Times New Roman" w:eastAsia="Times New Roman" w:hAnsi="Times New Roman"/>
+                <w:color w:val="000000"/>
+                <w:sz w:val="20"/>
+                <w:szCs w:val="20"/>
+              </w:rPr>
+              <w:t xml:space="preserve">correlação</w:t>
+            </w:r>
+          </w:p>
+        </w:tc>
+        <w:tc>
+          <w:tcPr>
+            <w:tcW w:type="dxa" w:w="1300"/>
+            <w:tcBorders>
+              <w:top w:val="none"/>
+              <w:left w:val="none"/>
+              <w:bottom w:val="none"/>
+              <w:right w:val="none"/>
+            </w:tcBorders>
+            <w:tcMar>
+              <w:top w:type="dxa" w:w="30"/>
+              <w:left w:type="dxa" w:w="70"/>
+              <w:bottom w:type="dxa" w:w="30"/>
+              <w:right w:type="dxa" w:w="70"/>
+            </w:tcMar>
+            <w:vAlign w:val="center"/>
+          </w:tcPr>
+          <w:p>
+            <w:pPr>
+              <w:spacing w:after="0" w:line="240"/>
+              <w:jc w:val="center"/>
+            </w:pPr>
+            <w:r>
+              <w:rPr>
+                <w:rFonts w:ascii="Times New Roman" w:cs="Times New Roman" w:eastAsia="Times New Roman" w:hAnsi="Times New Roman"/>
+                <w:b/>
+                <w:bCs/>
+                <w:color w:val="000000"/>
+                <w:sz w:val="20"/>
+                <w:szCs w:val="20"/>
+              </w:rPr>
+              <w:t xml:space="preserve">ρ +0,42</w:t>
+            </w:r>
+          </w:p>
+        </w:tc>
+        <w:tc>
+          <w:tcPr>
+            <w:tcW w:type="dxa" w:w="2400"/>
+            <w:tcBorders>
+              <w:top w:val="none"/>
+              <w:left w:val="none"/>
+              <w:bottom w:val="none"/>
+              <w:right w:val="none"/>
+            </w:tcBorders>
+            <w:tcMar>
+              <w:top w:type="dxa" w:w="30"/>
+              <w:left w:type="dxa" w:w="70"/>
+              <w:bottom w:type="dxa" w:w="30"/>
+              <w:right w:type="dxa" w:w="70"/>
+            </w:tcMar>
+            <w:vAlign w:val="center"/>
+          </w:tcPr>
+          <w:p>
+            <w:pPr>
+              <w:spacing w:after="0" w:line="240"/>
+              <w:jc w:val="center"/>
+            </w:pPr>
+            <w:r>
+              <w:rPr>
+                <w:rFonts w:ascii="Times New Roman" w:cs="Times New Roman" w:eastAsia="Times New Roman" w:hAnsi="Times New Roman"/>
+                <w:color w:val="000000"/>
+                <w:sz w:val="20"/>
+                <w:szCs w:val="20"/>
+              </w:rPr>
+              <w:t xml:space="preserve">p = 0,027</w:t>
+            </w:r>
+          </w:p>
+        </w:tc>
+        <w:tc>
+          <w:tcPr>
+            <w:tcW w:type="dxa" w:w="1300"/>
+            <w:tcBorders>
+              <w:top w:val="none"/>
+              <w:left w:val="none"/>
+              <w:bottom w:val="none"/>
+              <w:right w:val="none"/>
+            </w:tcBorders>
+            <w:tcMar>
+              <w:top w:type="dxa" w:w="30"/>
+              <w:left w:type="dxa" w:w="70"/>
+              <w:bottom w:type="dxa" w:w="30"/>
+              <w:right w:type="dxa" w:w="70"/>
+            </w:tcMar>
+            <w:vAlign w:val="center"/>
+          </w:tcPr>
+          <w:p>
+            <w:pPr>
+              <w:spacing w:after="0" w:line="240"/>
+              <w:jc w:val="center"/>
+            </w:pPr>
+            <w:r>
+              <w:rPr>
+                <w:rFonts w:ascii="Times New Roman" w:cs="Times New Roman" w:eastAsia="Times New Roman" w:hAnsi="Times New Roman"/>
+                <w:color w:val="000000"/>
+                <w:sz w:val="20"/>
+                <w:szCs w:val="20"/>
+              </w:rPr>
+              <w:t xml:space="preserve">Spearman (atleta)</w:t>
+            </w:r>
+          </w:p>
+        </w:tc>
+      </w:tr>
+      <w:tr>
+        <w:tc>
+          <w:tcPr>
+            <w:tcW w:type="dxa" w:w="3205"/>
+            <w:tcBorders>
+              <w:top w:val="none"/>
+              <w:left w:val="none"/>
+              <w:bottom w:val="none"/>
+              <w:right w:val="none"/>
+            </w:tcBorders>
+            <w:tcMar>
+              <w:top w:type="dxa" w:w="30"/>
+              <w:left w:type="dxa" w:w="70"/>
+              <w:bottom w:type="dxa" w:w="30"/>
+              <w:right w:type="dxa" w:w="70"/>
+            </w:tcMar>
+            <w:vAlign w:val="center"/>
+          </w:tcPr>
+          <w:p>
+            <w:pPr>
+              <w:spacing w:after="0" w:line="240"/>
+              <w:jc w:val="left"/>
+            </w:pPr>
+            <w:r>
+              <w:rPr>
+                <w:rFonts w:ascii="Times New Roman" w:cs="Times New Roman" w:eastAsia="Times New Roman" w:hAnsi="Times New Roman"/>
+                <w:color w:val="000000"/>
+                <w:sz w:val="20"/>
+                <w:szCs w:val="20"/>
+              </w:rPr>
+              <w:t xml:space="preserve">Epworth × fadiga</w:t>
+            </w:r>
+          </w:p>
+        </w:tc>
+        <w:tc>
+          <w:tcPr>
+            <w:tcW w:type="dxa" w:w="1300"/>
+            <w:tcBorders>
+              <w:top w:val="none"/>
+              <w:left w:val="none"/>
+              <w:bottom w:val="none"/>
+              <w:right w:val="none"/>
+            </w:tcBorders>
+            <w:tcMar>
+              <w:top w:type="dxa" w:w="30"/>
+              <w:left w:type="dxa" w:w="70"/>
+              <w:bottom w:type="dxa" w:w="30"/>
+              <w:right w:type="dxa" w:w="70"/>
+            </w:tcMar>
+            <w:vAlign w:val="center"/>
+          </w:tcPr>
+          <w:p>
+            <w:pPr>
+              <w:spacing w:after="0" w:line="240"/>
+              <w:jc w:val="center"/>
+            </w:pPr>
+            <w:r>
+              <w:rPr>
+                <w:rFonts w:ascii="Times New Roman" w:cs="Times New Roman" w:eastAsia="Times New Roman" w:hAnsi="Times New Roman"/>
+                <w:color w:val="000000"/>
+                <w:sz w:val="20"/>
+                <w:szCs w:val="20"/>
+              </w:rPr>
+              <w:t xml:space="preserve">correlação</w:t>
+            </w:r>
+          </w:p>
+        </w:tc>
+        <w:tc>
+          <w:tcPr>
+            <w:tcW w:type="dxa" w:w="1300"/>
+            <w:tcBorders>
+              <w:top w:val="none"/>
+              <w:left w:val="none"/>
+              <w:bottom w:val="none"/>
+              <w:right w:val="none"/>
+            </w:tcBorders>
+            <w:tcMar>
+              <w:top w:type="dxa" w:w="30"/>
+              <w:left w:type="dxa" w:w="70"/>
+              <w:bottom w:type="dxa" w:w="30"/>
+              <w:right w:type="dxa" w:w="70"/>
+            </w:tcMar>
+            <w:vAlign w:val="center"/>
+          </w:tcPr>
+          <w:p>
+            <w:pPr>
+              <w:spacing w:after="0" w:line="240"/>
+              <w:jc w:val="center"/>
+            </w:pPr>
+            <w:r>
+              <w:rPr>
+                <w:rFonts w:ascii="Times New Roman" w:cs="Times New Roman" w:eastAsia="Times New Roman" w:hAnsi="Times New Roman"/>
+                <w:b/>
+                <w:bCs/>
+                <w:color w:val="000000"/>
+                <w:sz w:val="20"/>
+                <w:szCs w:val="20"/>
+              </w:rPr>
+              <w:t xml:space="preserve">ρ +0,18</w:t>
+            </w:r>
+          </w:p>
+        </w:tc>
+        <w:tc>
+          <w:tcPr>
+            <w:tcW w:type="dxa" w:w="2400"/>
+            <w:tcBorders>
+              <w:top w:val="none"/>
+              <w:left w:val="none"/>
+              <w:bottom w:val="none"/>
+              <w:right w:val="none"/>
+            </w:tcBorders>
+            <w:tcMar>
+              <w:top w:type="dxa" w:w="30"/>
+              <w:left w:type="dxa" w:w="70"/>
+              <w:bottom w:type="dxa" w:w="30"/>
+              <w:right w:type="dxa" w:w="70"/>
+            </w:tcMar>
+            <w:vAlign w:val="center"/>
+          </w:tcPr>
+          <w:p>
+            <w:pPr>
+              <w:spacing w:after="0" w:line="240"/>
+              <w:jc w:val="center"/>
+            </w:pPr>
+            <w:r>
+              <w:rPr>
+                <w:rFonts w:ascii="Times New Roman" w:cs="Times New Roman" w:eastAsia="Times New Roman" w:hAnsi="Times New Roman"/>
+                <w:color w:val="000000"/>
+                <w:sz w:val="20"/>
+                <w:szCs w:val="20"/>
+              </w:rPr>
+              <w:t xml:space="preserve">p = 0,032</w:t>
+            </w:r>
+          </w:p>
+        </w:tc>
+        <w:tc>
+          <w:tcPr>
+            <w:tcW w:type="dxa" w:w="1300"/>
+            <w:tcBorders>
+              <w:top w:val="none"/>
+              <w:left w:val="none"/>
+              <w:bottom w:val="none"/>
+              <w:right w:val="none"/>
+            </w:tcBorders>
+            <w:tcMar>
+              <w:top w:type="dxa" w:w="30"/>
+              <w:left w:type="dxa" w:w="70"/>
+              <w:bottom w:type="dxa" w:w="30"/>
+              <w:right w:type="dxa" w:w="70"/>
+            </w:tcMar>
+            <w:vAlign w:val="center"/>
+          </w:tcPr>
+          <w:p>
+            <w:pPr>
+              <w:spacing w:after="0" w:line="240"/>
+              <w:jc w:val="center"/>
+            </w:pPr>
+            <w:r>
+              <w:rPr>
+                <w:rFonts w:ascii="Times New Roman" w:cs="Times New Roman" w:eastAsia="Times New Roman" w:hAnsi="Times New Roman"/>
+                <w:color w:val="000000"/>
+                <w:sz w:val="20"/>
+                <w:szCs w:val="20"/>
+              </w:rPr>
+              <w:t xml:space="preserve">Spearman (atleta)</w:t>
+            </w:r>
+          </w:p>
+        </w:tc>
+      </w:tr>
+      <w:tr>
+        <w:tc>
+          <w:tcPr>
+            <w:tcW w:type="dxa" w:w="3205"/>
+            <w:tcBorders>
+              <w:top w:val="none"/>
+              <w:left w:val="none"/>
+              <w:bottom w:val="none"/>
+              <w:right w:val="none"/>
+            </w:tcBorders>
+            <w:tcMar>
+              <w:top w:type="dxa" w:w="30"/>
+              <w:left w:type="dxa" w:w="70"/>
+              <w:bottom w:type="dxa" w:w="30"/>
+              <w:right w:type="dxa" w:w="70"/>
+            </w:tcMar>
+            <w:vAlign w:val="center"/>
+          </w:tcPr>
+          <w:p>
+            <w:pPr>
+              <w:spacing w:after="0" w:line="240"/>
+              <w:jc w:val="left"/>
+            </w:pPr>
+            <w:r>
+              <w:rPr>
+                <w:rFonts w:ascii="Times New Roman" w:cs="Times New Roman" w:eastAsia="Times New Roman" w:hAnsi="Times New Roman"/>
+                <w:color w:val="000000"/>
+                <w:sz w:val="20"/>
+                <w:szCs w:val="20"/>
+              </w:rPr>
+              <w:t xml:space="preserve">Epworth × vigor</w:t>
+            </w:r>
+          </w:p>
+        </w:tc>
+        <w:tc>
+          <w:tcPr>
+            <w:tcW w:type="dxa" w:w="1300"/>
+            <w:tcBorders>
+              <w:top w:val="none"/>
+              <w:left w:val="none"/>
+              <w:bottom w:val="none"/>
+              <w:right w:val="none"/>
+            </w:tcBorders>
+            <w:tcMar>
+              <w:top w:type="dxa" w:w="30"/>
+              <w:left w:type="dxa" w:w="70"/>
+              <w:bottom w:type="dxa" w:w="30"/>
+              <w:right w:type="dxa" w:w="70"/>
+            </w:tcMar>
+            <w:vAlign w:val="center"/>
+          </w:tcPr>
+          <w:p>
+            <w:pPr>
+              <w:spacing w:after="0" w:line="240"/>
+              <w:jc w:val="center"/>
+            </w:pPr>
+            <w:r>
+              <w:rPr>
+                <w:rFonts w:ascii="Times New Roman" w:cs="Times New Roman" w:eastAsia="Times New Roman" w:hAnsi="Times New Roman"/>
+                <w:color w:val="000000"/>
+                <w:sz w:val="20"/>
+                <w:szCs w:val="20"/>
+              </w:rPr>
+              <w:t xml:space="preserve">correlação</w:t>
+            </w:r>
+          </w:p>
+        </w:tc>
+        <w:tc>
+          <w:tcPr>
+            <w:tcW w:type="dxa" w:w="1300"/>
+            <w:tcBorders>
+              <w:top w:val="none"/>
+              <w:left w:val="none"/>
+              <w:bottom w:val="none"/>
+              <w:right w:val="none"/>
+            </w:tcBorders>
+            <w:tcMar>
+              <w:top w:type="dxa" w:w="30"/>
+              <w:left w:type="dxa" w:w="70"/>
+              <w:bottom w:type="dxa" w:w="30"/>
+              <w:right w:type="dxa" w:w="70"/>
+            </w:tcMar>
+            <w:vAlign w:val="center"/>
+          </w:tcPr>
+          <w:p>
+            <w:pPr>
+              <w:spacing w:after="0" w:line="240"/>
+              <w:jc w:val="center"/>
+            </w:pPr>
+            <w:r>
+              <w:rPr>
+                <w:rFonts w:ascii="Times New Roman" w:cs="Times New Roman" w:eastAsia="Times New Roman" w:hAnsi="Times New Roman"/>
+                <w:b/>
+                <w:bCs/>
+                <w:color w:val="000000"/>
+                <w:sz w:val="20"/>
+                <w:szCs w:val="20"/>
+              </w:rPr>
+              <w:t xml:space="preserve">ρ -0,29</w:t>
+            </w:r>
+          </w:p>
+        </w:tc>
+        <w:tc>
+          <w:tcPr>
+            <w:tcW w:type="dxa" w:w="2400"/>
+            <w:tcBorders>
+              <w:top w:val="none"/>
+              <w:left w:val="none"/>
+              <w:bottom w:val="none"/>
+              <w:right w:val="none"/>
+            </w:tcBorders>
+            <w:tcMar>
+              <w:top w:type="dxa" w:w="30"/>
+              <w:left w:type="dxa" w:w="70"/>
+              <w:bottom w:type="dxa" w:w="30"/>
+              <w:right w:type="dxa" w:w="70"/>
+            </w:tcMar>
+            <w:vAlign w:val="center"/>
+          </w:tcPr>
+          <w:p>
+            <w:pPr>
+              <w:spacing w:after="0" w:line="240"/>
+              <w:jc w:val="center"/>
+            </w:pPr>
+            <w:r>
+              <w:rPr>
+                <w:rFonts w:ascii="Times New Roman" w:cs="Times New Roman" w:eastAsia="Times New Roman" w:hAnsi="Times New Roman"/>
+                <w:color w:val="000000"/>
+                <w:sz w:val="20"/>
+                <w:szCs w:val="20"/>
+              </w:rPr>
+              <w:t xml:space="preserve">p &lt; 0,001</w:t>
+            </w:r>
+          </w:p>
+        </w:tc>
+        <w:tc>
+          <w:tcPr>
+            <w:tcW w:type="dxa" w:w="1300"/>
+            <w:tcBorders>
+              <w:top w:val="none"/>
+              <w:left w:val="none"/>
+              <w:bottom w:val="none"/>
+              <w:right w:val="none"/>
+            </w:tcBorders>
+            <w:tcMar>
+              <w:top w:type="dxa" w:w="30"/>
+              <w:left w:type="dxa" w:w="70"/>
+              <w:bottom w:type="dxa" w:w="30"/>
+              <w:right w:type="dxa" w:w="70"/>
+            </w:tcMar>
+            <w:vAlign w:val="center"/>
+          </w:tcPr>
+          <w:p>
+            <w:pPr>
+              <w:spacing w:after="0" w:line="240"/>
+              <w:jc w:val="center"/>
+            </w:pPr>
+            <w:r>
+              <w:rPr>
+                <w:rFonts w:ascii="Times New Roman" w:cs="Times New Roman" w:eastAsia="Times New Roman" w:hAnsi="Times New Roman"/>
+                <w:color w:val="000000"/>
+                <w:sz w:val="20"/>
+                <w:szCs w:val="20"/>
+              </w:rPr>
+              <w:t xml:space="preserve">Spearman (atleta)</w:t>
+            </w:r>
+          </w:p>
+        </w:tc>
+      </w:tr>
+      <w:tr>
+        <w:tc>
+          <w:tcPr>
+            <w:tcW w:type="dxa" w:w="3205"/>
+            <w:tcBorders>
+              <w:top w:val="none"/>
+              <w:left w:val="none"/>
+              <w:bottom w:val="single" w:color="000000" w:sz="6"/>
+              <w:right w:val="none"/>
+            </w:tcBorders>
+            <w:tcMar>
+              <w:top w:type="dxa" w:w="30"/>
+              <w:left w:type="dxa" w:w="70"/>
+              <w:bottom w:type="dxa" w:w="30"/>
+              <w:right w:type="dxa" w:w="70"/>
+            </w:tcMar>
+            <w:vAlign w:val="center"/>
+          </w:tcPr>
+          <w:p>
+            <w:pPr>
+              <w:spacing w:after="0" w:line="240"/>
+              <w:jc w:val="left"/>
+            </w:pPr>
+            <w:r>
+              <w:rPr>
+                <w:rFonts w:ascii="Times New Roman" w:cs="Times New Roman" w:eastAsia="Times New Roman" w:hAnsi="Times New Roman"/>
+                <w:color w:val="000000"/>
+                <w:sz w:val="20"/>
+                <w:szCs w:val="20"/>
+              </w:rPr>
+              <w:t xml:space="preserve">Epworth × PTH</w:t>
+            </w:r>
+          </w:p>
+        </w:tc>
+        <w:tc>
+          <w:tcPr>
+            <w:tcW w:type="dxa" w:w="1300"/>
+            <w:tcBorders>
+              <w:top w:val="none"/>
+              <w:left w:val="none"/>
+              <w:bottom w:val="single" w:color="000000" w:sz="6"/>
+              <w:right w:val="none"/>
+            </w:tcBorders>
+            <w:tcMar>
+              <w:top w:type="dxa" w:w="30"/>
+              <w:left w:type="dxa" w:w="70"/>
+              <w:bottom w:type="dxa" w:w="30"/>
+              <w:right w:type="dxa" w:w="70"/>
+            </w:tcMar>
+            <w:vAlign w:val="center"/>
+          </w:tcPr>
+          <w:p>
+            <w:pPr>
+              <w:spacing w:after="0" w:line="240"/>
+              <w:jc w:val="center"/>
+            </w:pPr>
+            <w:r>
+              <w:rPr>
+                <w:rFonts w:ascii="Times New Roman" w:cs="Times New Roman" w:eastAsia="Times New Roman" w:hAnsi="Times New Roman"/>
+                <w:color w:val="000000"/>
+                <w:sz w:val="20"/>
+                <w:szCs w:val="20"/>
+              </w:rPr>
+              <w:t xml:space="preserve">correlação</w:t>
+            </w:r>
+          </w:p>
+        </w:tc>
+        <w:tc>
+          <w:tcPr>
+            <w:tcW w:type="dxa" w:w="1300"/>
+            <w:tcBorders>
+              <w:top w:val="none"/>
+              <w:left w:val="none"/>
+              <w:bottom w:val="single" w:color="000000" w:sz="6"/>
+              <w:right w:val="none"/>
+            </w:tcBorders>
+            <w:tcMar>
+              <w:top w:type="dxa" w:w="30"/>
+              <w:left w:type="dxa" w:w="70"/>
+              <w:bottom w:type="dxa" w:w="30"/>
+              <w:right w:type="dxa" w:w="70"/>
+            </w:tcMar>
+            <w:vAlign w:val="center"/>
+          </w:tcPr>
+          <w:p>
+            <w:pPr>
+              <w:spacing w:after="0" w:line="240"/>
+              <w:jc w:val="center"/>
+            </w:pPr>
+            <w:r>
+              <w:rPr>
+                <w:rFonts w:ascii="Times New Roman" w:cs="Times New Roman" w:eastAsia="Times New Roman" w:hAnsi="Times New Roman"/>
+                <w:b/>
+                <w:bCs/>
+                <w:color w:val="000000"/>
+                <w:sz w:val="20"/>
+                <w:szCs w:val="20"/>
+              </w:rPr>
+              <w:t xml:space="preserve">ρ +0,26</w:t>
+            </w:r>
+          </w:p>
+        </w:tc>
+        <w:tc>
+          <w:tcPr>
+            <w:tcW w:type="dxa" w:w="2400"/>
+            <w:tcBorders>
+              <w:top w:val="none"/>
+              <w:left w:val="none"/>
+              <w:bottom w:val="single" w:color="000000" w:sz="6"/>
+              <w:right w:val="none"/>
+            </w:tcBorders>
+            <w:tcMar>
+              <w:top w:type="dxa" w:w="30"/>
+              <w:left w:type="dxa" w:w="70"/>
+              <w:bottom w:type="dxa" w:w="30"/>
+              <w:right w:type="dxa" w:w="70"/>
+            </w:tcMar>
+            <w:vAlign w:val="center"/>
+          </w:tcPr>
+          <w:p>
+            <w:pPr>
+              <w:spacing w:after="0" w:line="240"/>
+              <w:jc w:val="center"/>
+            </w:pPr>
+            <w:r>
+              <w:rPr>
+                <w:rFonts w:ascii="Times New Roman" w:cs="Times New Roman" w:eastAsia="Times New Roman" w:hAnsi="Times New Roman"/>
+                <w:color w:val="000000"/>
+                <w:sz w:val="20"/>
+                <w:szCs w:val="20"/>
+              </w:rPr>
+              <w:t xml:space="preserve">p = 0,002</w:t>
+            </w:r>
+          </w:p>
+        </w:tc>
+        <w:tc>
+          <w:tcPr>
+            <w:tcW w:type="dxa" w:w="1300"/>
+            <w:tcBorders>
+              <w:top w:val="none"/>
+              <w:left w:val="none"/>
+              <w:bottom w:val="single" w:color="000000" w:sz="6"/>
+              <w:right w:val="none"/>
+            </w:tcBorders>
+            <w:tcMar>
+              <w:top w:type="dxa" w:w="30"/>
+              <w:left w:type="dxa" w:w="70"/>
+              <w:bottom w:type="dxa" w:w="30"/>
+              <w:right w:type="dxa" w:w="70"/>
+            </w:tcMar>
+            <w:vAlign w:val="center"/>
+          </w:tcPr>
+          <w:p>
+            <w:pPr>
+              <w:spacing w:after="0" w:line="240"/>
+              <w:jc w:val="center"/>
+            </w:pPr>
+            <w:r>
+              <w:rPr>
+                <w:rFonts w:ascii="Times New Roman" w:cs="Times New Roman" w:eastAsia="Times New Roman" w:hAnsi="Times New Roman"/>
+                <w:color w:val="000000"/>
+                <w:sz w:val="20"/>
+                <w:szCs w:val="20"/>
+              </w:rPr>
+              <w:t xml:space="preserve">Spearman (atleta)</w:t>
+            </w:r>
+          </w:p>
+        </w:tc>
+      </w:tr>
+    </w:tbl>
+    <w:p>
+      <w:pPr>
+        <w:spacing w:after="180" w:before="40" w:line="240"/>
+        <w:jc w:val="left"/>
+      </w:pPr>
+      <w:r>
+        <w:rPr>
+          <w:rFonts w:ascii="Times New Roman" w:cs="Times New Roman" w:eastAsia="Times New Roman" w:hAnsi="Times New Roman"/>
+          <w:color w:val="3f3f3f"/>
+          <w:sz w:val="20"/>
+          <w:szCs w:val="20"/>
+        </w:rPr>
+        <w:t xml:space="preserve">Nota: dz = tamanho de efeito para medidas repetidas; ρ = correlação de Spearman no nível do atleta; τ = tau de Kendall para tendência entre grupos ordenados. Apenas relações com p &lt; 0,05. Fonte: Dados da pesquisa (2026).</w:t>
+      </w:r>
+    </w:p>
+    <w:p>
+      <w:pPr>
+        <w:spacing w:after="0" w:before="0" w:line="360" w:lineRule="auto"/>
+        <w:ind w:firstLine="709"/>
+        <w:jc w:val="both"/>
+      </w:pPr>
+      <w:r>
+        <w:rPr>
+          <w:rFonts w:ascii="Times New Roman" w:cs="Times New Roman" w:eastAsia="Times New Roman" w:hAnsi="Times New Roman"/>
+          <w:color w:val="000000"/>
+          <w:sz w:val="24"/>
+          <w:szCs w:val="24"/>
+        </w:rPr>
+        <w:t xml:space="preserve">O quadro consolidado confirma a leitura central do estudo. O afeto negativo, com destaque para a raiva, a depressão e a perturbação total do humor, é o que distingue o HIIT do jogo. O estresse percebido recua no dia de jogo. A sonolência acompanha o perfil de humor, com o grupo de risco mais sonolento. E as dimensões negativas correlacionam-se entre si de forma consistente, o que sustenta o uso da perturbação total do humor como resumo do afeto. Nenhuma dessas relações isoladas sobrevive de modo automático à correção por múltiplas comparações, porém a convergência entre métodos e entre pares confere ao conjunto uma credibilidade que um teste solitário não alcançaria.</w:t>
       </w:r>
     </w:p>
     <w:p>

</xml_diff>

<commit_message>
docs(abnt): Seção 6.5 — regressão do pico de velocidade e limiar vs. humor
Adiciona à Seção 6.5 do parecer ABNT a regressão linear/logarítmica do pico
de velocidade contra o eixo físico-afetivo e a análise de limiar (14,9 km/h):
- Figura 15: dispersão Fadiga física × PV com ajuste linear e log e a
  linha do limiar de velocidade;
- Figura 16: comparação abaixo/acima do limiar por dimensão (Vigor,
  Fadiga, Fadiga física, PTH);
- Tabela 27: contraste abaixo × acima do limiar (média, dz, p).

Mantém a fronteira de anonimização (PV cruza com humor apenas via pares
agregados, sem granularidade de dia nem código A) e o rótulo de que o
ajuste log ≈ linear na amostra. Sem fabricação de valores.

Co-Authored-By: Claude Opus 4.8 <noreply@anthropic.com>
Claude-Session: https://claude.ai/code/session_01P7yGiDeoGDyjWvPWQVsUrj
</commit_message>
<xml_diff>
--- a/Artigos/Analise_Descritiva_Triangulacao_ABNT.docx
+++ b/Artigos/Analise_Descritiva_Triangulacao_ABNT.docx
@@ -47063,6 +47063,1156 @@
           <w:szCs w:val="20"/>
         </w:rPr>
         <w:t xml:space="preserve">Nota: ρ = correlação de Spearman entre pico de velocidade e humor (pares casados, n = 25); melhor = ajuste com menor critério de informação de Akaike. Fonte: Dados da pesquisa (2026).</w:t>
+      </w:r>
+    </w:p>
+    <w:p>
+      <w:pPr>
+        <w:keepNext/>
+        <w:spacing w:after="40" w:before="160" w:line="240"/>
+        <w:jc w:val="center"/>
+      </w:pPr>
+      <w:r>
+        <w:rPr>
+          <w:rFonts w:ascii="Times New Roman" w:cs="Times New Roman" w:eastAsia="Times New Roman" w:hAnsi="Times New Roman"/>
+          <w:b/>
+          <w:bCs/>
+          <w:color w:val="000000"/>
+          <w:sz w:val="20"/>
+          <w:szCs w:val="20"/>
+        </w:rPr>
+        <w:t xml:space="preserve">Figura 15</w:t>
+      </w:r>
+      <w:r>
+        <w:rPr>
+          <w:rFonts w:ascii="Times New Roman" w:cs="Times New Roman" w:eastAsia="Times New Roman" w:hAnsi="Times New Roman"/>
+          <w:color w:val="000000"/>
+          <w:sz w:val="20"/>
+          <w:szCs w:val="20"/>
+        </w:rPr>
+        <w:t xml:space="preserve"> – Regressão da fadiga física pelo pico de velocidade, com a reta linear e o limiar de aptidão</w:t>
+      </w:r>
+    </w:p>
+    <w:p>
+      <w:pPr>
+        <w:spacing w:after="0" w:before="40"/>
+        <w:jc w:val="center"/>
+      </w:pPr>
+      <w:r>
+        <w:drawing>
+          <wp:inline distT="0" distB="0" distL="0" distR="0">
+            <wp:extent cx="4953000" cy="2914650"/>
+            <wp:effectExtent t="0" r="0" b="0" l="0"/>
+            <wp:docPr id="1" name="" descr="" title=""/>
+            <wp:cNvGraphicFramePr>
+              <a:graphicFrameLocks xmlns:a="http://schemas.openxmlformats.org/drawingml/2006/main" noChangeAspect="1"/>
+            </wp:cNvGraphicFramePr>
+            <a:graphic xmlns:a="http://schemas.openxmlformats.org/drawingml/2006/main">
+              <a:graphicData uri="http://schemas.openxmlformats.org/drawingml/2006/picture">
+                <pic:pic xmlns:pic="http://schemas.openxmlformats.org/drawingml/2006/picture">
+                  <pic:nvPicPr>
+                    <pic:cNvPr id="0" name="" descr=""/>
+                    <pic:cNvPicPr>
+                      <a:picLocks noChangeAspect="1" noChangeArrowheads="1"/>
+                    </pic:cNvPicPr>
+                  </pic:nvPicPr>
+                  <pic:blipFill>
+                    <a:blip r:embed="rId22" cstate="none"/>
+                    <a:srcRect/>
+                    <a:stretch>
+                      <a:fillRect/>
+                    </a:stretch>
+                  </pic:blipFill>
+                  <pic:spPr bwMode="auto">
+                    <a:xfrm>
+                      <a:off x="0" y="0"/>
+                      <a:ext cx="4953000" cy="2914650"/>
+                    </a:xfrm>
+                    <a:prstGeom prst="rect">
+                      <a:avLst/>
+                    </a:prstGeom>
+                  </pic:spPr>
+                </pic:pic>
+              </a:graphicData>
+            </a:graphic>
+          </wp:inline>
+        </w:drawing>
+      </w:r>
+    </w:p>
+    <w:p>
+      <w:pPr>
+        <w:spacing w:after="180" w:before="40" w:line="240"/>
+        <w:jc w:val="center"/>
+      </w:pPr>
+      <w:r>
+        <w:rPr>
+          <w:rFonts w:ascii="Times New Roman" w:cs="Times New Roman" w:eastAsia="Times New Roman" w:hAnsi="Times New Roman"/>
+          <w:color w:val="3f3f3f"/>
+          <w:sz w:val="20"/>
+          <w:szCs w:val="20"/>
+        </w:rPr>
+        <w:t xml:space="preserve">Fonte: Elaborado pelos autores (2026).</w:t>
+      </w:r>
+    </w:p>
+    <w:p>
+      <w:pPr>
+        <w:spacing w:after="0" w:before="0" w:line="360" w:lineRule="auto"/>
+        <w:ind w:firstLine="709"/>
+        <w:jc w:val="both"/>
+      </w:pPr>
+      <w:r>
+        <w:rPr>
+          <w:rFonts w:ascii="Times New Roman" w:cs="Times New Roman" w:eastAsia="Times New Roman" w:hAnsi="Times New Roman"/>
+          <w:color w:val="000000"/>
+          <w:sz w:val="24"/>
+          <w:szCs w:val="24"/>
+        </w:rPr>
+        <w:t xml:space="preserve">A Figura 15 ilustra a relação para a fadiga física, a dimensão de vínculo mais forte com a aptidão. A nuvem de pontos desce da esquerda para a direita, o que traduz a correlação negativa, e a reta linear acompanha bem a tendência, sem indício de curvatura que justifique a forma logarítmica. A linha vertical assinala o limiar de aptidão adotado, isto é, a mediana do pico de velocidade, que serve de corte para a análise dicotômica apresentada na sequência.</w:t>
+      </w:r>
+    </w:p>
+    <w:p>
+      <w:pPr>
+        <w:spacing w:after="0" w:before="0" w:line="360" w:lineRule="auto"/>
+        <w:ind w:firstLine="709"/>
+        <w:jc w:val="both"/>
+      </w:pPr>
+      <w:r>
+        <w:rPr>
+          <w:rFonts w:ascii="Times New Roman" w:cs="Times New Roman" w:eastAsia="Times New Roman" w:hAnsi="Times New Roman"/>
+          <w:color w:val="000000"/>
+          <w:sz w:val="24"/>
+          <w:szCs w:val="24"/>
+        </w:rPr>
+        <w:t xml:space="preserve">Além do ajuste contínuo, convém examinar o efeito de um limiar de aptidão. Os atletas foram divididos em dois grupos pela mediana do pico de velocidade, e a Figura 16 e a Tabela 27 comparam o humor médio abaixo e acima desse limiar.</w:t>
+      </w:r>
+    </w:p>
+    <w:p>
+      <w:pPr>
+        <w:keepNext/>
+        <w:spacing w:after="40" w:before="160" w:line="240"/>
+        <w:jc w:val="center"/>
+      </w:pPr>
+      <w:r>
+        <w:rPr>
+          <w:rFonts w:ascii="Times New Roman" w:cs="Times New Roman" w:eastAsia="Times New Roman" w:hAnsi="Times New Roman"/>
+          <w:b/>
+          <w:bCs/>
+          <w:color w:val="000000"/>
+          <w:sz w:val="20"/>
+          <w:szCs w:val="20"/>
+        </w:rPr>
+        <w:t xml:space="preserve">Figura 16</w:t>
+      </w:r>
+      <w:r>
+        <w:rPr>
+          <w:rFonts w:ascii="Times New Roman" w:cs="Times New Roman" w:eastAsia="Times New Roman" w:hAnsi="Times New Roman"/>
+          <w:color w:val="000000"/>
+          <w:sz w:val="20"/>
+          <w:szCs w:val="20"/>
+        </w:rPr>
+        <w:t xml:space="preserve"> – Humor médio dos atletas abaixo e acima do limiar de aptidão</w:t>
+      </w:r>
+    </w:p>
+    <w:p>
+      <w:pPr>
+        <w:spacing w:after="0" w:before="40"/>
+        <w:jc w:val="center"/>
+      </w:pPr>
+      <w:r>
+        <w:drawing>
+          <wp:inline distT="0" distB="0" distL="0" distR="0">
+            <wp:extent cx="4953000" cy="2914650"/>
+            <wp:effectExtent t="0" r="0" b="0" l="0"/>
+            <wp:docPr id="1" name="" descr="" title=""/>
+            <wp:cNvGraphicFramePr>
+              <a:graphicFrameLocks xmlns:a="http://schemas.openxmlformats.org/drawingml/2006/main" noChangeAspect="1"/>
+            </wp:cNvGraphicFramePr>
+            <a:graphic xmlns:a="http://schemas.openxmlformats.org/drawingml/2006/main">
+              <a:graphicData uri="http://schemas.openxmlformats.org/drawingml/2006/picture">
+                <pic:pic xmlns:pic="http://schemas.openxmlformats.org/drawingml/2006/picture">
+                  <pic:nvPicPr>
+                    <pic:cNvPr id="0" name="" descr=""/>
+                    <pic:cNvPicPr>
+                      <a:picLocks noChangeAspect="1" noChangeArrowheads="1"/>
+                    </pic:cNvPicPr>
+                  </pic:nvPicPr>
+                  <pic:blipFill>
+                    <a:blip r:embed="rId23" cstate="none"/>
+                    <a:srcRect/>
+                    <a:stretch>
+                      <a:fillRect/>
+                    </a:stretch>
+                  </pic:blipFill>
+                  <pic:spPr bwMode="auto">
+                    <a:xfrm>
+                      <a:off x="0" y="0"/>
+                      <a:ext cx="4953000" cy="2914650"/>
+                    </a:xfrm>
+                    <a:prstGeom prst="rect">
+                      <a:avLst/>
+                    </a:prstGeom>
+                  </pic:spPr>
+                </pic:pic>
+              </a:graphicData>
+            </a:graphic>
+          </wp:inline>
+        </w:drawing>
+      </w:r>
+    </w:p>
+    <w:p>
+      <w:pPr>
+        <w:spacing w:after="180" w:before="40" w:line="240"/>
+        <w:jc w:val="center"/>
+      </w:pPr>
+      <w:r>
+        <w:rPr>
+          <w:rFonts w:ascii="Times New Roman" w:cs="Times New Roman" w:eastAsia="Times New Roman" w:hAnsi="Times New Roman"/>
+          <w:color w:val="3f3f3f"/>
+          <w:sz w:val="20"/>
+          <w:szCs w:val="20"/>
+        </w:rPr>
+        <w:t xml:space="preserve">Fonte: Elaborado pelos autores (2026).</w:t>
+      </w:r>
+    </w:p>
+    <w:p>
+      <w:pPr>
+        <w:keepNext/>
+        <w:spacing w:after="40" w:before="160" w:line="240"/>
+        <w:jc w:val="left"/>
+      </w:pPr>
+      <w:r>
+        <w:rPr>
+          <w:rFonts w:ascii="Times New Roman" w:cs="Times New Roman" w:eastAsia="Times New Roman" w:hAnsi="Times New Roman"/>
+          <w:b/>
+          <w:bCs/>
+          <w:color w:val="000000"/>
+          <w:sz w:val="20"/>
+          <w:szCs w:val="20"/>
+        </w:rPr>
+        <w:t xml:space="preserve">Tabela 27</w:t>
+      </w:r>
+      <w:r>
+        <w:rPr>
+          <w:rFonts w:ascii="Times New Roman" w:cs="Times New Roman" w:eastAsia="Times New Roman" w:hAnsi="Times New Roman"/>
+          <w:color w:val="000000"/>
+          <w:sz w:val="20"/>
+          <w:szCs w:val="20"/>
+        </w:rPr>
+        <w:t xml:space="preserve"> – Humor abaixo e acima do limiar do pico de velocidade</w:t>
+      </w:r>
+    </w:p>
+    <w:tbl>
+      <w:tblPr>
+        <w:tblW w:type="dxa" w:w="9505"/>
+        <w:tblBorders>
+          <w:top w:val="single" w:color="000000" w:sz="6"/>
+          <w:left w:val="none"/>
+          <w:bottom w:val="single" w:color="000000" w:sz="6"/>
+          <w:right w:val="none"/>
+          <w:insideH w:val="none"/>
+          <w:insideV w:val="none"/>
+        </w:tblBorders>
+      </w:tblPr>
+      <w:tblGrid>
+        <w:gridCol w:w="2905"/>
+        <w:gridCol w:w="1650"/>
+        <w:gridCol w:w="1650"/>
+        <w:gridCol w:w="1300"/>
+        <w:gridCol w:w="2000"/>
+      </w:tblGrid>
+      <w:tr>
+        <w:trPr>
+          <w:tblHeader/>
+        </w:trPr>
+        <w:tc>
+          <w:tcPr>
+            <w:tcW w:type="dxa" w:w="2905"/>
+            <w:tcBorders>
+              <w:top w:val="single" w:color="000000" w:sz="6"/>
+              <w:left w:val="none"/>
+              <w:bottom w:val="single" w:color="000000" w:sz="6"/>
+              <w:right w:val="none"/>
+            </w:tcBorders>
+            <w:tcMar>
+              <w:top w:type="dxa" w:w="40"/>
+              <w:left w:type="dxa" w:w="70"/>
+              <w:bottom w:type="dxa" w:w="40"/>
+              <w:right w:type="dxa" w:w="70"/>
+            </w:tcMar>
+            <w:vAlign w:val="center"/>
+          </w:tcPr>
+          <w:p>
+            <w:pPr>
+              <w:spacing w:after="0" w:line="240"/>
+              <w:jc w:val="left"/>
+            </w:pPr>
+            <w:r>
+              <w:rPr>
+                <w:rFonts w:ascii="Times New Roman" w:cs="Times New Roman" w:eastAsia="Times New Roman" w:hAnsi="Times New Roman"/>
+                <w:b/>
+                <w:bCs/>
+                <w:color w:val="000000"/>
+                <w:sz w:val="20"/>
+                <w:szCs w:val="20"/>
+              </w:rPr>
+              <w:t xml:space="preserve">Dimensão</w:t>
+            </w:r>
+          </w:p>
+        </w:tc>
+        <w:tc>
+          <w:tcPr>
+            <w:tcW w:type="dxa" w:w="1650"/>
+            <w:tcBorders>
+              <w:top w:val="single" w:color="000000" w:sz="6"/>
+              <w:left w:val="none"/>
+              <w:bottom w:val="single" w:color="000000" w:sz="6"/>
+              <w:right w:val="none"/>
+            </w:tcBorders>
+            <w:tcMar>
+              <w:top w:type="dxa" w:w="40"/>
+              <w:left w:type="dxa" w:w="70"/>
+              <w:bottom w:type="dxa" w:w="40"/>
+              <w:right w:type="dxa" w:w="70"/>
+            </w:tcMar>
+            <w:vAlign w:val="center"/>
+          </w:tcPr>
+          <w:p>
+            <w:pPr>
+              <w:spacing w:after="0" w:line="240"/>
+              <w:jc w:val="center"/>
+            </w:pPr>
+            <w:r>
+              <w:rPr>
+                <w:rFonts w:ascii="Times New Roman" w:cs="Times New Roman" w:eastAsia="Times New Roman" w:hAnsi="Times New Roman"/>
+                <w:b/>
+                <w:bCs/>
+                <w:color w:val="000000"/>
+                <w:sz w:val="20"/>
+                <w:szCs w:val="20"/>
+              </w:rPr>
+              <w:t xml:space="preserve">Abaixo do limiar</w:t>
+            </w:r>
+          </w:p>
+        </w:tc>
+        <w:tc>
+          <w:tcPr>
+            <w:tcW w:type="dxa" w:w="1650"/>
+            <w:tcBorders>
+              <w:top w:val="single" w:color="000000" w:sz="6"/>
+              <w:left w:val="none"/>
+              <w:bottom w:val="single" w:color="000000" w:sz="6"/>
+              <w:right w:val="none"/>
+            </w:tcBorders>
+            <w:tcMar>
+              <w:top w:type="dxa" w:w="40"/>
+              <w:left w:type="dxa" w:w="70"/>
+              <w:bottom w:type="dxa" w:w="40"/>
+              <w:right w:type="dxa" w:w="70"/>
+            </w:tcMar>
+            <w:vAlign w:val="center"/>
+          </w:tcPr>
+          <w:p>
+            <w:pPr>
+              <w:spacing w:after="0" w:line="240"/>
+              <w:jc w:val="center"/>
+            </w:pPr>
+            <w:r>
+              <w:rPr>
+                <w:rFonts w:ascii="Times New Roman" w:cs="Times New Roman" w:eastAsia="Times New Roman" w:hAnsi="Times New Roman"/>
+                <w:b/>
+                <w:bCs/>
+                <w:color w:val="000000"/>
+                <w:sz w:val="20"/>
+                <w:szCs w:val="20"/>
+              </w:rPr>
+              <w:t xml:space="preserve">Acima do limiar</w:t>
+            </w:r>
+          </w:p>
+        </w:tc>
+        <w:tc>
+          <w:tcPr>
+            <w:tcW w:type="dxa" w:w="1300"/>
+            <w:tcBorders>
+              <w:top w:val="single" w:color="000000" w:sz="6"/>
+              <w:left w:val="none"/>
+              <w:bottom w:val="single" w:color="000000" w:sz="6"/>
+              <w:right w:val="none"/>
+            </w:tcBorders>
+            <w:tcMar>
+              <w:top w:type="dxa" w:w="40"/>
+              <w:left w:type="dxa" w:w="70"/>
+              <w:bottom w:type="dxa" w:w="40"/>
+              <w:right w:type="dxa" w:w="70"/>
+            </w:tcMar>
+            <w:vAlign w:val="center"/>
+          </w:tcPr>
+          <w:p>
+            <w:pPr>
+              <w:spacing w:after="0" w:line="240"/>
+              <w:jc w:val="center"/>
+            </w:pPr>
+            <w:r>
+              <w:rPr>
+                <w:rFonts w:ascii="Times New Roman" w:cs="Times New Roman" w:eastAsia="Times New Roman" w:hAnsi="Times New Roman"/>
+                <w:b/>
+                <w:bCs/>
+                <w:color w:val="000000"/>
+                <w:sz w:val="20"/>
+                <w:szCs w:val="20"/>
+              </w:rPr>
+              <w:t xml:space="preserve">dz</w:t>
+            </w:r>
+          </w:p>
+        </w:tc>
+        <w:tc>
+          <w:tcPr>
+            <w:tcW w:type="dxa" w:w="2000"/>
+            <w:tcBorders>
+              <w:top w:val="single" w:color="000000" w:sz="6"/>
+              <w:left w:val="none"/>
+              <w:bottom w:val="single" w:color="000000" w:sz="6"/>
+              <w:right w:val="none"/>
+            </w:tcBorders>
+            <w:tcMar>
+              <w:top w:type="dxa" w:w="40"/>
+              <w:left w:type="dxa" w:w="70"/>
+              <w:bottom w:type="dxa" w:w="40"/>
+              <w:right w:type="dxa" w:w="70"/>
+            </w:tcMar>
+            <w:vAlign w:val="center"/>
+          </w:tcPr>
+          <w:p>
+            <w:pPr>
+              <w:spacing w:after="0" w:line="240"/>
+              <w:jc w:val="center"/>
+            </w:pPr>
+            <w:r>
+              <w:rPr>
+                <w:rFonts w:ascii="Times New Roman" w:cs="Times New Roman" w:eastAsia="Times New Roman" w:hAnsi="Times New Roman"/>
+                <w:b/>
+                <w:bCs/>
+                <w:color w:val="000000"/>
+                <w:sz w:val="20"/>
+                <w:szCs w:val="20"/>
+              </w:rPr>
+              <w:t xml:space="preserve">p</w:t>
+            </w:r>
+          </w:p>
+        </w:tc>
+      </w:tr>
+      <w:tr>
+        <w:tc>
+          <w:tcPr>
+            <w:tcW w:type="dxa" w:w="2905"/>
+            <w:tcBorders>
+              <w:top w:val="none"/>
+              <w:left w:val="none"/>
+              <w:bottom w:val="none"/>
+              <w:right w:val="none"/>
+            </w:tcBorders>
+            <w:tcMar>
+              <w:top w:type="dxa" w:w="30"/>
+              <w:left w:type="dxa" w:w="70"/>
+              <w:bottom w:type="dxa" w:w="30"/>
+              <w:right w:type="dxa" w:w="70"/>
+            </w:tcMar>
+            <w:vAlign w:val="center"/>
+          </w:tcPr>
+          <w:p>
+            <w:pPr>
+              <w:spacing w:after="0" w:line="240"/>
+              <w:jc w:val="left"/>
+            </w:pPr>
+            <w:r>
+              <w:rPr>
+                <w:rFonts w:ascii="Times New Roman" w:cs="Times New Roman" w:eastAsia="Times New Roman" w:hAnsi="Times New Roman"/>
+                <w:b/>
+                <w:bCs/>
+                <w:color w:val="000000"/>
+                <w:sz w:val="20"/>
+                <w:szCs w:val="20"/>
+              </w:rPr>
+              <w:t xml:space="preserve">Vigor</w:t>
+            </w:r>
+          </w:p>
+        </w:tc>
+        <w:tc>
+          <w:tcPr>
+            <w:tcW w:type="dxa" w:w="1650"/>
+            <w:tcBorders>
+              <w:top w:val="none"/>
+              <w:left w:val="none"/>
+              <w:bottom w:val="none"/>
+              <w:right w:val="none"/>
+            </w:tcBorders>
+            <w:tcMar>
+              <w:top w:type="dxa" w:w="30"/>
+              <w:left w:type="dxa" w:w="70"/>
+              <w:bottom w:type="dxa" w:w="30"/>
+              <w:right w:type="dxa" w:w="70"/>
+            </w:tcMar>
+            <w:vAlign w:val="center"/>
+          </w:tcPr>
+          <w:p>
+            <w:pPr>
+              <w:spacing w:after="0" w:line="240"/>
+              <w:jc w:val="center"/>
+            </w:pPr>
+            <w:r>
+              <w:rPr>
+                <w:rFonts w:ascii="Times New Roman" w:cs="Times New Roman" w:eastAsia="Times New Roman" w:hAnsi="Times New Roman"/>
+                <w:color w:val="000000"/>
+                <w:sz w:val="20"/>
+                <w:szCs w:val="20"/>
+              </w:rPr>
+              <w:t xml:space="preserve">4,55</w:t>
+            </w:r>
+          </w:p>
+        </w:tc>
+        <w:tc>
+          <w:tcPr>
+            <w:tcW w:type="dxa" w:w="1650"/>
+            <w:tcBorders>
+              <w:top w:val="none"/>
+              <w:left w:val="none"/>
+              <w:bottom w:val="none"/>
+              <w:right w:val="none"/>
+            </w:tcBorders>
+            <w:tcMar>
+              <w:top w:type="dxa" w:w="30"/>
+              <w:left w:type="dxa" w:w="70"/>
+              <w:bottom w:type="dxa" w:w="30"/>
+              <w:right w:type="dxa" w:w="70"/>
+            </w:tcMar>
+            <w:vAlign w:val="center"/>
+          </w:tcPr>
+          <w:p>
+            <w:pPr>
+              <w:spacing w:after="0" w:line="240"/>
+              <w:jc w:val="center"/>
+            </w:pPr>
+            <w:r>
+              <w:rPr>
+                <w:rFonts w:ascii="Times New Roman" w:cs="Times New Roman" w:eastAsia="Times New Roman" w:hAnsi="Times New Roman"/>
+                <w:color w:val="000000"/>
+                <w:sz w:val="20"/>
+                <w:szCs w:val="20"/>
+              </w:rPr>
+              <w:t xml:space="preserve">6,34</w:t>
+            </w:r>
+          </w:p>
+        </w:tc>
+        <w:tc>
+          <w:tcPr>
+            <w:tcW w:type="dxa" w:w="1300"/>
+            <w:tcBorders>
+              <w:top w:val="none"/>
+              <w:left w:val="none"/>
+              <w:bottom w:val="none"/>
+              <w:right w:val="none"/>
+            </w:tcBorders>
+            <w:tcMar>
+              <w:top w:type="dxa" w:w="30"/>
+              <w:left w:type="dxa" w:w="70"/>
+              <w:bottom w:type="dxa" w:w="30"/>
+              <w:right w:type="dxa" w:w="70"/>
+            </w:tcMar>
+            <w:vAlign w:val="center"/>
+          </w:tcPr>
+          <w:p>
+            <w:pPr>
+              <w:spacing w:after="0" w:line="240"/>
+              <w:jc w:val="center"/>
+            </w:pPr>
+            <w:r>
+              <w:rPr>
+                <w:rFonts w:ascii="Times New Roman" w:cs="Times New Roman" w:eastAsia="Times New Roman" w:hAnsi="Times New Roman"/>
+                <w:b/>
+                <w:bCs/>
+                <w:color w:val="000000"/>
+                <w:sz w:val="20"/>
+                <w:szCs w:val="20"/>
+              </w:rPr>
+              <w:t xml:space="preserve">+0,76</w:t>
+            </w:r>
+          </w:p>
+        </w:tc>
+        <w:tc>
+          <w:tcPr>
+            <w:tcW w:type="dxa" w:w="2000"/>
+            <w:tcBorders>
+              <w:top w:val="none"/>
+              <w:left w:val="none"/>
+              <w:bottom w:val="none"/>
+              <w:right w:val="none"/>
+            </w:tcBorders>
+            <w:tcMar>
+              <w:top w:type="dxa" w:w="30"/>
+              <w:left w:type="dxa" w:w="70"/>
+              <w:bottom w:type="dxa" w:w="30"/>
+              <w:right w:type="dxa" w:w="70"/>
+            </w:tcMar>
+            <w:vAlign w:val="center"/>
+          </w:tcPr>
+          <w:p>
+            <w:pPr>
+              <w:spacing w:after="0" w:line="240"/>
+              <w:jc w:val="center"/>
+            </w:pPr>
+            <w:r>
+              <w:rPr>
+                <w:rFonts w:ascii="Times New Roman" w:cs="Times New Roman" w:eastAsia="Times New Roman" w:hAnsi="Times New Roman"/>
+                <w:color w:val="3f3f3f"/>
+                <w:sz w:val="20"/>
+                <w:szCs w:val="20"/>
+              </w:rPr>
+              <w:t xml:space="preserve">p = 0,061</w:t>
+            </w:r>
+          </w:p>
+        </w:tc>
+      </w:tr>
+      <w:tr>
+        <w:tc>
+          <w:tcPr>
+            <w:tcW w:type="dxa" w:w="2905"/>
+            <w:tcBorders>
+              <w:top w:val="none"/>
+              <w:left w:val="none"/>
+              <w:bottom w:val="none"/>
+              <w:right w:val="none"/>
+            </w:tcBorders>
+            <w:tcMar>
+              <w:top w:type="dxa" w:w="30"/>
+              <w:left w:type="dxa" w:w="70"/>
+              <w:bottom w:type="dxa" w:w="30"/>
+              <w:right w:type="dxa" w:w="70"/>
+            </w:tcMar>
+            <w:vAlign w:val="center"/>
+          </w:tcPr>
+          <w:p>
+            <w:pPr>
+              <w:spacing w:after="0" w:line="240"/>
+              <w:jc w:val="left"/>
+            </w:pPr>
+            <w:r>
+              <w:rPr>
+                <w:rFonts w:ascii="Times New Roman" w:cs="Times New Roman" w:eastAsia="Times New Roman" w:hAnsi="Times New Roman"/>
+                <w:b/>
+                <w:bCs/>
+                <w:color w:val="000000"/>
+                <w:sz w:val="20"/>
+                <w:szCs w:val="20"/>
+              </w:rPr>
+              <w:t xml:space="preserve">Fadiga</w:t>
+            </w:r>
+          </w:p>
+        </w:tc>
+        <w:tc>
+          <w:tcPr>
+            <w:tcW w:type="dxa" w:w="1650"/>
+            <w:tcBorders>
+              <w:top w:val="none"/>
+              <w:left w:val="none"/>
+              <w:bottom w:val="none"/>
+              <w:right w:val="none"/>
+            </w:tcBorders>
+            <w:tcMar>
+              <w:top w:type="dxa" w:w="30"/>
+              <w:left w:type="dxa" w:w="70"/>
+              <w:bottom w:type="dxa" w:w="30"/>
+              <w:right w:type="dxa" w:w="70"/>
+            </w:tcMar>
+            <w:vAlign w:val="center"/>
+          </w:tcPr>
+          <w:p>
+            <w:pPr>
+              <w:spacing w:after="0" w:line="240"/>
+              <w:jc w:val="center"/>
+            </w:pPr>
+            <w:r>
+              <w:rPr>
+                <w:rFonts w:ascii="Times New Roman" w:cs="Times New Roman" w:eastAsia="Times New Roman" w:hAnsi="Times New Roman"/>
+                <w:color w:val="000000"/>
+                <w:sz w:val="20"/>
+                <w:szCs w:val="20"/>
+              </w:rPr>
+              <w:t xml:space="preserve">6,65</w:t>
+            </w:r>
+          </w:p>
+        </w:tc>
+        <w:tc>
+          <w:tcPr>
+            <w:tcW w:type="dxa" w:w="1650"/>
+            <w:tcBorders>
+              <w:top w:val="none"/>
+              <w:left w:val="none"/>
+              <w:bottom w:val="none"/>
+              <w:right w:val="none"/>
+            </w:tcBorders>
+            <w:tcMar>
+              <w:top w:type="dxa" w:w="30"/>
+              <w:left w:type="dxa" w:w="70"/>
+              <w:bottom w:type="dxa" w:w="30"/>
+              <w:right w:type="dxa" w:w="70"/>
+            </w:tcMar>
+            <w:vAlign w:val="center"/>
+          </w:tcPr>
+          <w:p>
+            <w:pPr>
+              <w:spacing w:after="0" w:line="240"/>
+              <w:jc w:val="center"/>
+            </w:pPr>
+            <w:r>
+              <w:rPr>
+                <w:rFonts w:ascii="Times New Roman" w:cs="Times New Roman" w:eastAsia="Times New Roman" w:hAnsi="Times New Roman"/>
+                <w:color w:val="000000"/>
+                <w:sz w:val="20"/>
+                <w:szCs w:val="20"/>
+              </w:rPr>
+              <w:t xml:space="preserve">4,26</w:t>
+            </w:r>
+          </w:p>
+        </w:tc>
+        <w:tc>
+          <w:tcPr>
+            <w:tcW w:type="dxa" w:w="1300"/>
+            <w:tcBorders>
+              <w:top w:val="none"/>
+              <w:left w:val="none"/>
+              <w:bottom w:val="none"/>
+              <w:right w:val="none"/>
+            </w:tcBorders>
+            <w:tcMar>
+              <w:top w:type="dxa" w:w="30"/>
+              <w:left w:type="dxa" w:w="70"/>
+              <w:bottom w:type="dxa" w:w="30"/>
+              <w:right w:type="dxa" w:w="70"/>
+            </w:tcMar>
+            <w:vAlign w:val="center"/>
+          </w:tcPr>
+          <w:p>
+            <w:pPr>
+              <w:spacing w:after="0" w:line="240"/>
+              <w:jc w:val="center"/>
+            </w:pPr>
+            <w:r>
+              <w:rPr>
+                <w:rFonts w:ascii="Times New Roman" w:cs="Times New Roman" w:eastAsia="Times New Roman" w:hAnsi="Times New Roman"/>
+                <w:b/>
+                <w:bCs/>
+                <w:color w:val="000000"/>
+                <w:sz w:val="20"/>
+                <w:szCs w:val="20"/>
+              </w:rPr>
+              <w:t xml:space="preserve">-0,80</w:t>
+            </w:r>
+          </w:p>
+        </w:tc>
+        <w:tc>
+          <w:tcPr>
+            <w:tcW w:type="dxa" w:w="2000"/>
+            <w:tcBorders>
+              <w:top w:val="none"/>
+              <w:left w:val="none"/>
+              <w:bottom w:val="none"/>
+              <w:right w:val="none"/>
+            </w:tcBorders>
+            <w:tcMar>
+              <w:top w:type="dxa" w:w="30"/>
+              <w:left w:type="dxa" w:w="70"/>
+              <w:bottom w:type="dxa" w:w="30"/>
+              <w:right w:type="dxa" w:w="70"/>
+            </w:tcMar>
+            <w:vAlign w:val="center"/>
+          </w:tcPr>
+          <w:p>
+            <w:pPr>
+              <w:spacing w:after="0" w:line="240"/>
+              <w:jc w:val="center"/>
+            </w:pPr>
+            <w:r>
+              <w:rPr>
+                <w:rFonts w:ascii="Times New Roman" w:cs="Times New Roman" w:eastAsia="Times New Roman" w:hAnsi="Times New Roman"/>
+                <w:color w:val="3f3f3f"/>
+                <w:sz w:val="20"/>
+                <w:szCs w:val="20"/>
+              </w:rPr>
+              <w:t xml:space="preserve">p = 0,068</w:t>
+            </w:r>
+          </w:p>
+        </w:tc>
+      </w:tr>
+      <w:tr>
+        <w:tc>
+          <w:tcPr>
+            <w:tcW w:type="dxa" w:w="2905"/>
+            <w:tcBorders>
+              <w:top w:val="none"/>
+              <w:left w:val="none"/>
+              <w:bottom w:val="none"/>
+              <w:right w:val="none"/>
+            </w:tcBorders>
+            <w:tcMar>
+              <w:top w:type="dxa" w:w="30"/>
+              <w:left w:type="dxa" w:w="70"/>
+              <w:bottom w:type="dxa" w:w="30"/>
+              <w:right w:type="dxa" w:w="70"/>
+            </w:tcMar>
+            <w:vAlign w:val="center"/>
+          </w:tcPr>
+          <w:p>
+            <w:pPr>
+              <w:spacing w:after="0" w:line="240"/>
+              <w:jc w:val="left"/>
+            </w:pPr>
+            <w:r>
+              <w:rPr>
+                <w:rFonts w:ascii="Times New Roman" w:cs="Times New Roman" w:eastAsia="Times New Roman" w:hAnsi="Times New Roman"/>
+                <w:b/>
+                <w:bCs/>
+                <w:color w:val="000000"/>
+                <w:sz w:val="20"/>
+                <w:szCs w:val="20"/>
+              </w:rPr>
+              <w:t xml:space="preserve">Fadiga física</w:t>
+            </w:r>
+          </w:p>
+        </w:tc>
+        <w:tc>
+          <w:tcPr>
+            <w:tcW w:type="dxa" w:w="1650"/>
+            <w:tcBorders>
+              <w:top w:val="none"/>
+              <w:left w:val="none"/>
+              <w:bottom w:val="none"/>
+              <w:right w:val="none"/>
+            </w:tcBorders>
+            <w:tcMar>
+              <w:top w:type="dxa" w:w="30"/>
+              <w:left w:type="dxa" w:w="70"/>
+              <w:bottom w:type="dxa" w:w="30"/>
+              <w:right w:type="dxa" w:w="70"/>
+            </w:tcMar>
+            <w:vAlign w:val="center"/>
+          </w:tcPr>
+          <w:p>
+            <w:pPr>
+              <w:spacing w:after="0" w:line="240"/>
+              <w:jc w:val="center"/>
+            </w:pPr>
+            <w:r>
+              <w:rPr>
+                <w:rFonts w:ascii="Times New Roman" w:cs="Times New Roman" w:eastAsia="Times New Roman" w:hAnsi="Times New Roman"/>
+                <w:color w:val="000000"/>
+                <w:sz w:val="20"/>
+                <w:szCs w:val="20"/>
+              </w:rPr>
+              <w:t xml:space="preserve">6,60</w:t>
+            </w:r>
+          </w:p>
+        </w:tc>
+        <w:tc>
+          <w:tcPr>
+            <w:tcW w:type="dxa" w:w="1650"/>
+            <w:tcBorders>
+              <w:top w:val="none"/>
+              <w:left w:val="none"/>
+              <w:bottom w:val="none"/>
+              <w:right w:val="none"/>
+            </w:tcBorders>
+            <w:tcMar>
+              <w:top w:type="dxa" w:w="30"/>
+              <w:left w:type="dxa" w:w="70"/>
+              <w:bottom w:type="dxa" w:w="30"/>
+              <w:right w:type="dxa" w:w="70"/>
+            </w:tcMar>
+            <w:vAlign w:val="center"/>
+          </w:tcPr>
+          <w:p>
+            <w:pPr>
+              <w:spacing w:after="0" w:line="240"/>
+              <w:jc w:val="center"/>
+            </w:pPr>
+            <w:r>
+              <w:rPr>
+                <w:rFonts w:ascii="Times New Roman" w:cs="Times New Roman" w:eastAsia="Times New Roman" w:hAnsi="Times New Roman"/>
+                <w:color w:val="000000"/>
+                <w:sz w:val="20"/>
+                <w:szCs w:val="20"/>
+              </w:rPr>
+              <w:t xml:space="preserve">5,42</w:t>
+            </w:r>
+          </w:p>
+        </w:tc>
+        <w:tc>
+          <w:tcPr>
+            <w:tcW w:type="dxa" w:w="1300"/>
+            <w:tcBorders>
+              <w:top w:val="none"/>
+              <w:left w:val="none"/>
+              <w:bottom w:val="none"/>
+              <w:right w:val="none"/>
+            </w:tcBorders>
+            <w:tcMar>
+              <w:top w:type="dxa" w:w="30"/>
+              <w:left w:type="dxa" w:w="70"/>
+              <w:bottom w:type="dxa" w:w="30"/>
+              <w:right w:type="dxa" w:w="70"/>
+            </w:tcMar>
+            <w:vAlign w:val="center"/>
+          </w:tcPr>
+          <w:p>
+            <w:pPr>
+              <w:spacing w:after="0" w:line="240"/>
+              <w:jc w:val="center"/>
+            </w:pPr>
+            <w:r>
+              <w:rPr>
+                <w:rFonts w:ascii="Times New Roman" w:cs="Times New Roman" w:eastAsia="Times New Roman" w:hAnsi="Times New Roman"/>
+                <w:b/>
+                <w:bCs/>
+                <w:color w:val="000000"/>
+                <w:sz w:val="20"/>
+                <w:szCs w:val="20"/>
+              </w:rPr>
+              <w:t xml:space="preserve">-0,77</w:t>
+            </w:r>
+          </w:p>
+        </w:tc>
+        <w:tc>
+          <w:tcPr>
+            <w:tcW w:type="dxa" w:w="2000"/>
+            <w:tcBorders>
+              <w:top w:val="none"/>
+              <w:left w:val="none"/>
+              <w:bottom w:val="none"/>
+              <w:right w:val="none"/>
+            </w:tcBorders>
+            <w:tcMar>
+              <w:top w:type="dxa" w:w="30"/>
+              <w:left w:type="dxa" w:w="70"/>
+              <w:bottom w:type="dxa" w:w="30"/>
+              <w:right w:type="dxa" w:w="70"/>
+            </w:tcMar>
+            <w:vAlign w:val="center"/>
+          </w:tcPr>
+          <w:p>
+            <w:pPr>
+              <w:spacing w:after="0" w:line="240"/>
+              <w:jc w:val="center"/>
+            </w:pPr>
+            <w:r>
+              <w:rPr>
+                <w:rFonts w:ascii="Times New Roman" w:cs="Times New Roman" w:eastAsia="Times New Roman" w:hAnsi="Times New Roman"/>
+                <w:color w:val="1b7a3d"/>
+                <w:sz w:val="20"/>
+                <w:szCs w:val="20"/>
+              </w:rPr>
+              <w:t xml:space="preserve">p = 0,036</w:t>
+            </w:r>
+          </w:p>
+        </w:tc>
+      </w:tr>
+      <w:tr>
+        <w:tc>
+          <w:tcPr>
+            <w:tcW w:type="dxa" w:w="2905"/>
+            <w:tcBorders>
+              <w:top w:val="none"/>
+              <w:left w:val="none"/>
+              <w:bottom w:val="single" w:color="000000" w:sz="6"/>
+              <w:right w:val="none"/>
+            </w:tcBorders>
+            <w:tcMar>
+              <w:top w:type="dxa" w:w="30"/>
+              <w:left w:type="dxa" w:w="70"/>
+              <w:bottom w:type="dxa" w:w="30"/>
+              <w:right w:type="dxa" w:w="70"/>
+            </w:tcMar>
+            <w:vAlign w:val="center"/>
+          </w:tcPr>
+          <w:p>
+            <w:pPr>
+              <w:spacing w:after="0" w:line="240"/>
+              <w:jc w:val="left"/>
+            </w:pPr>
+            <w:r>
+              <w:rPr>
+                <w:rFonts w:ascii="Times New Roman" w:cs="Times New Roman" w:eastAsia="Times New Roman" w:hAnsi="Times New Roman"/>
+                <w:b/>
+                <w:bCs/>
+                <w:color w:val="000000"/>
+                <w:sz w:val="20"/>
+                <w:szCs w:val="20"/>
+              </w:rPr>
+              <w:t xml:space="preserve">PTH</w:t>
+            </w:r>
+          </w:p>
+        </w:tc>
+        <w:tc>
+          <w:tcPr>
+            <w:tcW w:type="dxa" w:w="1650"/>
+            <w:tcBorders>
+              <w:top w:val="none"/>
+              <w:left w:val="none"/>
+              <w:bottom w:val="single" w:color="000000" w:sz="6"/>
+              <w:right w:val="none"/>
+            </w:tcBorders>
+            <w:tcMar>
+              <w:top w:type="dxa" w:w="30"/>
+              <w:left w:type="dxa" w:w="70"/>
+              <w:bottom w:type="dxa" w:w="30"/>
+              <w:right w:type="dxa" w:w="70"/>
+            </w:tcMar>
+            <w:vAlign w:val="center"/>
+          </w:tcPr>
+          <w:p>
+            <w:pPr>
+              <w:spacing w:after="0" w:line="240"/>
+              <w:jc w:val="center"/>
+            </w:pPr>
+            <w:r>
+              <w:rPr>
+                <w:rFonts w:ascii="Times New Roman" w:cs="Times New Roman" w:eastAsia="Times New Roman" w:hAnsi="Times New Roman"/>
+                <w:color w:val="000000"/>
+                <w:sz w:val="20"/>
+                <w:szCs w:val="20"/>
+              </w:rPr>
+              <w:t xml:space="preserve">5,26</w:t>
+            </w:r>
+          </w:p>
+        </w:tc>
+        <w:tc>
+          <w:tcPr>
+            <w:tcW w:type="dxa" w:w="1650"/>
+            <w:tcBorders>
+              <w:top w:val="none"/>
+              <w:left w:val="none"/>
+              <w:bottom w:val="single" w:color="000000" w:sz="6"/>
+              <w:right w:val="none"/>
+            </w:tcBorders>
+            <w:tcMar>
+              <w:top w:type="dxa" w:w="30"/>
+              <w:left w:type="dxa" w:w="70"/>
+              <w:bottom w:type="dxa" w:w="30"/>
+              <w:right w:type="dxa" w:w="70"/>
+            </w:tcMar>
+            <w:vAlign w:val="center"/>
+          </w:tcPr>
+          <w:p>
+            <w:pPr>
+              <w:spacing w:after="0" w:line="240"/>
+              <w:jc w:val="center"/>
+            </w:pPr>
+            <w:r>
+              <w:rPr>
+                <w:rFonts w:ascii="Times New Roman" w:cs="Times New Roman" w:eastAsia="Times New Roman" w:hAnsi="Times New Roman"/>
+                <w:color w:val="000000"/>
+                <w:sz w:val="20"/>
+                <w:szCs w:val="20"/>
+              </w:rPr>
+              <w:t xml:space="preserve">4,11</w:t>
+            </w:r>
+          </w:p>
+        </w:tc>
+        <w:tc>
+          <w:tcPr>
+            <w:tcW w:type="dxa" w:w="1300"/>
+            <w:tcBorders>
+              <w:top w:val="none"/>
+              <w:left w:val="none"/>
+              <w:bottom w:val="single" w:color="000000" w:sz="6"/>
+              <w:right w:val="none"/>
+            </w:tcBorders>
+            <w:tcMar>
+              <w:top w:type="dxa" w:w="30"/>
+              <w:left w:type="dxa" w:w="70"/>
+              <w:bottom w:type="dxa" w:w="30"/>
+              <w:right w:type="dxa" w:w="70"/>
+            </w:tcMar>
+            <w:vAlign w:val="center"/>
+          </w:tcPr>
+          <w:p>
+            <w:pPr>
+              <w:spacing w:after="0" w:line="240"/>
+              <w:jc w:val="center"/>
+            </w:pPr>
+            <w:r>
+              <w:rPr>
+                <w:rFonts w:ascii="Times New Roman" w:cs="Times New Roman" w:eastAsia="Times New Roman" w:hAnsi="Times New Roman"/>
+                <w:b/>
+                <w:bCs/>
+                <w:color w:val="000000"/>
+                <w:sz w:val="20"/>
+                <w:szCs w:val="20"/>
+              </w:rPr>
+              <w:t xml:space="preserve">-0,48</w:t>
+            </w:r>
+          </w:p>
+        </w:tc>
+        <w:tc>
+          <w:tcPr>
+            <w:tcW w:type="dxa" w:w="2000"/>
+            <w:tcBorders>
+              <w:top w:val="none"/>
+              <w:left w:val="none"/>
+              <w:bottom w:val="single" w:color="000000" w:sz="6"/>
+              <w:right w:val="none"/>
+            </w:tcBorders>
+            <w:tcMar>
+              <w:top w:type="dxa" w:w="30"/>
+              <w:left w:type="dxa" w:w="70"/>
+              <w:bottom w:type="dxa" w:w="30"/>
+              <w:right w:type="dxa" w:w="70"/>
+            </w:tcMar>
+            <w:vAlign w:val="center"/>
+          </w:tcPr>
+          <w:p>
+            <w:pPr>
+              <w:spacing w:after="0" w:line="240"/>
+              <w:jc w:val="center"/>
+            </w:pPr>
+            <w:r>
+              <w:rPr>
+                <w:rFonts w:ascii="Times New Roman" w:cs="Times New Roman" w:eastAsia="Times New Roman" w:hAnsi="Times New Roman"/>
+                <w:color w:val="3f3f3f"/>
+                <w:sz w:val="20"/>
+                <w:szCs w:val="20"/>
+              </w:rPr>
+              <w:t xml:space="preserve">p = 0,183</w:t>
+            </w:r>
+          </w:p>
+        </w:tc>
+      </w:tr>
+    </w:tbl>
+    <w:p>
+      <w:pPr>
+        <w:spacing w:after="180" w:before="40" w:line="240"/>
+        <w:jc w:val="left"/>
+      </w:pPr>
+      <w:r>
+        <w:rPr>
+          <w:rFonts w:ascii="Times New Roman" w:cs="Times New Roman" w:eastAsia="Times New Roman" w:hAnsi="Times New Roman"/>
+          <w:color w:val="3f3f3f"/>
+          <w:sz w:val="20"/>
+          <w:szCs w:val="20"/>
+        </w:rPr>
+        <w:t xml:space="preserve">Nota: limiar = mediana do pico de velocidade (14,9 km/h); dz = tamanho de efeito do contraste entre os grupos acima e abaixo do limiar. Fonte: Dados da pesquisa (2026).</w:t>
+      </w:r>
+    </w:p>
+    <w:p>
+      <w:pPr>
+        <w:spacing w:after="0" w:before="0" w:line="360" w:lineRule="auto"/>
+        <w:ind w:firstLine="709"/>
+        <w:jc w:val="both"/>
+      </w:pPr>
+      <w:r>
+        <w:rPr>
+          <w:rFonts w:ascii="Times New Roman" w:cs="Times New Roman" w:eastAsia="Times New Roman" w:hAnsi="Times New Roman"/>
+          <w:color w:val="000000"/>
+          <w:sz w:val="24"/>
+          <w:szCs w:val="24"/>
+        </w:rPr>
+        <w:t xml:space="preserve">O padrão do limiar confirma a leitura contínua. Acima do limiar de aptidão, o vigor apresenta-se maior e a fadiga e a fadiga física menores, comportamento coerente com a aptidão aeróbia na função de amortecedor do custo físico. Apenas a fadiga física alcança significância isolada, ainda que as demais dimensões físicas caminhem na mesma direção, e o padrão permanece monotônico ao longo dos três tercis de pico de velocidade.</w:t>
       </w:r>
     </w:p>
     <w:p>

</xml_diff>

<commit_message>
docs(abnt): multiplicidade e rede psicométrica no documento
Sincroniza as duas análises mais recentes com o parecer ABNT:
- Seção 7.4 "Correção por multiplicidade": Tabela 32 com a família confirmatória
  primária (14 testes) e a sobrevivência a FDR e Bonferroni;
- Seção 7.5 "Rede psicométrica e dinâmica defasada": Figura 20 (rede de
  correlações parciais), Tabela 33 (ligações diretas mais fortes) e o resultado
  nulo do painel cruzado defasado.

Verificação: 0 travessão, sem gerúndio, 20 figuras, 33 tabelas (grid 9505).
Valores reais (an_multiplicity, an_net_payload).

Co-Authored-By: Claude Opus 4.8 <noreply@anthropic.com>
Claude-Session: https://claude.ai/code/session_01P7yGiDeoGDyjWvPWQVsUrj
</commit_message>
<xml_diff>
--- a/Artigos/Analise_Descritiva_Triangulacao_ABNT.docx
+++ b/Artigos/Analise_Descritiva_Triangulacao_ABNT.docx
@@ -53386,6 +53386,4126 @@
           <w:szCs w:val="20"/>
         </w:rPr>
         <w:t xml:space="preserve">Nota: prioridade sugerida pela combinação entre relevância prática e viabilidade; as hipóteses são caminhos para confirmar, não conclusões. Fonte: Dados da pesquisa (2026).</w:t>
+      </w:r>
+    </w:p>
+    <w:p>
+      <w:pPr>
+        <w:keepNext/>
+        <w:spacing w:after="90" w:before="200" w:line="360" w:lineRule="auto"/>
+      </w:pPr>
+      <w:r>
+        <w:rPr>
+          <w:rFonts w:ascii="Times New Roman" w:cs="Times New Roman" w:eastAsia="Times New Roman" w:hAnsi="Times New Roman"/>
+          <w:b/>
+          <w:bCs/>
+          <w:color w:val="000000"/>
+          <w:sz w:val="24"/>
+          <w:szCs w:val="24"/>
+        </w:rPr>
+        <w:t xml:space="preserve">7.4 Correção por multiplicidade</w:t>
+      </w:r>
+    </w:p>
+    <w:p>
+      <w:pPr>
+        <w:spacing w:after="0" w:before="0" w:line="360" w:lineRule="auto"/>
+        <w:ind w:firstLine="709"/>
+        <w:jc w:val="both"/>
+      </w:pPr>
+      <w:r>
+        <w:rPr>
+          <w:rFonts w:ascii="Times New Roman" w:cs="Times New Roman" w:eastAsia="Times New Roman" w:hAnsi="Times New Roman"/>
+          <w:color w:val="000000"/>
+          <w:sz w:val="24"/>
+          <w:szCs w:val="24"/>
+        </w:rPr>
+        <w:t xml:space="preserve">Ao longo do estudo foram conduzidos muitos testes, o que exige o controle explícito da multiplicidade. A família confirmatória primária reúne o teste de Wilcoxon do primeiro contra o último dia e o teste de Friedman dos sete dias, para cada dimensão, e recebe duas correções dentro de cada família, a saber, o procedimento de Benjamini-Hochberg, que controla a proporção esperada de falsos positivos, e a correção de Bonferroni, mais conservadora. A Tabela 32 reúne os quatorze testes e assinala quais sobrevivem a cada critério.</w:t>
+      </w:r>
+    </w:p>
+    <w:p>
+      <w:pPr>
+        <w:keepNext/>
+        <w:spacing w:after="40" w:before="160" w:line="240"/>
+        <w:jc w:val="left"/>
+      </w:pPr>
+      <w:r>
+        <w:rPr>
+          <w:rFonts w:ascii="Times New Roman" w:cs="Times New Roman" w:eastAsia="Times New Roman" w:hAnsi="Times New Roman"/>
+          <w:b/>
+          <w:bCs/>
+          <w:color w:val="000000"/>
+          <w:sz w:val="20"/>
+          <w:szCs w:val="20"/>
+        </w:rPr>
+        <w:t xml:space="preserve">Tabela 32</w:t>
+      </w:r>
+      <w:r>
+        <w:rPr>
+          <w:rFonts w:ascii="Times New Roman" w:cs="Times New Roman" w:eastAsia="Times New Roman" w:hAnsi="Times New Roman"/>
+          <w:color w:val="000000"/>
+          <w:sz w:val="20"/>
+          <w:szCs w:val="20"/>
+        </w:rPr>
+        <w:t xml:space="preserve"> – Mapa de multiplicidade da família confirmatória primária</w:t>
+      </w:r>
+    </w:p>
+    <w:tbl>
+      <w:tblPr>
+        <w:tblW w:type="dxa" w:w="9505"/>
+        <w:tblBorders>
+          <w:top w:val="single" w:color="000000" w:sz="6"/>
+          <w:left w:val="none"/>
+          <w:bottom w:val="single" w:color="000000" w:sz="6"/>
+          <w:right w:val="none"/>
+          <w:insideH w:val="none"/>
+          <w:insideV w:val="none"/>
+        </w:tblBorders>
+      </w:tblPr>
+      <w:tblGrid>
+        <w:gridCol w:w="1700"/>
+        <w:gridCol w:w="1900"/>
+        <w:gridCol w:w="1400"/>
+        <w:gridCol w:w="1400"/>
+        <w:gridCol w:w="1400"/>
+        <w:gridCol w:w="1705"/>
+      </w:tblGrid>
+      <w:tr>
+        <w:trPr>
+          <w:tblHeader/>
+        </w:trPr>
+        <w:tc>
+          <w:tcPr>
+            <w:tcW w:type="dxa" w:w="1700"/>
+            <w:tcBorders>
+              <w:top w:val="single" w:color="000000" w:sz="6"/>
+              <w:left w:val="none"/>
+              <w:bottom w:val="single" w:color="000000" w:sz="6"/>
+              <w:right w:val="none"/>
+            </w:tcBorders>
+            <w:tcMar>
+              <w:top w:type="dxa" w:w="40"/>
+              <w:left w:type="dxa" w:w="70"/>
+              <w:bottom w:type="dxa" w:w="40"/>
+              <w:right w:type="dxa" w:w="70"/>
+            </w:tcMar>
+            <w:vAlign w:val="center"/>
+          </w:tcPr>
+          <w:p>
+            <w:pPr>
+              <w:spacing w:after="0" w:line="240"/>
+              <w:jc w:val="left"/>
+            </w:pPr>
+            <w:r>
+              <w:rPr>
+                <w:rFonts w:ascii="Times New Roman" w:cs="Times New Roman" w:eastAsia="Times New Roman" w:hAnsi="Times New Roman"/>
+                <w:b/>
+                <w:bCs/>
+                <w:color w:val="000000"/>
+                <w:sz w:val="20"/>
+                <w:szCs w:val="20"/>
+              </w:rPr>
+              <w:t xml:space="preserve">Teste</w:t>
+            </w:r>
+          </w:p>
+        </w:tc>
+        <w:tc>
+          <w:tcPr>
+            <w:tcW w:type="dxa" w:w="1900"/>
+            <w:tcBorders>
+              <w:top w:val="single" w:color="000000" w:sz="6"/>
+              <w:left w:val="none"/>
+              <w:bottom w:val="single" w:color="000000" w:sz="6"/>
+              <w:right w:val="none"/>
+            </w:tcBorders>
+            <w:tcMar>
+              <w:top w:type="dxa" w:w="40"/>
+              <w:left w:type="dxa" w:w="70"/>
+              <w:bottom w:type="dxa" w:w="40"/>
+              <w:right w:type="dxa" w:w="70"/>
+            </w:tcMar>
+            <w:vAlign w:val="center"/>
+          </w:tcPr>
+          <w:p>
+            <w:pPr>
+              <w:spacing w:after="0" w:line="240"/>
+              <w:jc w:val="left"/>
+            </w:pPr>
+            <w:r>
+              <w:rPr>
+                <w:rFonts w:ascii="Times New Roman" w:cs="Times New Roman" w:eastAsia="Times New Roman" w:hAnsi="Times New Roman"/>
+                <w:b/>
+                <w:bCs/>
+                <w:color w:val="000000"/>
+                <w:sz w:val="20"/>
+                <w:szCs w:val="20"/>
+              </w:rPr>
+              <w:t xml:space="preserve">Dimensão</w:t>
+            </w:r>
+          </w:p>
+        </w:tc>
+        <w:tc>
+          <w:tcPr>
+            <w:tcW w:type="dxa" w:w="1400"/>
+            <w:tcBorders>
+              <w:top w:val="single" w:color="000000" w:sz="6"/>
+              <w:left w:val="none"/>
+              <w:bottom w:val="single" w:color="000000" w:sz="6"/>
+              <w:right w:val="none"/>
+            </w:tcBorders>
+            <w:tcMar>
+              <w:top w:type="dxa" w:w="40"/>
+              <w:left w:type="dxa" w:w="70"/>
+              <w:bottom w:type="dxa" w:w="40"/>
+              <w:right w:type="dxa" w:w="70"/>
+            </w:tcMar>
+            <w:vAlign w:val="center"/>
+          </w:tcPr>
+          <w:p>
+            <w:pPr>
+              <w:spacing w:after="0" w:line="240"/>
+              <w:jc w:val="center"/>
+            </w:pPr>
+            <w:r>
+              <w:rPr>
+                <w:rFonts w:ascii="Times New Roman" w:cs="Times New Roman" w:eastAsia="Times New Roman" w:hAnsi="Times New Roman"/>
+                <w:b/>
+                <w:bCs/>
+                <w:color w:val="000000"/>
+                <w:sz w:val="20"/>
+                <w:szCs w:val="20"/>
+              </w:rPr>
+              <w:t xml:space="preserve">p bruto</w:t>
+            </w:r>
+          </w:p>
+        </w:tc>
+        <w:tc>
+          <w:tcPr>
+            <w:tcW w:type="dxa" w:w="1400"/>
+            <w:tcBorders>
+              <w:top w:val="single" w:color="000000" w:sz="6"/>
+              <w:left w:val="none"/>
+              <w:bottom w:val="single" w:color="000000" w:sz="6"/>
+              <w:right w:val="none"/>
+            </w:tcBorders>
+            <w:tcMar>
+              <w:top w:type="dxa" w:w="40"/>
+              <w:left w:type="dxa" w:w="70"/>
+              <w:bottom w:type="dxa" w:w="40"/>
+              <w:right w:type="dxa" w:w="70"/>
+            </w:tcMar>
+            <w:vAlign w:val="center"/>
+          </w:tcPr>
+          <w:p>
+            <w:pPr>
+              <w:spacing w:after="0" w:line="240"/>
+              <w:jc w:val="center"/>
+            </w:pPr>
+            <w:r>
+              <w:rPr>
+                <w:rFonts w:ascii="Times New Roman" w:cs="Times New Roman" w:eastAsia="Times New Roman" w:hAnsi="Times New Roman"/>
+                <w:b/>
+                <w:bCs/>
+                <w:color w:val="000000"/>
+                <w:sz w:val="20"/>
+                <w:szCs w:val="20"/>
+              </w:rPr>
+              <w:t xml:space="preserve">p FDR</w:t>
+            </w:r>
+          </w:p>
+        </w:tc>
+        <w:tc>
+          <w:tcPr>
+            <w:tcW w:type="dxa" w:w="1400"/>
+            <w:tcBorders>
+              <w:top w:val="single" w:color="000000" w:sz="6"/>
+              <w:left w:val="none"/>
+              <w:bottom w:val="single" w:color="000000" w:sz="6"/>
+              <w:right w:val="none"/>
+            </w:tcBorders>
+            <w:tcMar>
+              <w:top w:type="dxa" w:w="40"/>
+              <w:left w:type="dxa" w:w="70"/>
+              <w:bottom w:type="dxa" w:w="40"/>
+              <w:right w:type="dxa" w:w="70"/>
+            </w:tcMar>
+            <w:vAlign w:val="center"/>
+          </w:tcPr>
+          <w:p>
+            <w:pPr>
+              <w:spacing w:after="0" w:line="240"/>
+              <w:jc w:val="center"/>
+            </w:pPr>
+            <w:r>
+              <w:rPr>
+                <w:rFonts w:ascii="Times New Roman" w:cs="Times New Roman" w:eastAsia="Times New Roman" w:hAnsi="Times New Roman"/>
+                <w:b/>
+                <w:bCs/>
+                <w:color w:val="000000"/>
+                <w:sz w:val="20"/>
+                <w:szCs w:val="20"/>
+              </w:rPr>
+              <w:t xml:space="preserve">p Bonf.</w:t>
+            </w:r>
+          </w:p>
+        </w:tc>
+        <w:tc>
+          <w:tcPr>
+            <w:tcW w:type="dxa" w:w="1705"/>
+            <w:tcBorders>
+              <w:top w:val="single" w:color="000000" w:sz="6"/>
+              <w:left w:val="none"/>
+              <w:bottom w:val="single" w:color="000000" w:sz="6"/>
+              <w:right w:val="none"/>
+            </w:tcBorders>
+            <w:tcMar>
+              <w:top w:type="dxa" w:w="40"/>
+              <w:left w:type="dxa" w:w="70"/>
+              <w:bottom w:type="dxa" w:w="40"/>
+              <w:right w:type="dxa" w:w="70"/>
+            </w:tcMar>
+            <w:vAlign w:val="center"/>
+          </w:tcPr>
+          <w:p>
+            <w:pPr>
+              <w:spacing w:after="0" w:line="240"/>
+              <w:jc w:val="center"/>
+            </w:pPr>
+            <w:r>
+              <w:rPr>
+                <w:rFonts w:ascii="Times New Roman" w:cs="Times New Roman" w:eastAsia="Times New Roman" w:hAnsi="Times New Roman"/>
+                <w:b/>
+                <w:bCs/>
+                <w:color w:val="000000"/>
+                <w:sz w:val="20"/>
+                <w:szCs w:val="20"/>
+              </w:rPr>
+              <w:t xml:space="preserve">Sobrevive</w:t>
+            </w:r>
+          </w:p>
+        </w:tc>
+      </w:tr>
+      <w:tr>
+        <w:tc>
+          <w:tcPr>
+            <w:tcW w:type="dxa" w:w="1700"/>
+            <w:tcBorders>
+              <w:top w:val="none"/>
+              <w:left w:val="none"/>
+              <w:bottom w:val="none"/>
+              <w:right w:val="none"/>
+            </w:tcBorders>
+            <w:tcMar>
+              <w:top w:type="dxa" w:w="30"/>
+              <w:left w:type="dxa" w:w="70"/>
+              <w:bottom w:type="dxa" w:w="30"/>
+              <w:right w:type="dxa" w:w="70"/>
+            </w:tcMar>
+            <w:vAlign w:val="center"/>
+          </w:tcPr>
+          <w:p>
+            <w:pPr>
+              <w:spacing w:after="0" w:line="240"/>
+              <w:jc w:val="left"/>
+            </w:pPr>
+            <w:r>
+              <w:rPr>
+                <w:rFonts w:ascii="Times New Roman" w:cs="Times New Roman" w:eastAsia="Times New Roman" w:hAnsi="Times New Roman"/>
+                <w:color w:val="000000"/>
+                <w:sz w:val="20"/>
+                <w:szCs w:val="20"/>
+              </w:rPr>
+              <w:t xml:space="preserve">Wilcoxon</w:t>
+            </w:r>
+          </w:p>
+        </w:tc>
+        <w:tc>
+          <w:tcPr>
+            <w:tcW w:type="dxa" w:w="1900"/>
+            <w:tcBorders>
+              <w:top w:val="none"/>
+              <w:left w:val="none"/>
+              <w:bottom w:val="none"/>
+              <w:right w:val="none"/>
+            </w:tcBorders>
+            <w:tcMar>
+              <w:top w:type="dxa" w:w="30"/>
+              <w:left w:type="dxa" w:w="70"/>
+              <w:bottom w:type="dxa" w:w="30"/>
+              <w:right w:type="dxa" w:w="70"/>
+            </w:tcMar>
+            <w:vAlign w:val="center"/>
+          </w:tcPr>
+          <w:p>
+            <w:pPr>
+              <w:spacing w:after="0" w:line="240"/>
+              <w:jc w:val="left"/>
+            </w:pPr>
+            <w:r>
+              <w:rPr>
+                <w:rFonts w:ascii="Times New Roman" w:cs="Times New Roman" w:eastAsia="Times New Roman" w:hAnsi="Times New Roman"/>
+                <w:b/>
+                <w:bCs/>
+                <w:color w:val="000000"/>
+                <w:sz w:val="20"/>
+                <w:szCs w:val="20"/>
+              </w:rPr>
+              <w:t xml:space="preserve">Vigor</w:t>
+            </w:r>
+          </w:p>
+        </w:tc>
+        <w:tc>
+          <w:tcPr>
+            <w:tcW w:type="dxa" w:w="1400"/>
+            <w:tcBorders>
+              <w:top w:val="none"/>
+              <w:left w:val="none"/>
+              <w:bottom w:val="none"/>
+              <w:right w:val="none"/>
+            </w:tcBorders>
+            <w:tcMar>
+              <w:top w:type="dxa" w:w="30"/>
+              <w:left w:type="dxa" w:w="70"/>
+              <w:bottom w:type="dxa" w:w="30"/>
+              <w:right w:type="dxa" w:w="70"/>
+            </w:tcMar>
+            <w:vAlign w:val="center"/>
+          </w:tcPr>
+          <w:p>
+            <w:pPr>
+              <w:spacing w:after="0" w:line="240"/>
+              <w:jc w:val="center"/>
+            </w:pPr>
+            <w:r>
+              <w:rPr>
+                <w:rFonts w:ascii="Times New Roman" w:cs="Times New Roman" w:eastAsia="Times New Roman" w:hAnsi="Times New Roman"/>
+                <w:color w:val="000000"/>
+                <w:sz w:val="20"/>
+                <w:szCs w:val="20"/>
+              </w:rPr>
+              <w:t xml:space="preserve">0,001</w:t>
+            </w:r>
+          </w:p>
+        </w:tc>
+        <w:tc>
+          <w:tcPr>
+            <w:tcW w:type="dxa" w:w="1400"/>
+            <w:tcBorders>
+              <w:top w:val="none"/>
+              <w:left w:val="none"/>
+              <w:bottom w:val="none"/>
+              <w:right w:val="none"/>
+            </w:tcBorders>
+            <w:tcMar>
+              <w:top w:type="dxa" w:w="30"/>
+              <w:left w:type="dxa" w:w="70"/>
+              <w:bottom w:type="dxa" w:w="30"/>
+              <w:right w:type="dxa" w:w="70"/>
+            </w:tcMar>
+            <w:vAlign w:val="center"/>
+          </w:tcPr>
+          <w:p>
+            <w:pPr>
+              <w:spacing w:after="0" w:line="240"/>
+              <w:jc w:val="center"/>
+            </w:pPr>
+            <w:r>
+              <w:rPr>
+                <w:rFonts w:ascii="Times New Roman" w:cs="Times New Roman" w:eastAsia="Times New Roman" w:hAnsi="Times New Roman"/>
+                <w:color w:val="1b7a3d"/>
+                <w:sz w:val="20"/>
+                <w:szCs w:val="20"/>
+              </w:rPr>
+              <w:t xml:space="preserve">0,007</w:t>
+            </w:r>
+          </w:p>
+        </w:tc>
+        <w:tc>
+          <w:tcPr>
+            <w:tcW w:type="dxa" w:w="1400"/>
+            <w:tcBorders>
+              <w:top w:val="none"/>
+              <w:left w:val="none"/>
+              <w:bottom w:val="none"/>
+              <w:right w:val="none"/>
+            </w:tcBorders>
+            <w:tcMar>
+              <w:top w:type="dxa" w:w="30"/>
+              <w:left w:type="dxa" w:w="70"/>
+              <w:bottom w:type="dxa" w:w="30"/>
+              <w:right w:type="dxa" w:w="70"/>
+            </w:tcMar>
+            <w:vAlign w:val="center"/>
+          </w:tcPr>
+          <w:p>
+            <w:pPr>
+              <w:spacing w:after="0" w:line="240"/>
+              <w:jc w:val="center"/>
+            </w:pPr>
+            <w:r>
+              <w:rPr>
+                <w:rFonts w:ascii="Times New Roman" w:cs="Times New Roman" w:eastAsia="Times New Roman" w:hAnsi="Times New Roman"/>
+                <w:color w:val="1b7a3d"/>
+                <w:sz w:val="20"/>
+                <w:szCs w:val="20"/>
+              </w:rPr>
+              <w:t xml:space="preserve">0,007</w:t>
+            </w:r>
+          </w:p>
+        </w:tc>
+        <w:tc>
+          <w:tcPr>
+            <w:tcW w:type="dxa" w:w="1705"/>
+            <w:tcBorders>
+              <w:top w:val="none"/>
+              <w:left w:val="none"/>
+              <w:bottom w:val="none"/>
+              <w:right w:val="none"/>
+            </w:tcBorders>
+            <w:tcMar>
+              <w:top w:type="dxa" w:w="30"/>
+              <w:left w:type="dxa" w:w="70"/>
+              <w:bottom w:type="dxa" w:w="30"/>
+              <w:right w:type="dxa" w:w="70"/>
+            </w:tcMar>
+            <w:vAlign w:val="center"/>
+          </w:tcPr>
+          <w:p>
+            <w:pPr>
+              <w:spacing w:after="0" w:line="240"/>
+              <w:jc w:val="center"/>
+            </w:pPr>
+            <w:r>
+              <w:rPr>
+                <w:rFonts w:ascii="Times New Roman" w:cs="Times New Roman" w:eastAsia="Times New Roman" w:hAnsi="Times New Roman"/>
+                <w:b/>
+                <w:bCs/>
+                <w:color w:val="1b7a3d"/>
+                <w:sz w:val="20"/>
+                <w:szCs w:val="20"/>
+              </w:rPr>
+              <w:t xml:space="preserve">Bonferroni</w:t>
+            </w:r>
+          </w:p>
+        </w:tc>
+      </w:tr>
+      <w:tr>
+        <w:tc>
+          <w:tcPr>
+            <w:tcW w:type="dxa" w:w="1700"/>
+            <w:tcBorders>
+              <w:top w:val="none"/>
+              <w:left w:val="none"/>
+              <w:bottom w:val="none"/>
+              <w:right w:val="none"/>
+            </w:tcBorders>
+            <w:tcMar>
+              <w:top w:type="dxa" w:w="30"/>
+              <w:left w:type="dxa" w:w="70"/>
+              <w:bottom w:type="dxa" w:w="30"/>
+              <w:right w:type="dxa" w:w="70"/>
+            </w:tcMar>
+            <w:vAlign w:val="center"/>
+          </w:tcPr>
+          <w:p>
+            <w:pPr>
+              <w:spacing w:after="0" w:line="240"/>
+              <w:jc w:val="left"/>
+            </w:pPr>
+            <w:r>
+              <w:rPr>
+                <w:rFonts w:ascii="Times New Roman" w:cs="Times New Roman" w:eastAsia="Times New Roman" w:hAnsi="Times New Roman"/>
+                <w:color w:val="000000"/>
+                <w:sz w:val="20"/>
+                <w:szCs w:val="20"/>
+              </w:rPr>
+              <w:t xml:space="preserve">Friedman</w:t>
+            </w:r>
+          </w:p>
+        </w:tc>
+        <w:tc>
+          <w:tcPr>
+            <w:tcW w:type="dxa" w:w="1900"/>
+            <w:tcBorders>
+              <w:top w:val="none"/>
+              <w:left w:val="none"/>
+              <w:bottom w:val="none"/>
+              <w:right w:val="none"/>
+            </w:tcBorders>
+            <w:tcMar>
+              <w:top w:type="dxa" w:w="30"/>
+              <w:left w:type="dxa" w:w="70"/>
+              <w:bottom w:type="dxa" w:w="30"/>
+              <w:right w:type="dxa" w:w="70"/>
+            </w:tcMar>
+            <w:vAlign w:val="center"/>
+          </w:tcPr>
+          <w:p>
+            <w:pPr>
+              <w:spacing w:after="0" w:line="240"/>
+              <w:jc w:val="left"/>
+            </w:pPr>
+            <w:r>
+              <w:rPr>
+                <w:rFonts w:ascii="Times New Roman" w:cs="Times New Roman" w:eastAsia="Times New Roman" w:hAnsi="Times New Roman"/>
+                <w:b/>
+                <w:bCs/>
+                <w:color w:val="000000"/>
+                <w:sz w:val="20"/>
+                <w:szCs w:val="20"/>
+              </w:rPr>
+              <w:t xml:space="preserve">Vigor</w:t>
+            </w:r>
+          </w:p>
+        </w:tc>
+        <w:tc>
+          <w:tcPr>
+            <w:tcW w:type="dxa" w:w="1400"/>
+            <w:tcBorders>
+              <w:top w:val="none"/>
+              <w:left w:val="none"/>
+              <w:bottom w:val="none"/>
+              <w:right w:val="none"/>
+            </w:tcBorders>
+            <w:tcMar>
+              <w:top w:type="dxa" w:w="30"/>
+              <w:left w:type="dxa" w:w="70"/>
+              <w:bottom w:type="dxa" w:w="30"/>
+              <w:right w:type="dxa" w:w="70"/>
+            </w:tcMar>
+            <w:vAlign w:val="center"/>
+          </w:tcPr>
+          <w:p>
+            <w:pPr>
+              <w:spacing w:after="0" w:line="240"/>
+              <w:jc w:val="center"/>
+            </w:pPr>
+            <w:r>
+              <w:rPr>
+                <w:rFonts w:ascii="Times New Roman" w:cs="Times New Roman" w:eastAsia="Times New Roman" w:hAnsi="Times New Roman"/>
+                <w:color w:val="000000"/>
+                <w:sz w:val="20"/>
+                <w:szCs w:val="20"/>
+              </w:rPr>
+              <w:t xml:space="preserve">0,022</w:t>
+            </w:r>
+          </w:p>
+        </w:tc>
+        <w:tc>
+          <w:tcPr>
+            <w:tcW w:type="dxa" w:w="1400"/>
+            <w:tcBorders>
+              <w:top w:val="none"/>
+              <w:left w:val="none"/>
+              <w:bottom w:val="none"/>
+              <w:right w:val="none"/>
+            </w:tcBorders>
+            <w:tcMar>
+              <w:top w:type="dxa" w:w="30"/>
+              <w:left w:type="dxa" w:w="70"/>
+              <w:bottom w:type="dxa" w:w="30"/>
+              <w:right w:type="dxa" w:w="70"/>
+            </w:tcMar>
+            <w:vAlign w:val="center"/>
+          </w:tcPr>
+          <w:p>
+            <w:pPr>
+              <w:spacing w:after="0" w:line="240"/>
+              <w:jc w:val="center"/>
+            </w:pPr>
+            <w:r>
+              <w:rPr>
+                <w:rFonts w:ascii="Times New Roman" w:cs="Times New Roman" w:eastAsia="Times New Roman" w:hAnsi="Times New Roman"/>
+                <w:color w:val="3f3f3f"/>
+                <w:sz w:val="20"/>
+                <w:szCs w:val="20"/>
+              </w:rPr>
+              <w:t xml:space="preserve">0,070</w:t>
+            </w:r>
+          </w:p>
+        </w:tc>
+        <w:tc>
+          <w:tcPr>
+            <w:tcW w:type="dxa" w:w="1400"/>
+            <w:tcBorders>
+              <w:top w:val="none"/>
+              <w:left w:val="none"/>
+              <w:bottom w:val="none"/>
+              <w:right w:val="none"/>
+            </w:tcBorders>
+            <w:tcMar>
+              <w:top w:type="dxa" w:w="30"/>
+              <w:left w:type="dxa" w:w="70"/>
+              <w:bottom w:type="dxa" w:w="30"/>
+              <w:right w:type="dxa" w:w="70"/>
+            </w:tcMar>
+            <w:vAlign w:val="center"/>
+          </w:tcPr>
+          <w:p>
+            <w:pPr>
+              <w:spacing w:after="0" w:line="240"/>
+              <w:jc w:val="center"/>
+            </w:pPr>
+            <w:r>
+              <w:rPr>
+                <w:rFonts w:ascii="Times New Roman" w:cs="Times New Roman" w:eastAsia="Times New Roman" w:hAnsi="Times New Roman"/>
+                <w:color w:val="3f3f3f"/>
+                <w:sz w:val="20"/>
+                <w:szCs w:val="20"/>
+              </w:rPr>
+              <w:t xml:space="preserve">0,154</w:t>
+            </w:r>
+          </w:p>
+        </w:tc>
+        <w:tc>
+          <w:tcPr>
+            <w:tcW w:type="dxa" w:w="1705"/>
+            <w:tcBorders>
+              <w:top w:val="none"/>
+              <w:left w:val="none"/>
+              <w:bottom w:val="none"/>
+              <w:right w:val="none"/>
+            </w:tcBorders>
+            <w:tcMar>
+              <w:top w:type="dxa" w:w="30"/>
+              <w:left w:type="dxa" w:w="70"/>
+              <w:bottom w:type="dxa" w:w="30"/>
+              <w:right w:type="dxa" w:w="70"/>
+            </w:tcMar>
+            <w:vAlign w:val="center"/>
+          </w:tcPr>
+          <w:p>
+            <w:pPr>
+              <w:spacing w:after="0" w:line="240"/>
+              <w:jc w:val="center"/>
+            </w:pPr>
+            <w:r>
+              <w:rPr>
+                <w:rFonts w:ascii="Times New Roman" w:cs="Times New Roman" w:eastAsia="Times New Roman" w:hAnsi="Times New Roman"/>
+                <w:b w:val="false"/>
+                <w:bCs w:val="false"/>
+                <w:color w:val="3f3f3f"/>
+                <w:sz w:val="20"/>
+                <w:szCs w:val="20"/>
+              </w:rPr>
+              <w:t xml:space="preserve">não</w:t>
+            </w:r>
+          </w:p>
+        </w:tc>
+      </w:tr>
+      <w:tr>
+        <w:tc>
+          <w:tcPr>
+            <w:tcW w:type="dxa" w:w="1700"/>
+            <w:tcBorders>
+              <w:top w:val="none"/>
+              <w:left w:val="none"/>
+              <w:bottom w:val="none"/>
+              <w:right w:val="none"/>
+            </w:tcBorders>
+            <w:tcMar>
+              <w:top w:type="dxa" w:w="30"/>
+              <w:left w:type="dxa" w:w="70"/>
+              <w:bottom w:type="dxa" w:w="30"/>
+              <w:right w:type="dxa" w:w="70"/>
+            </w:tcMar>
+            <w:vAlign w:val="center"/>
+          </w:tcPr>
+          <w:p>
+            <w:pPr>
+              <w:spacing w:after="0" w:line="240"/>
+              <w:jc w:val="left"/>
+            </w:pPr>
+            <w:r>
+              <w:rPr>
+                <w:rFonts w:ascii="Times New Roman" w:cs="Times New Roman" w:eastAsia="Times New Roman" w:hAnsi="Times New Roman"/>
+                <w:color w:val="000000"/>
+                <w:sz w:val="20"/>
+                <w:szCs w:val="20"/>
+              </w:rPr>
+              <w:t xml:space="preserve">Wilcoxon</w:t>
+            </w:r>
+          </w:p>
+        </w:tc>
+        <w:tc>
+          <w:tcPr>
+            <w:tcW w:type="dxa" w:w="1900"/>
+            <w:tcBorders>
+              <w:top w:val="none"/>
+              <w:left w:val="none"/>
+              <w:bottom w:val="none"/>
+              <w:right w:val="none"/>
+            </w:tcBorders>
+            <w:tcMar>
+              <w:top w:type="dxa" w:w="30"/>
+              <w:left w:type="dxa" w:w="70"/>
+              <w:bottom w:type="dxa" w:w="30"/>
+              <w:right w:type="dxa" w:w="70"/>
+            </w:tcMar>
+            <w:vAlign w:val="center"/>
+          </w:tcPr>
+          <w:p>
+            <w:pPr>
+              <w:spacing w:after="0" w:line="240"/>
+              <w:jc w:val="left"/>
+            </w:pPr>
+            <w:r>
+              <w:rPr>
+                <w:rFonts w:ascii="Times New Roman" w:cs="Times New Roman" w:eastAsia="Times New Roman" w:hAnsi="Times New Roman"/>
+                <w:b/>
+                <w:bCs/>
+                <w:color w:val="000000"/>
+                <w:sz w:val="20"/>
+                <w:szCs w:val="20"/>
+              </w:rPr>
+              <w:t xml:space="preserve">Fadiga</w:t>
+            </w:r>
+          </w:p>
+        </w:tc>
+        <w:tc>
+          <w:tcPr>
+            <w:tcW w:type="dxa" w:w="1400"/>
+            <w:tcBorders>
+              <w:top w:val="none"/>
+              <w:left w:val="none"/>
+              <w:bottom w:val="none"/>
+              <w:right w:val="none"/>
+            </w:tcBorders>
+            <w:tcMar>
+              <w:top w:type="dxa" w:w="30"/>
+              <w:left w:type="dxa" w:w="70"/>
+              <w:bottom w:type="dxa" w:w="30"/>
+              <w:right w:type="dxa" w:w="70"/>
+            </w:tcMar>
+            <w:vAlign w:val="center"/>
+          </w:tcPr>
+          <w:p>
+            <w:pPr>
+              <w:spacing w:after="0" w:line="240"/>
+              <w:jc w:val="center"/>
+            </w:pPr>
+            <w:r>
+              <w:rPr>
+                <w:rFonts w:ascii="Times New Roman" w:cs="Times New Roman" w:eastAsia="Times New Roman" w:hAnsi="Times New Roman"/>
+                <w:color w:val="000000"/>
+                <w:sz w:val="20"/>
+                <w:szCs w:val="20"/>
+              </w:rPr>
+              <w:t xml:space="preserve">0,004</w:t>
+            </w:r>
+          </w:p>
+        </w:tc>
+        <w:tc>
+          <w:tcPr>
+            <w:tcW w:type="dxa" w:w="1400"/>
+            <w:tcBorders>
+              <w:top w:val="none"/>
+              <w:left w:val="none"/>
+              <w:bottom w:val="none"/>
+              <w:right w:val="none"/>
+            </w:tcBorders>
+            <w:tcMar>
+              <w:top w:type="dxa" w:w="30"/>
+              <w:left w:type="dxa" w:w="70"/>
+              <w:bottom w:type="dxa" w:w="30"/>
+              <w:right w:type="dxa" w:w="70"/>
+            </w:tcMar>
+            <w:vAlign w:val="center"/>
+          </w:tcPr>
+          <w:p>
+            <w:pPr>
+              <w:spacing w:after="0" w:line="240"/>
+              <w:jc w:val="center"/>
+            </w:pPr>
+            <w:r>
+              <w:rPr>
+                <w:rFonts w:ascii="Times New Roman" w:cs="Times New Roman" w:eastAsia="Times New Roman" w:hAnsi="Times New Roman"/>
+                <w:color w:val="1b7a3d"/>
+                <w:sz w:val="20"/>
+                <w:szCs w:val="20"/>
+              </w:rPr>
+              <w:t xml:space="preserve">0,014</w:t>
+            </w:r>
+          </w:p>
+        </w:tc>
+        <w:tc>
+          <w:tcPr>
+            <w:tcW w:type="dxa" w:w="1400"/>
+            <w:tcBorders>
+              <w:top w:val="none"/>
+              <w:left w:val="none"/>
+              <w:bottom w:val="none"/>
+              <w:right w:val="none"/>
+            </w:tcBorders>
+            <w:tcMar>
+              <w:top w:type="dxa" w:w="30"/>
+              <w:left w:type="dxa" w:w="70"/>
+              <w:bottom w:type="dxa" w:w="30"/>
+              <w:right w:type="dxa" w:w="70"/>
+            </w:tcMar>
+            <w:vAlign w:val="center"/>
+          </w:tcPr>
+          <w:p>
+            <w:pPr>
+              <w:spacing w:after="0" w:line="240"/>
+              <w:jc w:val="center"/>
+            </w:pPr>
+            <w:r>
+              <w:rPr>
+                <w:rFonts w:ascii="Times New Roman" w:cs="Times New Roman" w:eastAsia="Times New Roman" w:hAnsi="Times New Roman"/>
+                <w:color w:val="1b7a3d"/>
+                <w:sz w:val="20"/>
+                <w:szCs w:val="20"/>
+              </w:rPr>
+              <w:t xml:space="preserve">0,028</w:t>
+            </w:r>
+          </w:p>
+        </w:tc>
+        <w:tc>
+          <w:tcPr>
+            <w:tcW w:type="dxa" w:w="1705"/>
+            <w:tcBorders>
+              <w:top w:val="none"/>
+              <w:left w:val="none"/>
+              <w:bottom w:val="none"/>
+              <w:right w:val="none"/>
+            </w:tcBorders>
+            <w:tcMar>
+              <w:top w:type="dxa" w:w="30"/>
+              <w:left w:type="dxa" w:w="70"/>
+              <w:bottom w:type="dxa" w:w="30"/>
+              <w:right w:type="dxa" w:w="70"/>
+            </w:tcMar>
+            <w:vAlign w:val="center"/>
+          </w:tcPr>
+          <w:p>
+            <w:pPr>
+              <w:spacing w:after="0" w:line="240"/>
+              <w:jc w:val="center"/>
+            </w:pPr>
+            <w:r>
+              <w:rPr>
+                <w:rFonts w:ascii="Times New Roman" w:cs="Times New Roman" w:eastAsia="Times New Roman" w:hAnsi="Times New Roman"/>
+                <w:b/>
+                <w:bCs/>
+                <w:color w:val="1b7a3d"/>
+                <w:sz w:val="20"/>
+                <w:szCs w:val="20"/>
+              </w:rPr>
+              <w:t xml:space="preserve">Bonferroni</w:t>
+            </w:r>
+          </w:p>
+        </w:tc>
+      </w:tr>
+      <w:tr>
+        <w:tc>
+          <w:tcPr>
+            <w:tcW w:type="dxa" w:w="1700"/>
+            <w:tcBorders>
+              <w:top w:val="none"/>
+              <w:left w:val="none"/>
+              <w:bottom w:val="none"/>
+              <w:right w:val="none"/>
+            </w:tcBorders>
+            <w:tcMar>
+              <w:top w:type="dxa" w:w="30"/>
+              <w:left w:type="dxa" w:w="70"/>
+              <w:bottom w:type="dxa" w:w="30"/>
+              <w:right w:type="dxa" w:w="70"/>
+            </w:tcMar>
+            <w:vAlign w:val="center"/>
+          </w:tcPr>
+          <w:p>
+            <w:pPr>
+              <w:spacing w:after="0" w:line="240"/>
+              <w:jc w:val="left"/>
+            </w:pPr>
+            <w:r>
+              <w:rPr>
+                <w:rFonts w:ascii="Times New Roman" w:cs="Times New Roman" w:eastAsia="Times New Roman" w:hAnsi="Times New Roman"/>
+                <w:color w:val="000000"/>
+                <w:sz w:val="20"/>
+                <w:szCs w:val="20"/>
+              </w:rPr>
+              <w:t xml:space="preserve">Friedman</w:t>
+            </w:r>
+          </w:p>
+        </w:tc>
+        <w:tc>
+          <w:tcPr>
+            <w:tcW w:type="dxa" w:w="1900"/>
+            <w:tcBorders>
+              <w:top w:val="none"/>
+              <w:left w:val="none"/>
+              <w:bottom w:val="none"/>
+              <w:right w:val="none"/>
+            </w:tcBorders>
+            <w:tcMar>
+              <w:top w:type="dxa" w:w="30"/>
+              <w:left w:type="dxa" w:w="70"/>
+              <w:bottom w:type="dxa" w:w="30"/>
+              <w:right w:type="dxa" w:w="70"/>
+            </w:tcMar>
+            <w:vAlign w:val="center"/>
+          </w:tcPr>
+          <w:p>
+            <w:pPr>
+              <w:spacing w:after="0" w:line="240"/>
+              <w:jc w:val="left"/>
+            </w:pPr>
+            <w:r>
+              <w:rPr>
+                <w:rFonts w:ascii="Times New Roman" w:cs="Times New Roman" w:eastAsia="Times New Roman" w:hAnsi="Times New Roman"/>
+                <w:b/>
+                <w:bCs/>
+                <w:color w:val="000000"/>
+                <w:sz w:val="20"/>
+                <w:szCs w:val="20"/>
+              </w:rPr>
+              <w:t xml:space="preserve">Fadiga</w:t>
+            </w:r>
+          </w:p>
+        </w:tc>
+        <w:tc>
+          <w:tcPr>
+            <w:tcW w:type="dxa" w:w="1400"/>
+            <w:tcBorders>
+              <w:top w:val="none"/>
+              <w:left w:val="none"/>
+              <w:bottom w:val="none"/>
+              <w:right w:val="none"/>
+            </w:tcBorders>
+            <w:tcMar>
+              <w:top w:type="dxa" w:w="30"/>
+              <w:left w:type="dxa" w:w="70"/>
+              <w:bottom w:type="dxa" w:w="30"/>
+              <w:right w:type="dxa" w:w="70"/>
+            </w:tcMar>
+            <w:vAlign w:val="center"/>
+          </w:tcPr>
+          <w:p>
+            <w:pPr>
+              <w:spacing w:after="0" w:line="240"/>
+              <w:jc w:val="center"/>
+            </w:pPr>
+            <w:r>
+              <w:rPr>
+                <w:rFonts w:ascii="Times New Roman" w:cs="Times New Roman" w:eastAsia="Times New Roman" w:hAnsi="Times New Roman"/>
+                <w:color w:val="000000"/>
+                <w:sz w:val="20"/>
+                <w:szCs w:val="20"/>
+              </w:rPr>
+              <w:t xml:space="preserve">0,040</w:t>
+            </w:r>
+          </w:p>
+        </w:tc>
+        <w:tc>
+          <w:tcPr>
+            <w:tcW w:type="dxa" w:w="1400"/>
+            <w:tcBorders>
+              <w:top w:val="none"/>
+              <w:left w:val="none"/>
+              <w:bottom w:val="none"/>
+              <w:right w:val="none"/>
+            </w:tcBorders>
+            <w:tcMar>
+              <w:top w:type="dxa" w:w="30"/>
+              <w:left w:type="dxa" w:w="70"/>
+              <w:bottom w:type="dxa" w:w="30"/>
+              <w:right w:type="dxa" w:w="70"/>
+            </w:tcMar>
+            <w:vAlign w:val="center"/>
+          </w:tcPr>
+          <w:p>
+            <w:pPr>
+              <w:spacing w:after="0" w:line="240"/>
+              <w:jc w:val="center"/>
+            </w:pPr>
+            <w:r>
+              <w:rPr>
+                <w:rFonts w:ascii="Times New Roman" w:cs="Times New Roman" w:eastAsia="Times New Roman" w:hAnsi="Times New Roman"/>
+                <w:color w:val="3f3f3f"/>
+                <w:sz w:val="20"/>
+                <w:szCs w:val="20"/>
+              </w:rPr>
+              <w:t xml:space="preserve">0,070</w:t>
+            </w:r>
+          </w:p>
+        </w:tc>
+        <w:tc>
+          <w:tcPr>
+            <w:tcW w:type="dxa" w:w="1400"/>
+            <w:tcBorders>
+              <w:top w:val="none"/>
+              <w:left w:val="none"/>
+              <w:bottom w:val="none"/>
+              <w:right w:val="none"/>
+            </w:tcBorders>
+            <w:tcMar>
+              <w:top w:type="dxa" w:w="30"/>
+              <w:left w:type="dxa" w:w="70"/>
+              <w:bottom w:type="dxa" w:w="30"/>
+              <w:right w:type="dxa" w:w="70"/>
+            </w:tcMar>
+            <w:vAlign w:val="center"/>
+          </w:tcPr>
+          <w:p>
+            <w:pPr>
+              <w:spacing w:after="0" w:line="240"/>
+              <w:jc w:val="center"/>
+            </w:pPr>
+            <w:r>
+              <w:rPr>
+                <w:rFonts w:ascii="Times New Roman" w:cs="Times New Roman" w:eastAsia="Times New Roman" w:hAnsi="Times New Roman"/>
+                <w:color w:val="3f3f3f"/>
+                <w:sz w:val="20"/>
+                <w:szCs w:val="20"/>
+              </w:rPr>
+              <w:t xml:space="preserve">0,280</w:t>
+            </w:r>
+          </w:p>
+        </w:tc>
+        <w:tc>
+          <w:tcPr>
+            <w:tcW w:type="dxa" w:w="1705"/>
+            <w:tcBorders>
+              <w:top w:val="none"/>
+              <w:left w:val="none"/>
+              <w:bottom w:val="none"/>
+              <w:right w:val="none"/>
+            </w:tcBorders>
+            <w:tcMar>
+              <w:top w:type="dxa" w:w="30"/>
+              <w:left w:type="dxa" w:w="70"/>
+              <w:bottom w:type="dxa" w:w="30"/>
+              <w:right w:type="dxa" w:w="70"/>
+            </w:tcMar>
+            <w:vAlign w:val="center"/>
+          </w:tcPr>
+          <w:p>
+            <w:pPr>
+              <w:spacing w:after="0" w:line="240"/>
+              <w:jc w:val="center"/>
+            </w:pPr>
+            <w:r>
+              <w:rPr>
+                <w:rFonts w:ascii="Times New Roman" w:cs="Times New Roman" w:eastAsia="Times New Roman" w:hAnsi="Times New Roman"/>
+                <w:b w:val="false"/>
+                <w:bCs w:val="false"/>
+                <w:color w:val="3f3f3f"/>
+                <w:sz w:val="20"/>
+                <w:szCs w:val="20"/>
+              </w:rPr>
+              <w:t xml:space="preserve">não</w:t>
+            </w:r>
+          </w:p>
+        </w:tc>
+      </w:tr>
+      <w:tr>
+        <w:tc>
+          <w:tcPr>
+            <w:tcW w:type="dxa" w:w="1700"/>
+            <w:tcBorders>
+              <w:top w:val="none"/>
+              <w:left w:val="none"/>
+              <w:bottom w:val="none"/>
+              <w:right w:val="none"/>
+            </w:tcBorders>
+            <w:tcMar>
+              <w:top w:type="dxa" w:w="30"/>
+              <w:left w:type="dxa" w:w="70"/>
+              <w:bottom w:type="dxa" w:w="30"/>
+              <w:right w:type="dxa" w:w="70"/>
+            </w:tcMar>
+            <w:vAlign w:val="center"/>
+          </w:tcPr>
+          <w:p>
+            <w:pPr>
+              <w:spacing w:after="0" w:line="240"/>
+              <w:jc w:val="left"/>
+            </w:pPr>
+            <w:r>
+              <w:rPr>
+                <w:rFonts w:ascii="Times New Roman" w:cs="Times New Roman" w:eastAsia="Times New Roman" w:hAnsi="Times New Roman"/>
+                <w:color w:val="000000"/>
+                <w:sz w:val="20"/>
+                <w:szCs w:val="20"/>
+              </w:rPr>
+              <w:t xml:space="preserve">Wilcoxon</w:t>
+            </w:r>
+          </w:p>
+        </w:tc>
+        <w:tc>
+          <w:tcPr>
+            <w:tcW w:type="dxa" w:w="1900"/>
+            <w:tcBorders>
+              <w:top w:val="none"/>
+              <w:left w:val="none"/>
+              <w:bottom w:val="none"/>
+              <w:right w:val="none"/>
+            </w:tcBorders>
+            <w:tcMar>
+              <w:top w:type="dxa" w:w="30"/>
+              <w:left w:type="dxa" w:w="70"/>
+              <w:bottom w:type="dxa" w:w="30"/>
+              <w:right w:type="dxa" w:w="70"/>
+            </w:tcMar>
+            <w:vAlign w:val="center"/>
+          </w:tcPr>
+          <w:p>
+            <w:pPr>
+              <w:spacing w:after="0" w:line="240"/>
+              <w:jc w:val="left"/>
+            </w:pPr>
+            <w:r>
+              <w:rPr>
+                <w:rFonts w:ascii="Times New Roman" w:cs="Times New Roman" w:eastAsia="Times New Roman" w:hAnsi="Times New Roman"/>
+                <w:b/>
+                <w:bCs/>
+                <w:color w:val="000000"/>
+                <w:sz w:val="20"/>
+                <w:szCs w:val="20"/>
+              </w:rPr>
+              <w:t xml:space="preserve">Tensão</w:t>
+            </w:r>
+          </w:p>
+        </w:tc>
+        <w:tc>
+          <w:tcPr>
+            <w:tcW w:type="dxa" w:w="1400"/>
+            <w:tcBorders>
+              <w:top w:val="none"/>
+              <w:left w:val="none"/>
+              <w:bottom w:val="none"/>
+              <w:right w:val="none"/>
+            </w:tcBorders>
+            <w:tcMar>
+              <w:top w:type="dxa" w:w="30"/>
+              <w:left w:type="dxa" w:w="70"/>
+              <w:bottom w:type="dxa" w:w="30"/>
+              <w:right w:type="dxa" w:w="70"/>
+            </w:tcMar>
+            <w:vAlign w:val="center"/>
+          </w:tcPr>
+          <w:p>
+            <w:pPr>
+              <w:spacing w:after="0" w:line="240"/>
+              <w:jc w:val="center"/>
+            </w:pPr>
+            <w:r>
+              <w:rPr>
+                <w:rFonts w:ascii="Times New Roman" w:cs="Times New Roman" w:eastAsia="Times New Roman" w:hAnsi="Times New Roman"/>
+                <w:color w:val="000000"/>
+                <w:sz w:val="20"/>
+                <w:szCs w:val="20"/>
+              </w:rPr>
+              <w:t xml:space="preserve">0,011</w:t>
+            </w:r>
+          </w:p>
+        </w:tc>
+        <w:tc>
+          <w:tcPr>
+            <w:tcW w:type="dxa" w:w="1400"/>
+            <w:tcBorders>
+              <w:top w:val="none"/>
+              <w:left w:val="none"/>
+              <w:bottom w:val="none"/>
+              <w:right w:val="none"/>
+            </w:tcBorders>
+            <w:tcMar>
+              <w:top w:type="dxa" w:w="30"/>
+              <w:left w:type="dxa" w:w="70"/>
+              <w:bottom w:type="dxa" w:w="30"/>
+              <w:right w:type="dxa" w:w="70"/>
+            </w:tcMar>
+            <w:vAlign w:val="center"/>
+          </w:tcPr>
+          <w:p>
+            <w:pPr>
+              <w:spacing w:after="0" w:line="240"/>
+              <w:jc w:val="center"/>
+            </w:pPr>
+            <w:r>
+              <w:rPr>
+                <w:rFonts w:ascii="Times New Roman" w:cs="Times New Roman" w:eastAsia="Times New Roman" w:hAnsi="Times New Roman"/>
+                <w:color w:val="1b7a3d"/>
+                <w:sz w:val="20"/>
+                <w:szCs w:val="20"/>
+              </w:rPr>
+              <w:t xml:space="preserve">0,026</w:t>
+            </w:r>
+          </w:p>
+        </w:tc>
+        <w:tc>
+          <w:tcPr>
+            <w:tcW w:type="dxa" w:w="1400"/>
+            <w:tcBorders>
+              <w:top w:val="none"/>
+              <w:left w:val="none"/>
+              <w:bottom w:val="none"/>
+              <w:right w:val="none"/>
+            </w:tcBorders>
+            <w:tcMar>
+              <w:top w:type="dxa" w:w="30"/>
+              <w:left w:type="dxa" w:w="70"/>
+              <w:bottom w:type="dxa" w:w="30"/>
+              <w:right w:type="dxa" w:w="70"/>
+            </w:tcMar>
+            <w:vAlign w:val="center"/>
+          </w:tcPr>
+          <w:p>
+            <w:pPr>
+              <w:spacing w:after="0" w:line="240"/>
+              <w:jc w:val="center"/>
+            </w:pPr>
+            <w:r>
+              <w:rPr>
+                <w:rFonts w:ascii="Times New Roman" w:cs="Times New Roman" w:eastAsia="Times New Roman" w:hAnsi="Times New Roman"/>
+                <w:color w:val="3f3f3f"/>
+                <w:sz w:val="20"/>
+                <w:szCs w:val="20"/>
+              </w:rPr>
+              <w:t xml:space="preserve">0,077</w:t>
+            </w:r>
+          </w:p>
+        </w:tc>
+        <w:tc>
+          <w:tcPr>
+            <w:tcW w:type="dxa" w:w="1705"/>
+            <w:tcBorders>
+              <w:top w:val="none"/>
+              <w:left w:val="none"/>
+              <w:bottom w:val="none"/>
+              <w:right w:val="none"/>
+            </w:tcBorders>
+            <w:tcMar>
+              <w:top w:type="dxa" w:w="30"/>
+              <w:left w:type="dxa" w:w="70"/>
+              <w:bottom w:type="dxa" w:w="30"/>
+              <w:right w:type="dxa" w:w="70"/>
+            </w:tcMar>
+            <w:vAlign w:val="center"/>
+          </w:tcPr>
+          <w:p>
+            <w:pPr>
+              <w:spacing w:after="0" w:line="240"/>
+              <w:jc w:val="center"/>
+            </w:pPr>
+            <w:r>
+              <w:rPr>
+                <w:rFonts w:ascii="Times New Roman" w:cs="Times New Roman" w:eastAsia="Times New Roman" w:hAnsi="Times New Roman"/>
+                <w:b/>
+                <w:bCs/>
+                <w:color w:val="1b7a3d"/>
+                <w:sz w:val="20"/>
+                <w:szCs w:val="20"/>
+              </w:rPr>
+              <w:t xml:space="preserve">FDR</w:t>
+            </w:r>
+          </w:p>
+        </w:tc>
+      </w:tr>
+      <w:tr>
+        <w:tc>
+          <w:tcPr>
+            <w:tcW w:type="dxa" w:w="1700"/>
+            <w:tcBorders>
+              <w:top w:val="none"/>
+              <w:left w:val="none"/>
+              <w:bottom w:val="none"/>
+              <w:right w:val="none"/>
+            </w:tcBorders>
+            <w:tcMar>
+              <w:top w:type="dxa" w:w="30"/>
+              <w:left w:type="dxa" w:w="70"/>
+              <w:bottom w:type="dxa" w:w="30"/>
+              <w:right w:type="dxa" w:w="70"/>
+            </w:tcMar>
+            <w:vAlign w:val="center"/>
+          </w:tcPr>
+          <w:p>
+            <w:pPr>
+              <w:spacing w:after="0" w:line="240"/>
+              <w:jc w:val="left"/>
+            </w:pPr>
+            <w:r>
+              <w:rPr>
+                <w:rFonts w:ascii="Times New Roman" w:cs="Times New Roman" w:eastAsia="Times New Roman" w:hAnsi="Times New Roman"/>
+                <w:color w:val="000000"/>
+                <w:sz w:val="20"/>
+                <w:szCs w:val="20"/>
+              </w:rPr>
+              <w:t xml:space="preserve">Friedman</w:t>
+            </w:r>
+          </w:p>
+        </w:tc>
+        <w:tc>
+          <w:tcPr>
+            <w:tcW w:type="dxa" w:w="1900"/>
+            <w:tcBorders>
+              <w:top w:val="none"/>
+              <w:left w:val="none"/>
+              <w:bottom w:val="none"/>
+              <w:right w:val="none"/>
+            </w:tcBorders>
+            <w:tcMar>
+              <w:top w:type="dxa" w:w="30"/>
+              <w:left w:type="dxa" w:w="70"/>
+              <w:bottom w:type="dxa" w:w="30"/>
+              <w:right w:type="dxa" w:w="70"/>
+            </w:tcMar>
+            <w:vAlign w:val="center"/>
+          </w:tcPr>
+          <w:p>
+            <w:pPr>
+              <w:spacing w:after="0" w:line="240"/>
+              <w:jc w:val="left"/>
+            </w:pPr>
+            <w:r>
+              <w:rPr>
+                <w:rFonts w:ascii="Times New Roman" w:cs="Times New Roman" w:eastAsia="Times New Roman" w:hAnsi="Times New Roman"/>
+                <w:b/>
+                <w:bCs/>
+                <w:color w:val="000000"/>
+                <w:sz w:val="20"/>
+                <w:szCs w:val="20"/>
+              </w:rPr>
+              <w:t xml:space="preserve">Tensão</w:t>
+            </w:r>
+          </w:p>
+        </w:tc>
+        <w:tc>
+          <w:tcPr>
+            <w:tcW w:type="dxa" w:w="1400"/>
+            <w:tcBorders>
+              <w:top w:val="none"/>
+              <w:left w:val="none"/>
+              <w:bottom w:val="none"/>
+              <w:right w:val="none"/>
+            </w:tcBorders>
+            <w:tcMar>
+              <w:top w:type="dxa" w:w="30"/>
+              <w:left w:type="dxa" w:w="70"/>
+              <w:bottom w:type="dxa" w:w="30"/>
+              <w:right w:type="dxa" w:w="70"/>
+            </w:tcMar>
+            <w:vAlign w:val="center"/>
+          </w:tcPr>
+          <w:p>
+            <w:pPr>
+              <w:spacing w:after="0" w:line="240"/>
+              <w:jc w:val="center"/>
+            </w:pPr>
+            <w:r>
+              <w:rPr>
+                <w:rFonts w:ascii="Times New Roman" w:cs="Times New Roman" w:eastAsia="Times New Roman" w:hAnsi="Times New Roman"/>
+                <w:color w:val="000000"/>
+                <w:sz w:val="20"/>
+                <w:szCs w:val="20"/>
+              </w:rPr>
+              <w:t xml:space="preserve">0,039</w:t>
+            </w:r>
+          </w:p>
+        </w:tc>
+        <w:tc>
+          <w:tcPr>
+            <w:tcW w:type="dxa" w:w="1400"/>
+            <w:tcBorders>
+              <w:top w:val="none"/>
+              <w:left w:val="none"/>
+              <w:bottom w:val="none"/>
+              <w:right w:val="none"/>
+            </w:tcBorders>
+            <w:tcMar>
+              <w:top w:type="dxa" w:w="30"/>
+              <w:left w:type="dxa" w:w="70"/>
+              <w:bottom w:type="dxa" w:w="30"/>
+              <w:right w:type="dxa" w:w="70"/>
+            </w:tcMar>
+            <w:vAlign w:val="center"/>
+          </w:tcPr>
+          <w:p>
+            <w:pPr>
+              <w:spacing w:after="0" w:line="240"/>
+              <w:jc w:val="center"/>
+            </w:pPr>
+            <w:r>
+              <w:rPr>
+                <w:rFonts w:ascii="Times New Roman" w:cs="Times New Roman" w:eastAsia="Times New Roman" w:hAnsi="Times New Roman"/>
+                <w:color w:val="3f3f3f"/>
+                <w:sz w:val="20"/>
+                <w:szCs w:val="20"/>
+              </w:rPr>
+              <w:t xml:space="preserve">0,070</w:t>
+            </w:r>
+          </w:p>
+        </w:tc>
+        <w:tc>
+          <w:tcPr>
+            <w:tcW w:type="dxa" w:w="1400"/>
+            <w:tcBorders>
+              <w:top w:val="none"/>
+              <w:left w:val="none"/>
+              <w:bottom w:val="none"/>
+              <w:right w:val="none"/>
+            </w:tcBorders>
+            <w:tcMar>
+              <w:top w:type="dxa" w:w="30"/>
+              <w:left w:type="dxa" w:w="70"/>
+              <w:bottom w:type="dxa" w:w="30"/>
+              <w:right w:type="dxa" w:w="70"/>
+            </w:tcMar>
+            <w:vAlign w:val="center"/>
+          </w:tcPr>
+          <w:p>
+            <w:pPr>
+              <w:spacing w:after="0" w:line="240"/>
+              <w:jc w:val="center"/>
+            </w:pPr>
+            <w:r>
+              <w:rPr>
+                <w:rFonts w:ascii="Times New Roman" w:cs="Times New Roman" w:eastAsia="Times New Roman" w:hAnsi="Times New Roman"/>
+                <w:color w:val="3f3f3f"/>
+                <w:sz w:val="20"/>
+                <w:szCs w:val="20"/>
+              </w:rPr>
+              <w:t xml:space="preserve">0,273</w:t>
+            </w:r>
+          </w:p>
+        </w:tc>
+        <w:tc>
+          <w:tcPr>
+            <w:tcW w:type="dxa" w:w="1705"/>
+            <w:tcBorders>
+              <w:top w:val="none"/>
+              <w:left w:val="none"/>
+              <w:bottom w:val="none"/>
+              <w:right w:val="none"/>
+            </w:tcBorders>
+            <w:tcMar>
+              <w:top w:type="dxa" w:w="30"/>
+              <w:left w:type="dxa" w:w="70"/>
+              <w:bottom w:type="dxa" w:w="30"/>
+              <w:right w:type="dxa" w:w="70"/>
+            </w:tcMar>
+            <w:vAlign w:val="center"/>
+          </w:tcPr>
+          <w:p>
+            <w:pPr>
+              <w:spacing w:after="0" w:line="240"/>
+              <w:jc w:val="center"/>
+            </w:pPr>
+            <w:r>
+              <w:rPr>
+                <w:rFonts w:ascii="Times New Roman" w:cs="Times New Roman" w:eastAsia="Times New Roman" w:hAnsi="Times New Roman"/>
+                <w:b w:val="false"/>
+                <w:bCs w:val="false"/>
+                <w:color w:val="3f3f3f"/>
+                <w:sz w:val="20"/>
+                <w:szCs w:val="20"/>
+              </w:rPr>
+              <w:t xml:space="preserve">não</w:t>
+            </w:r>
+          </w:p>
+        </w:tc>
+      </w:tr>
+      <w:tr>
+        <w:tc>
+          <w:tcPr>
+            <w:tcW w:type="dxa" w:w="1700"/>
+            <w:tcBorders>
+              <w:top w:val="none"/>
+              <w:left w:val="none"/>
+              <w:bottom w:val="none"/>
+              <w:right w:val="none"/>
+            </w:tcBorders>
+            <w:tcMar>
+              <w:top w:type="dxa" w:w="30"/>
+              <w:left w:type="dxa" w:w="70"/>
+              <w:bottom w:type="dxa" w:w="30"/>
+              <w:right w:type="dxa" w:w="70"/>
+            </w:tcMar>
+            <w:vAlign w:val="center"/>
+          </w:tcPr>
+          <w:p>
+            <w:pPr>
+              <w:spacing w:after="0" w:line="240"/>
+              <w:jc w:val="left"/>
+            </w:pPr>
+            <w:r>
+              <w:rPr>
+                <w:rFonts w:ascii="Times New Roman" w:cs="Times New Roman" w:eastAsia="Times New Roman" w:hAnsi="Times New Roman"/>
+                <w:color w:val="000000"/>
+                <w:sz w:val="20"/>
+                <w:szCs w:val="20"/>
+              </w:rPr>
+              <w:t xml:space="preserve">Wilcoxon</w:t>
+            </w:r>
+          </w:p>
+        </w:tc>
+        <w:tc>
+          <w:tcPr>
+            <w:tcW w:type="dxa" w:w="1900"/>
+            <w:tcBorders>
+              <w:top w:val="none"/>
+              <w:left w:val="none"/>
+              <w:bottom w:val="none"/>
+              <w:right w:val="none"/>
+            </w:tcBorders>
+            <w:tcMar>
+              <w:top w:type="dxa" w:w="30"/>
+              <w:left w:type="dxa" w:w="70"/>
+              <w:bottom w:type="dxa" w:w="30"/>
+              <w:right w:type="dxa" w:w="70"/>
+            </w:tcMar>
+            <w:vAlign w:val="center"/>
+          </w:tcPr>
+          <w:p>
+            <w:pPr>
+              <w:spacing w:after="0" w:line="240"/>
+              <w:jc w:val="left"/>
+            </w:pPr>
+            <w:r>
+              <w:rPr>
+                <w:rFonts w:ascii="Times New Roman" w:cs="Times New Roman" w:eastAsia="Times New Roman" w:hAnsi="Times New Roman"/>
+                <w:b/>
+                <w:bCs/>
+                <w:color w:val="000000"/>
+                <w:sz w:val="20"/>
+                <w:szCs w:val="20"/>
+              </w:rPr>
+              <w:t xml:space="preserve">Depressão</w:t>
+            </w:r>
+          </w:p>
+        </w:tc>
+        <w:tc>
+          <w:tcPr>
+            <w:tcW w:type="dxa" w:w="1400"/>
+            <w:tcBorders>
+              <w:top w:val="none"/>
+              <w:left w:val="none"/>
+              <w:bottom w:val="none"/>
+              <w:right w:val="none"/>
+            </w:tcBorders>
+            <w:tcMar>
+              <w:top w:type="dxa" w:w="30"/>
+              <w:left w:type="dxa" w:w="70"/>
+              <w:bottom w:type="dxa" w:w="30"/>
+              <w:right w:type="dxa" w:w="70"/>
+            </w:tcMar>
+            <w:vAlign w:val="center"/>
+          </w:tcPr>
+          <w:p>
+            <w:pPr>
+              <w:spacing w:after="0" w:line="240"/>
+              <w:jc w:val="center"/>
+            </w:pPr>
+            <w:r>
+              <w:rPr>
+                <w:rFonts w:ascii="Times New Roman" w:cs="Times New Roman" w:eastAsia="Times New Roman" w:hAnsi="Times New Roman"/>
+                <w:color w:val="000000"/>
+                <w:sz w:val="20"/>
+                <w:szCs w:val="20"/>
+              </w:rPr>
+              <w:t xml:space="preserve">0,752</w:t>
+            </w:r>
+          </w:p>
+        </w:tc>
+        <w:tc>
+          <w:tcPr>
+            <w:tcW w:type="dxa" w:w="1400"/>
+            <w:tcBorders>
+              <w:top w:val="none"/>
+              <w:left w:val="none"/>
+              <w:bottom w:val="none"/>
+              <w:right w:val="none"/>
+            </w:tcBorders>
+            <w:tcMar>
+              <w:top w:type="dxa" w:w="30"/>
+              <w:left w:type="dxa" w:w="70"/>
+              <w:bottom w:type="dxa" w:w="30"/>
+              <w:right w:type="dxa" w:w="70"/>
+            </w:tcMar>
+            <w:vAlign w:val="center"/>
+          </w:tcPr>
+          <w:p>
+            <w:pPr>
+              <w:spacing w:after="0" w:line="240"/>
+              <w:jc w:val="center"/>
+            </w:pPr>
+            <w:r>
+              <w:rPr>
+                <w:rFonts w:ascii="Times New Roman" w:cs="Times New Roman" w:eastAsia="Times New Roman" w:hAnsi="Times New Roman"/>
+                <w:color w:val="3f3f3f"/>
+                <w:sz w:val="20"/>
+                <w:szCs w:val="20"/>
+              </w:rPr>
+              <w:t xml:space="preserve">0,802</w:t>
+            </w:r>
+          </w:p>
+        </w:tc>
+        <w:tc>
+          <w:tcPr>
+            <w:tcW w:type="dxa" w:w="1400"/>
+            <w:tcBorders>
+              <w:top w:val="none"/>
+              <w:left w:val="none"/>
+              <w:bottom w:val="none"/>
+              <w:right w:val="none"/>
+            </w:tcBorders>
+            <w:tcMar>
+              <w:top w:type="dxa" w:w="30"/>
+              <w:left w:type="dxa" w:w="70"/>
+              <w:bottom w:type="dxa" w:w="30"/>
+              <w:right w:type="dxa" w:w="70"/>
+            </w:tcMar>
+            <w:vAlign w:val="center"/>
+          </w:tcPr>
+          <w:p>
+            <w:pPr>
+              <w:spacing w:after="0" w:line="240"/>
+              <w:jc w:val="center"/>
+            </w:pPr>
+            <w:r>
+              <w:rPr>
+                <w:rFonts w:ascii="Times New Roman" w:cs="Times New Roman" w:eastAsia="Times New Roman" w:hAnsi="Times New Roman"/>
+                <w:color w:val="3f3f3f"/>
+                <w:sz w:val="20"/>
+                <w:szCs w:val="20"/>
+              </w:rPr>
+              <w:t xml:space="preserve">1,000</w:t>
+            </w:r>
+          </w:p>
+        </w:tc>
+        <w:tc>
+          <w:tcPr>
+            <w:tcW w:type="dxa" w:w="1705"/>
+            <w:tcBorders>
+              <w:top w:val="none"/>
+              <w:left w:val="none"/>
+              <w:bottom w:val="none"/>
+              <w:right w:val="none"/>
+            </w:tcBorders>
+            <w:tcMar>
+              <w:top w:type="dxa" w:w="30"/>
+              <w:left w:type="dxa" w:w="70"/>
+              <w:bottom w:type="dxa" w:w="30"/>
+              <w:right w:type="dxa" w:w="70"/>
+            </w:tcMar>
+            <w:vAlign w:val="center"/>
+          </w:tcPr>
+          <w:p>
+            <w:pPr>
+              <w:spacing w:after="0" w:line="240"/>
+              <w:jc w:val="center"/>
+            </w:pPr>
+            <w:r>
+              <w:rPr>
+                <w:rFonts w:ascii="Times New Roman" w:cs="Times New Roman" w:eastAsia="Times New Roman" w:hAnsi="Times New Roman"/>
+                <w:b w:val="false"/>
+                <w:bCs w:val="false"/>
+                <w:color w:val="3f3f3f"/>
+                <w:sz w:val="20"/>
+                <w:szCs w:val="20"/>
+              </w:rPr>
+              <w:t xml:space="preserve">não</w:t>
+            </w:r>
+          </w:p>
+        </w:tc>
+      </w:tr>
+      <w:tr>
+        <w:tc>
+          <w:tcPr>
+            <w:tcW w:type="dxa" w:w="1700"/>
+            <w:tcBorders>
+              <w:top w:val="none"/>
+              <w:left w:val="none"/>
+              <w:bottom w:val="none"/>
+              <w:right w:val="none"/>
+            </w:tcBorders>
+            <w:tcMar>
+              <w:top w:type="dxa" w:w="30"/>
+              <w:left w:type="dxa" w:w="70"/>
+              <w:bottom w:type="dxa" w:w="30"/>
+              <w:right w:type="dxa" w:w="70"/>
+            </w:tcMar>
+            <w:vAlign w:val="center"/>
+          </w:tcPr>
+          <w:p>
+            <w:pPr>
+              <w:spacing w:after="0" w:line="240"/>
+              <w:jc w:val="left"/>
+            </w:pPr>
+            <w:r>
+              <w:rPr>
+                <w:rFonts w:ascii="Times New Roman" w:cs="Times New Roman" w:eastAsia="Times New Roman" w:hAnsi="Times New Roman"/>
+                <w:color w:val="000000"/>
+                <w:sz w:val="20"/>
+                <w:szCs w:val="20"/>
+              </w:rPr>
+              <w:t xml:space="preserve">Friedman</w:t>
+            </w:r>
+          </w:p>
+        </w:tc>
+        <w:tc>
+          <w:tcPr>
+            <w:tcW w:type="dxa" w:w="1900"/>
+            <w:tcBorders>
+              <w:top w:val="none"/>
+              <w:left w:val="none"/>
+              <w:bottom w:val="none"/>
+              <w:right w:val="none"/>
+            </w:tcBorders>
+            <w:tcMar>
+              <w:top w:type="dxa" w:w="30"/>
+              <w:left w:type="dxa" w:w="70"/>
+              <w:bottom w:type="dxa" w:w="30"/>
+              <w:right w:type="dxa" w:w="70"/>
+            </w:tcMar>
+            <w:vAlign w:val="center"/>
+          </w:tcPr>
+          <w:p>
+            <w:pPr>
+              <w:spacing w:after="0" w:line="240"/>
+              <w:jc w:val="left"/>
+            </w:pPr>
+            <w:r>
+              <w:rPr>
+                <w:rFonts w:ascii="Times New Roman" w:cs="Times New Roman" w:eastAsia="Times New Roman" w:hAnsi="Times New Roman"/>
+                <w:b/>
+                <w:bCs/>
+                <w:color w:val="000000"/>
+                <w:sz w:val="20"/>
+                <w:szCs w:val="20"/>
+              </w:rPr>
+              <w:t xml:space="preserve">Depressão</w:t>
+            </w:r>
+          </w:p>
+        </w:tc>
+        <w:tc>
+          <w:tcPr>
+            <w:tcW w:type="dxa" w:w="1400"/>
+            <w:tcBorders>
+              <w:top w:val="none"/>
+              <w:left w:val="none"/>
+              <w:bottom w:val="none"/>
+              <w:right w:val="none"/>
+            </w:tcBorders>
+            <w:tcMar>
+              <w:top w:type="dxa" w:w="30"/>
+              <w:left w:type="dxa" w:w="70"/>
+              <w:bottom w:type="dxa" w:w="30"/>
+              <w:right w:type="dxa" w:w="70"/>
+            </w:tcMar>
+            <w:vAlign w:val="center"/>
+          </w:tcPr>
+          <w:p>
+            <w:pPr>
+              <w:spacing w:after="0" w:line="240"/>
+              <w:jc w:val="center"/>
+            </w:pPr>
+            <w:r>
+              <w:rPr>
+                <w:rFonts w:ascii="Times New Roman" w:cs="Times New Roman" w:eastAsia="Times New Roman" w:hAnsi="Times New Roman"/>
+                <w:color w:val="000000"/>
+                <w:sz w:val="20"/>
+                <w:szCs w:val="20"/>
+              </w:rPr>
+              <w:t xml:space="preserve">0,936</w:t>
+            </w:r>
+          </w:p>
+        </w:tc>
+        <w:tc>
+          <w:tcPr>
+            <w:tcW w:type="dxa" w:w="1400"/>
+            <w:tcBorders>
+              <w:top w:val="none"/>
+              <w:left w:val="none"/>
+              <w:bottom w:val="none"/>
+              <w:right w:val="none"/>
+            </w:tcBorders>
+            <w:tcMar>
+              <w:top w:type="dxa" w:w="30"/>
+              <w:left w:type="dxa" w:w="70"/>
+              <w:bottom w:type="dxa" w:w="30"/>
+              <w:right w:type="dxa" w:w="70"/>
+            </w:tcMar>
+            <w:vAlign w:val="center"/>
+          </w:tcPr>
+          <w:p>
+            <w:pPr>
+              <w:spacing w:after="0" w:line="240"/>
+              <w:jc w:val="center"/>
+            </w:pPr>
+            <w:r>
+              <w:rPr>
+                <w:rFonts w:ascii="Times New Roman" w:cs="Times New Roman" w:eastAsia="Times New Roman" w:hAnsi="Times New Roman"/>
+                <w:color w:val="3f3f3f"/>
+                <w:sz w:val="20"/>
+                <w:szCs w:val="20"/>
+              </w:rPr>
+              <w:t xml:space="preserve">0,936</w:t>
+            </w:r>
+          </w:p>
+        </w:tc>
+        <w:tc>
+          <w:tcPr>
+            <w:tcW w:type="dxa" w:w="1400"/>
+            <w:tcBorders>
+              <w:top w:val="none"/>
+              <w:left w:val="none"/>
+              <w:bottom w:val="none"/>
+              <w:right w:val="none"/>
+            </w:tcBorders>
+            <w:tcMar>
+              <w:top w:type="dxa" w:w="30"/>
+              <w:left w:type="dxa" w:w="70"/>
+              <w:bottom w:type="dxa" w:w="30"/>
+              <w:right w:type="dxa" w:w="70"/>
+            </w:tcMar>
+            <w:vAlign w:val="center"/>
+          </w:tcPr>
+          <w:p>
+            <w:pPr>
+              <w:spacing w:after="0" w:line="240"/>
+              <w:jc w:val="center"/>
+            </w:pPr>
+            <w:r>
+              <w:rPr>
+                <w:rFonts w:ascii="Times New Roman" w:cs="Times New Roman" w:eastAsia="Times New Roman" w:hAnsi="Times New Roman"/>
+                <w:color w:val="3f3f3f"/>
+                <w:sz w:val="20"/>
+                <w:szCs w:val="20"/>
+              </w:rPr>
+              <w:t xml:space="preserve">1,000</w:t>
+            </w:r>
+          </w:p>
+        </w:tc>
+        <w:tc>
+          <w:tcPr>
+            <w:tcW w:type="dxa" w:w="1705"/>
+            <w:tcBorders>
+              <w:top w:val="none"/>
+              <w:left w:val="none"/>
+              <w:bottom w:val="none"/>
+              <w:right w:val="none"/>
+            </w:tcBorders>
+            <w:tcMar>
+              <w:top w:type="dxa" w:w="30"/>
+              <w:left w:type="dxa" w:w="70"/>
+              <w:bottom w:type="dxa" w:w="30"/>
+              <w:right w:type="dxa" w:w="70"/>
+            </w:tcMar>
+            <w:vAlign w:val="center"/>
+          </w:tcPr>
+          <w:p>
+            <w:pPr>
+              <w:spacing w:after="0" w:line="240"/>
+              <w:jc w:val="center"/>
+            </w:pPr>
+            <w:r>
+              <w:rPr>
+                <w:rFonts w:ascii="Times New Roman" w:cs="Times New Roman" w:eastAsia="Times New Roman" w:hAnsi="Times New Roman"/>
+                <w:b w:val="false"/>
+                <w:bCs w:val="false"/>
+                <w:color w:val="3f3f3f"/>
+                <w:sz w:val="20"/>
+                <w:szCs w:val="20"/>
+              </w:rPr>
+              <w:t xml:space="preserve">não</w:t>
+            </w:r>
+          </w:p>
+        </w:tc>
+      </w:tr>
+      <w:tr>
+        <w:tc>
+          <w:tcPr>
+            <w:tcW w:type="dxa" w:w="1700"/>
+            <w:tcBorders>
+              <w:top w:val="none"/>
+              <w:left w:val="none"/>
+              <w:bottom w:val="none"/>
+              <w:right w:val="none"/>
+            </w:tcBorders>
+            <w:tcMar>
+              <w:top w:type="dxa" w:w="30"/>
+              <w:left w:type="dxa" w:w="70"/>
+              <w:bottom w:type="dxa" w:w="30"/>
+              <w:right w:type="dxa" w:w="70"/>
+            </w:tcMar>
+            <w:vAlign w:val="center"/>
+          </w:tcPr>
+          <w:p>
+            <w:pPr>
+              <w:spacing w:after="0" w:line="240"/>
+              <w:jc w:val="left"/>
+            </w:pPr>
+            <w:r>
+              <w:rPr>
+                <w:rFonts w:ascii="Times New Roman" w:cs="Times New Roman" w:eastAsia="Times New Roman" w:hAnsi="Times New Roman"/>
+                <w:color w:val="000000"/>
+                <w:sz w:val="20"/>
+                <w:szCs w:val="20"/>
+              </w:rPr>
+              <w:t xml:space="preserve">Wilcoxon</w:t>
+            </w:r>
+          </w:p>
+        </w:tc>
+        <w:tc>
+          <w:tcPr>
+            <w:tcW w:type="dxa" w:w="1900"/>
+            <w:tcBorders>
+              <w:top w:val="none"/>
+              <w:left w:val="none"/>
+              <w:bottom w:val="none"/>
+              <w:right w:val="none"/>
+            </w:tcBorders>
+            <w:tcMar>
+              <w:top w:type="dxa" w:w="30"/>
+              <w:left w:type="dxa" w:w="70"/>
+              <w:bottom w:type="dxa" w:w="30"/>
+              <w:right w:type="dxa" w:w="70"/>
+            </w:tcMar>
+            <w:vAlign w:val="center"/>
+          </w:tcPr>
+          <w:p>
+            <w:pPr>
+              <w:spacing w:after="0" w:line="240"/>
+              <w:jc w:val="left"/>
+            </w:pPr>
+            <w:r>
+              <w:rPr>
+                <w:rFonts w:ascii="Times New Roman" w:cs="Times New Roman" w:eastAsia="Times New Roman" w:hAnsi="Times New Roman"/>
+                <w:b/>
+                <w:bCs/>
+                <w:color w:val="000000"/>
+                <w:sz w:val="20"/>
+                <w:szCs w:val="20"/>
+              </w:rPr>
+              <w:t xml:space="preserve">Raiva</w:t>
+            </w:r>
+          </w:p>
+        </w:tc>
+        <w:tc>
+          <w:tcPr>
+            <w:tcW w:type="dxa" w:w="1400"/>
+            <w:tcBorders>
+              <w:top w:val="none"/>
+              <w:left w:val="none"/>
+              <w:bottom w:val="none"/>
+              <w:right w:val="none"/>
+            </w:tcBorders>
+            <w:tcMar>
+              <w:top w:type="dxa" w:w="30"/>
+              <w:left w:type="dxa" w:w="70"/>
+              <w:bottom w:type="dxa" w:w="30"/>
+              <w:right w:type="dxa" w:w="70"/>
+            </w:tcMar>
+            <w:vAlign w:val="center"/>
+          </w:tcPr>
+          <w:p>
+            <w:pPr>
+              <w:spacing w:after="0" w:line="240"/>
+              <w:jc w:val="center"/>
+            </w:pPr>
+            <w:r>
+              <w:rPr>
+                <w:rFonts w:ascii="Times New Roman" w:cs="Times New Roman" w:eastAsia="Times New Roman" w:hAnsi="Times New Roman"/>
+                <w:color w:val="000000"/>
+                <w:sz w:val="20"/>
+                <w:szCs w:val="20"/>
+              </w:rPr>
+              <w:t xml:space="preserve">0,802</w:t>
+            </w:r>
+          </w:p>
+        </w:tc>
+        <w:tc>
+          <w:tcPr>
+            <w:tcW w:type="dxa" w:w="1400"/>
+            <w:tcBorders>
+              <w:top w:val="none"/>
+              <w:left w:val="none"/>
+              <w:bottom w:val="none"/>
+              <w:right w:val="none"/>
+            </w:tcBorders>
+            <w:tcMar>
+              <w:top w:type="dxa" w:w="30"/>
+              <w:left w:type="dxa" w:w="70"/>
+              <w:bottom w:type="dxa" w:w="30"/>
+              <w:right w:type="dxa" w:w="70"/>
+            </w:tcMar>
+            <w:vAlign w:val="center"/>
+          </w:tcPr>
+          <w:p>
+            <w:pPr>
+              <w:spacing w:after="0" w:line="240"/>
+              <w:jc w:val="center"/>
+            </w:pPr>
+            <w:r>
+              <w:rPr>
+                <w:rFonts w:ascii="Times New Roman" w:cs="Times New Roman" w:eastAsia="Times New Roman" w:hAnsi="Times New Roman"/>
+                <w:color w:val="3f3f3f"/>
+                <w:sz w:val="20"/>
+                <w:szCs w:val="20"/>
+              </w:rPr>
+              <w:t xml:space="preserve">0,802</w:t>
+            </w:r>
+          </w:p>
+        </w:tc>
+        <w:tc>
+          <w:tcPr>
+            <w:tcW w:type="dxa" w:w="1400"/>
+            <w:tcBorders>
+              <w:top w:val="none"/>
+              <w:left w:val="none"/>
+              <w:bottom w:val="none"/>
+              <w:right w:val="none"/>
+            </w:tcBorders>
+            <w:tcMar>
+              <w:top w:type="dxa" w:w="30"/>
+              <w:left w:type="dxa" w:w="70"/>
+              <w:bottom w:type="dxa" w:w="30"/>
+              <w:right w:type="dxa" w:w="70"/>
+            </w:tcMar>
+            <w:vAlign w:val="center"/>
+          </w:tcPr>
+          <w:p>
+            <w:pPr>
+              <w:spacing w:after="0" w:line="240"/>
+              <w:jc w:val="center"/>
+            </w:pPr>
+            <w:r>
+              <w:rPr>
+                <w:rFonts w:ascii="Times New Roman" w:cs="Times New Roman" w:eastAsia="Times New Roman" w:hAnsi="Times New Roman"/>
+                <w:color w:val="3f3f3f"/>
+                <w:sz w:val="20"/>
+                <w:szCs w:val="20"/>
+              </w:rPr>
+              <w:t xml:space="preserve">1,000</w:t>
+            </w:r>
+          </w:p>
+        </w:tc>
+        <w:tc>
+          <w:tcPr>
+            <w:tcW w:type="dxa" w:w="1705"/>
+            <w:tcBorders>
+              <w:top w:val="none"/>
+              <w:left w:val="none"/>
+              <w:bottom w:val="none"/>
+              <w:right w:val="none"/>
+            </w:tcBorders>
+            <w:tcMar>
+              <w:top w:type="dxa" w:w="30"/>
+              <w:left w:type="dxa" w:w="70"/>
+              <w:bottom w:type="dxa" w:w="30"/>
+              <w:right w:type="dxa" w:w="70"/>
+            </w:tcMar>
+            <w:vAlign w:val="center"/>
+          </w:tcPr>
+          <w:p>
+            <w:pPr>
+              <w:spacing w:after="0" w:line="240"/>
+              <w:jc w:val="center"/>
+            </w:pPr>
+            <w:r>
+              <w:rPr>
+                <w:rFonts w:ascii="Times New Roman" w:cs="Times New Roman" w:eastAsia="Times New Roman" w:hAnsi="Times New Roman"/>
+                <w:b w:val="false"/>
+                <w:bCs w:val="false"/>
+                <w:color w:val="3f3f3f"/>
+                <w:sz w:val="20"/>
+                <w:szCs w:val="20"/>
+              </w:rPr>
+              <w:t xml:space="preserve">não</w:t>
+            </w:r>
+          </w:p>
+        </w:tc>
+      </w:tr>
+      <w:tr>
+        <w:tc>
+          <w:tcPr>
+            <w:tcW w:type="dxa" w:w="1700"/>
+            <w:tcBorders>
+              <w:top w:val="none"/>
+              <w:left w:val="none"/>
+              <w:bottom w:val="none"/>
+              <w:right w:val="none"/>
+            </w:tcBorders>
+            <w:tcMar>
+              <w:top w:type="dxa" w:w="30"/>
+              <w:left w:type="dxa" w:w="70"/>
+              <w:bottom w:type="dxa" w:w="30"/>
+              <w:right w:type="dxa" w:w="70"/>
+            </w:tcMar>
+            <w:vAlign w:val="center"/>
+          </w:tcPr>
+          <w:p>
+            <w:pPr>
+              <w:spacing w:after="0" w:line="240"/>
+              <w:jc w:val="left"/>
+            </w:pPr>
+            <w:r>
+              <w:rPr>
+                <w:rFonts w:ascii="Times New Roman" w:cs="Times New Roman" w:eastAsia="Times New Roman" w:hAnsi="Times New Roman"/>
+                <w:color w:val="000000"/>
+                <w:sz w:val="20"/>
+                <w:szCs w:val="20"/>
+              </w:rPr>
+              <w:t xml:space="preserve">Friedman</w:t>
+            </w:r>
+          </w:p>
+        </w:tc>
+        <w:tc>
+          <w:tcPr>
+            <w:tcW w:type="dxa" w:w="1900"/>
+            <w:tcBorders>
+              <w:top w:val="none"/>
+              <w:left w:val="none"/>
+              <w:bottom w:val="none"/>
+              <w:right w:val="none"/>
+            </w:tcBorders>
+            <w:tcMar>
+              <w:top w:type="dxa" w:w="30"/>
+              <w:left w:type="dxa" w:w="70"/>
+              <w:bottom w:type="dxa" w:w="30"/>
+              <w:right w:type="dxa" w:w="70"/>
+            </w:tcMar>
+            <w:vAlign w:val="center"/>
+          </w:tcPr>
+          <w:p>
+            <w:pPr>
+              <w:spacing w:after="0" w:line="240"/>
+              <w:jc w:val="left"/>
+            </w:pPr>
+            <w:r>
+              <w:rPr>
+                <w:rFonts w:ascii="Times New Roman" w:cs="Times New Roman" w:eastAsia="Times New Roman" w:hAnsi="Times New Roman"/>
+                <w:b/>
+                <w:bCs/>
+                <w:color w:val="000000"/>
+                <w:sz w:val="20"/>
+                <w:szCs w:val="20"/>
+              </w:rPr>
+              <w:t xml:space="preserve">Raiva</w:t>
+            </w:r>
+          </w:p>
+        </w:tc>
+        <w:tc>
+          <w:tcPr>
+            <w:tcW w:type="dxa" w:w="1400"/>
+            <w:tcBorders>
+              <w:top w:val="none"/>
+              <w:left w:val="none"/>
+              <w:bottom w:val="none"/>
+              <w:right w:val="none"/>
+            </w:tcBorders>
+            <w:tcMar>
+              <w:top w:type="dxa" w:w="30"/>
+              <w:left w:type="dxa" w:w="70"/>
+              <w:bottom w:type="dxa" w:w="30"/>
+              <w:right w:type="dxa" w:w="70"/>
+            </w:tcMar>
+            <w:vAlign w:val="center"/>
+          </w:tcPr>
+          <w:p>
+            <w:pPr>
+              <w:spacing w:after="0" w:line="240"/>
+              <w:jc w:val="center"/>
+            </w:pPr>
+            <w:r>
+              <w:rPr>
+                <w:rFonts w:ascii="Times New Roman" w:cs="Times New Roman" w:eastAsia="Times New Roman" w:hAnsi="Times New Roman"/>
+                <w:color w:val="000000"/>
+                <w:sz w:val="20"/>
+                <w:szCs w:val="20"/>
+              </w:rPr>
+              <w:t xml:space="preserve">0,056</w:t>
+            </w:r>
+          </w:p>
+        </w:tc>
+        <w:tc>
+          <w:tcPr>
+            <w:tcW w:type="dxa" w:w="1400"/>
+            <w:tcBorders>
+              <w:top w:val="none"/>
+              <w:left w:val="none"/>
+              <w:bottom w:val="none"/>
+              <w:right w:val="none"/>
+            </w:tcBorders>
+            <w:tcMar>
+              <w:top w:type="dxa" w:w="30"/>
+              <w:left w:type="dxa" w:w="70"/>
+              <w:bottom w:type="dxa" w:w="30"/>
+              <w:right w:type="dxa" w:w="70"/>
+            </w:tcMar>
+            <w:vAlign w:val="center"/>
+          </w:tcPr>
+          <w:p>
+            <w:pPr>
+              <w:spacing w:after="0" w:line="240"/>
+              <w:jc w:val="center"/>
+            </w:pPr>
+            <w:r>
+              <w:rPr>
+                <w:rFonts w:ascii="Times New Roman" w:cs="Times New Roman" w:eastAsia="Times New Roman" w:hAnsi="Times New Roman"/>
+                <w:color w:val="3f3f3f"/>
+                <w:sz w:val="20"/>
+                <w:szCs w:val="20"/>
+              </w:rPr>
+              <w:t xml:space="preserve">0,078</w:t>
+            </w:r>
+          </w:p>
+        </w:tc>
+        <w:tc>
+          <w:tcPr>
+            <w:tcW w:type="dxa" w:w="1400"/>
+            <w:tcBorders>
+              <w:top w:val="none"/>
+              <w:left w:val="none"/>
+              <w:bottom w:val="none"/>
+              <w:right w:val="none"/>
+            </w:tcBorders>
+            <w:tcMar>
+              <w:top w:type="dxa" w:w="30"/>
+              <w:left w:type="dxa" w:w="70"/>
+              <w:bottom w:type="dxa" w:w="30"/>
+              <w:right w:type="dxa" w:w="70"/>
+            </w:tcMar>
+            <w:vAlign w:val="center"/>
+          </w:tcPr>
+          <w:p>
+            <w:pPr>
+              <w:spacing w:after="0" w:line="240"/>
+              <w:jc w:val="center"/>
+            </w:pPr>
+            <w:r>
+              <w:rPr>
+                <w:rFonts w:ascii="Times New Roman" w:cs="Times New Roman" w:eastAsia="Times New Roman" w:hAnsi="Times New Roman"/>
+                <w:color w:val="3f3f3f"/>
+                <w:sz w:val="20"/>
+                <w:szCs w:val="20"/>
+              </w:rPr>
+              <w:t xml:space="preserve">0,392</w:t>
+            </w:r>
+          </w:p>
+        </w:tc>
+        <w:tc>
+          <w:tcPr>
+            <w:tcW w:type="dxa" w:w="1705"/>
+            <w:tcBorders>
+              <w:top w:val="none"/>
+              <w:left w:val="none"/>
+              <w:bottom w:val="none"/>
+              <w:right w:val="none"/>
+            </w:tcBorders>
+            <w:tcMar>
+              <w:top w:type="dxa" w:w="30"/>
+              <w:left w:type="dxa" w:w="70"/>
+              <w:bottom w:type="dxa" w:w="30"/>
+              <w:right w:type="dxa" w:w="70"/>
+            </w:tcMar>
+            <w:vAlign w:val="center"/>
+          </w:tcPr>
+          <w:p>
+            <w:pPr>
+              <w:spacing w:after="0" w:line="240"/>
+              <w:jc w:val="center"/>
+            </w:pPr>
+            <w:r>
+              <w:rPr>
+                <w:rFonts w:ascii="Times New Roman" w:cs="Times New Roman" w:eastAsia="Times New Roman" w:hAnsi="Times New Roman"/>
+                <w:b w:val="false"/>
+                <w:bCs w:val="false"/>
+                <w:color w:val="3f3f3f"/>
+                <w:sz w:val="20"/>
+                <w:szCs w:val="20"/>
+              </w:rPr>
+              <w:t xml:space="preserve">não</w:t>
+            </w:r>
+          </w:p>
+        </w:tc>
+      </w:tr>
+      <w:tr>
+        <w:tc>
+          <w:tcPr>
+            <w:tcW w:type="dxa" w:w="1700"/>
+            <w:tcBorders>
+              <w:top w:val="none"/>
+              <w:left w:val="none"/>
+              <w:bottom w:val="none"/>
+              <w:right w:val="none"/>
+            </w:tcBorders>
+            <w:tcMar>
+              <w:top w:type="dxa" w:w="30"/>
+              <w:left w:type="dxa" w:w="70"/>
+              <w:bottom w:type="dxa" w:w="30"/>
+              <w:right w:type="dxa" w:w="70"/>
+            </w:tcMar>
+            <w:vAlign w:val="center"/>
+          </w:tcPr>
+          <w:p>
+            <w:pPr>
+              <w:spacing w:after="0" w:line="240"/>
+              <w:jc w:val="left"/>
+            </w:pPr>
+            <w:r>
+              <w:rPr>
+                <w:rFonts w:ascii="Times New Roman" w:cs="Times New Roman" w:eastAsia="Times New Roman" w:hAnsi="Times New Roman"/>
+                <w:color w:val="000000"/>
+                <w:sz w:val="20"/>
+                <w:szCs w:val="20"/>
+              </w:rPr>
+              <w:t xml:space="preserve">Wilcoxon</w:t>
+            </w:r>
+          </w:p>
+        </w:tc>
+        <w:tc>
+          <w:tcPr>
+            <w:tcW w:type="dxa" w:w="1900"/>
+            <w:tcBorders>
+              <w:top w:val="none"/>
+              <w:left w:val="none"/>
+              <w:bottom w:val="none"/>
+              <w:right w:val="none"/>
+            </w:tcBorders>
+            <w:tcMar>
+              <w:top w:type="dxa" w:w="30"/>
+              <w:left w:type="dxa" w:w="70"/>
+              <w:bottom w:type="dxa" w:w="30"/>
+              <w:right w:type="dxa" w:w="70"/>
+            </w:tcMar>
+            <w:vAlign w:val="center"/>
+          </w:tcPr>
+          <w:p>
+            <w:pPr>
+              <w:spacing w:after="0" w:line="240"/>
+              <w:jc w:val="left"/>
+            </w:pPr>
+            <w:r>
+              <w:rPr>
+                <w:rFonts w:ascii="Times New Roman" w:cs="Times New Roman" w:eastAsia="Times New Roman" w:hAnsi="Times New Roman"/>
+                <w:b/>
+                <w:bCs/>
+                <w:color w:val="000000"/>
+                <w:sz w:val="20"/>
+                <w:szCs w:val="20"/>
+              </w:rPr>
+              <w:t xml:space="preserve">Confusão</w:t>
+            </w:r>
+          </w:p>
+        </w:tc>
+        <w:tc>
+          <w:tcPr>
+            <w:tcW w:type="dxa" w:w="1400"/>
+            <w:tcBorders>
+              <w:top w:val="none"/>
+              <w:left w:val="none"/>
+              <w:bottom w:val="none"/>
+              <w:right w:val="none"/>
+            </w:tcBorders>
+            <w:tcMar>
+              <w:top w:type="dxa" w:w="30"/>
+              <w:left w:type="dxa" w:w="70"/>
+              <w:bottom w:type="dxa" w:w="30"/>
+              <w:right w:type="dxa" w:w="70"/>
+            </w:tcMar>
+            <w:vAlign w:val="center"/>
+          </w:tcPr>
+          <w:p>
+            <w:pPr>
+              <w:spacing w:after="0" w:line="240"/>
+              <w:jc w:val="center"/>
+            </w:pPr>
+            <w:r>
+              <w:rPr>
+                <w:rFonts w:ascii="Times New Roman" w:cs="Times New Roman" w:eastAsia="Times New Roman" w:hAnsi="Times New Roman"/>
+                <w:color w:val="000000"/>
+                <w:sz w:val="20"/>
+                <w:szCs w:val="20"/>
+              </w:rPr>
+              <w:t xml:space="preserve">0,068</w:t>
+            </w:r>
+          </w:p>
+        </w:tc>
+        <w:tc>
+          <w:tcPr>
+            <w:tcW w:type="dxa" w:w="1400"/>
+            <w:tcBorders>
+              <w:top w:val="none"/>
+              <w:left w:val="none"/>
+              <w:bottom w:val="none"/>
+              <w:right w:val="none"/>
+            </w:tcBorders>
+            <w:tcMar>
+              <w:top w:type="dxa" w:w="30"/>
+              <w:left w:type="dxa" w:w="70"/>
+              <w:bottom w:type="dxa" w:w="30"/>
+              <w:right w:type="dxa" w:w="70"/>
+            </w:tcMar>
+            <w:vAlign w:val="center"/>
+          </w:tcPr>
+          <w:p>
+            <w:pPr>
+              <w:spacing w:after="0" w:line="240"/>
+              <w:jc w:val="center"/>
+            </w:pPr>
+            <w:r>
+              <w:rPr>
+                <w:rFonts w:ascii="Times New Roman" w:cs="Times New Roman" w:eastAsia="Times New Roman" w:hAnsi="Times New Roman"/>
+                <w:color w:val="3f3f3f"/>
+                <w:sz w:val="20"/>
+                <w:szCs w:val="20"/>
+              </w:rPr>
+              <w:t xml:space="preserve">0,119</w:t>
+            </w:r>
+          </w:p>
+        </w:tc>
+        <w:tc>
+          <w:tcPr>
+            <w:tcW w:type="dxa" w:w="1400"/>
+            <w:tcBorders>
+              <w:top w:val="none"/>
+              <w:left w:val="none"/>
+              <w:bottom w:val="none"/>
+              <w:right w:val="none"/>
+            </w:tcBorders>
+            <w:tcMar>
+              <w:top w:type="dxa" w:w="30"/>
+              <w:left w:type="dxa" w:w="70"/>
+              <w:bottom w:type="dxa" w:w="30"/>
+              <w:right w:type="dxa" w:w="70"/>
+            </w:tcMar>
+            <w:vAlign w:val="center"/>
+          </w:tcPr>
+          <w:p>
+            <w:pPr>
+              <w:spacing w:after="0" w:line="240"/>
+              <w:jc w:val="center"/>
+            </w:pPr>
+            <w:r>
+              <w:rPr>
+                <w:rFonts w:ascii="Times New Roman" w:cs="Times New Roman" w:eastAsia="Times New Roman" w:hAnsi="Times New Roman"/>
+                <w:color w:val="3f3f3f"/>
+                <w:sz w:val="20"/>
+                <w:szCs w:val="20"/>
+              </w:rPr>
+              <w:t xml:space="preserve">0,476</w:t>
+            </w:r>
+          </w:p>
+        </w:tc>
+        <w:tc>
+          <w:tcPr>
+            <w:tcW w:type="dxa" w:w="1705"/>
+            <w:tcBorders>
+              <w:top w:val="none"/>
+              <w:left w:val="none"/>
+              <w:bottom w:val="none"/>
+              <w:right w:val="none"/>
+            </w:tcBorders>
+            <w:tcMar>
+              <w:top w:type="dxa" w:w="30"/>
+              <w:left w:type="dxa" w:w="70"/>
+              <w:bottom w:type="dxa" w:w="30"/>
+              <w:right w:type="dxa" w:w="70"/>
+            </w:tcMar>
+            <w:vAlign w:val="center"/>
+          </w:tcPr>
+          <w:p>
+            <w:pPr>
+              <w:spacing w:after="0" w:line="240"/>
+              <w:jc w:val="center"/>
+            </w:pPr>
+            <w:r>
+              <w:rPr>
+                <w:rFonts w:ascii="Times New Roman" w:cs="Times New Roman" w:eastAsia="Times New Roman" w:hAnsi="Times New Roman"/>
+                <w:b w:val="false"/>
+                <w:bCs w:val="false"/>
+                <w:color w:val="3f3f3f"/>
+                <w:sz w:val="20"/>
+                <w:szCs w:val="20"/>
+              </w:rPr>
+              <w:t xml:space="preserve">não</w:t>
+            </w:r>
+          </w:p>
+        </w:tc>
+      </w:tr>
+      <w:tr>
+        <w:tc>
+          <w:tcPr>
+            <w:tcW w:type="dxa" w:w="1700"/>
+            <w:tcBorders>
+              <w:top w:val="none"/>
+              <w:left w:val="none"/>
+              <w:bottom w:val="none"/>
+              <w:right w:val="none"/>
+            </w:tcBorders>
+            <w:tcMar>
+              <w:top w:type="dxa" w:w="30"/>
+              <w:left w:type="dxa" w:w="70"/>
+              <w:bottom w:type="dxa" w:w="30"/>
+              <w:right w:type="dxa" w:w="70"/>
+            </w:tcMar>
+            <w:vAlign w:val="center"/>
+          </w:tcPr>
+          <w:p>
+            <w:pPr>
+              <w:spacing w:after="0" w:line="240"/>
+              <w:jc w:val="left"/>
+            </w:pPr>
+            <w:r>
+              <w:rPr>
+                <w:rFonts w:ascii="Times New Roman" w:cs="Times New Roman" w:eastAsia="Times New Roman" w:hAnsi="Times New Roman"/>
+                <w:color w:val="000000"/>
+                <w:sz w:val="20"/>
+                <w:szCs w:val="20"/>
+              </w:rPr>
+              <w:t xml:space="preserve">Friedman</w:t>
+            </w:r>
+          </w:p>
+        </w:tc>
+        <w:tc>
+          <w:tcPr>
+            <w:tcW w:type="dxa" w:w="1900"/>
+            <w:tcBorders>
+              <w:top w:val="none"/>
+              <w:left w:val="none"/>
+              <w:bottom w:val="none"/>
+              <w:right w:val="none"/>
+            </w:tcBorders>
+            <w:tcMar>
+              <w:top w:type="dxa" w:w="30"/>
+              <w:left w:type="dxa" w:w="70"/>
+              <w:bottom w:type="dxa" w:w="30"/>
+              <w:right w:type="dxa" w:w="70"/>
+            </w:tcMar>
+            <w:vAlign w:val="center"/>
+          </w:tcPr>
+          <w:p>
+            <w:pPr>
+              <w:spacing w:after="0" w:line="240"/>
+              <w:jc w:val="left"/>
+            </w:pPr>
+            <w:r>
+              <w:rPr>
+                <w:rFonts w:ascii="Times New Roman" w:cs="Times New Roman" w:eastAsia="Times New Roman" w:hAnsi="Times New Roman"/>
+                <w:b/>
+                <w:bCs/>
+                <w:color w:val="000000"/>
+                <w:sz w:val="20"/>
+                <w:szCs w:val="20"/>
+              </w:rPr>
+              <w:t xml:space="preserve">Confusão</w:t>
+            </w:r>
+          </w:p>
+        </w:tc>
+        <w:tc>
+          <w:tcPr>
+            <w:tcW w:type="dxa" w:w="1400"/>
+            <w:tcBorders>
+              <w:top w:val="none"/>
+              <w:left w:val="none"/>
+              <w:bottom w:val="none"/>
+              <w:right w:val="none"/>
+            </w:tcBorders>
+            <w:tcMar>
+              <w:top w:type="dxa" w:w="30"/>
+              <w:left w:type="dxa" w:w="70"/>
+              <w:bottom w:type="dxa" w:w="30"/>
+              <w:right w:type="dxa" w:w="70"/>
+            </w:tcMar>
+            <w:vAlign w:val="center"/>
+          </w:tcPr>
+          <w:p>
+            <w:pPr>
+              <w:spacing w:after="0" w:line="240"/>
+              <w:jc w:val="center"/>
+            </w:pPr>
+            <w:r>
+              <w:rPr>
+                <w:rFonts w:ascii="Times New Roman" w:cs="Times New Roman" w:eastAsia="Times New Roman" w:hAnsi="Times New Roman"/>
+                <w:color w:val="000000"/>
+                <w:sz w:val="20"/>
+                <w:szCs w:val="20"/>
+              </w:rPr>
+              <w:t xml:space="preserve">&lt; 0,001</w:t>
+            </w:r>
+          </w:p>
+        </w:tc>
+        <w:tc>
+          <w:tcPr>
+            <w:tcW w:type="dxa" w:w="1400"/>
+            <w:tcBorders>
+              <w:top w:val="none"/>
+              <w:left w:val="none"/>
+              <w:bottom w:val="none"/>
+              <w:right w:val="none"/>
+            </w:tcBorders>
+            <w:tcMar>
+              <w:top w:type="dxa" w:w="30"/>
+              <w:left w:type="dxa" w:w="70"/>
+              <w:bottom w:type="dxa" w:w="30"/>
+              <w:right w:type="dxa" w:w="70"/>
+            </w:tcMar>
+            <w:vAlign w:val="center"/>
+          </w:tcPr>
+          <w:p>
+            <w:pPr>
+              <w:spacing w:after="0" w:line="240"/>
+              <w:jc w:val="center"/>
+            </w:pPr>
+            <w:r>
+              <w:rPr>
+                <w:rFonts w:ascii="Times New Roman" w:cs="Times New Roman" w:eastAsia="Times New Roman" w:hAnsi="Times New Roman"/>
+                <w:color w:val="1b7a3d"/>
+                <w:sz w:val="20"/>
+                <w:szCs w:val="20"/>
+              </w:rPr>
+              <w:t xml:space="preserve">&lt; 0,001</w:t>
+            </w:r>
+          </w:p>
+        </w:tc>
+        <w:tc>
+          <w:tcPr>
+            <w:tcW w:type="dxa" w:w="1400"/>
+            <w:tcBorders>
+              <w:top w:val="none"/>
+              <w:left w:val="none"/>
+              <w:bottom w:val="none"/>
+              <w:right w:val="none"/>
+            </w:tcBorders>
+            <w:tcMar>
+              <w:top w:type="dxa" w:w="30"/>
+              <w:left w:type="dxa" w:w="70"/>
+              <w:bottom w:type="dxa" w:w="30"/>
+              <w:right w:type="dxa" w:w="70"/>
+            </w:tcMar>
+            <w:vAlign w:val="center"/>
+          </w:tcPr>
+          <w:p>
+            <w:pPr>
+              <w:spacing w:after="0" w:line="240"/>
+              <w:jc w:val="center"/>
+            </w:pPr>
+            <w:r>
+              <w:rPr>
+                <w:rFonts w:ascii="Times New Roman" w:cs="Times New Roman" w:eastAsia="Times New Roman" w:hAnsi="Times New Roman"/>
+                <w:color w:val="1b7a3d"/>
+                <w:sz w:val="20"/>
+                <w:szCs w:val="20"/>
+              </w:rPr>
+              <w:t xml:space="preserve">&lt; 0,001</w:t>
+            </w:r>
+          </w:p>
+        </w:tc>
+        <w:tc>
+          <w:tcPr>
+            <w:tcW w:type="dxa" w:w="1705"/>
+            <w:tcBorders>
+              <w:top w:val="none"/>
+              <w:left w:val="none"/>
+              <w:bottom w:val="none"/>
+              <w:right w:val="none"/>
+            </w:tcBorders>
+            <w:tcMar>
+              <w:top w:type="dxa" w:w="30"/>
+              <w:left w:type="dxa" w:w="70"/>
+              <w:bottom w:type="dxa" w:w="30"/>
+              <w:right w:type="dxa" w:w="70"/>
+            </w:tcMar>
+            <w:vAlign w:val="center"/>
+          </w:tcPr>
+          <w:p>
+            <w:pPr>
+              <w:spacing w:after="0" w:line="240"/>
+              <w:jc w:val="center"/>
+            </w:pPr>
+            <w:r>
+              <w:rPr>
+                <w:rFonts w:ascii="Times New Roman" w:cs="Times New Roman" w:eastAsia="Times New Roman" w:hAnsi="Times New Roman"/>
+                <w:b/>
+                <w:bCs/>
+                <w:color w:val="1b7a3d"/>
+                <w:sz w:val="20"/>
+                <w:szCs w:val="20"/>
+              </w:rPr>
+              <w:t xml:space="preserve">Bonferroni</w:t>
+            </w:r>
+          </w:p>
+        </w:tc>
+      </w:tr>
+      <w:tr>
+        <w:tc>
+          <w:tcPr>
+            <w:tcW w:type="dxa" w:w="1700"/>
+            <w:tcBorders>
+              <w:top w:val="none"/>
+              <w:left w:val="none"/>
+              <w:bottom w:val="none"/>
+              <w:right w:val="none"/>
+            </w:tcBorders>
+            <w:tcMar>
+              <w:top w:type="dxa" w:w="30"/>
+              <w:left w:type="dxa" w:w="70"/>
+              <w:bottom w:type="dxa" w:w="30"/>
+              <w:right w:type="dxa" w:w="70"/>
+            </w:tcMar>
+            <w:vAlign w:val="center"/>
+          </w:tcPr>
+          <w:p>
+            <w:pPr>
+              <w:spacing w:after="0" w:line="240"/>
+              <w:jc w:val="left"/>
+            </w:pPr>
+            <w:r>
+              <w:rPr>
+                <w:rFonts w:ascii="Times New Roman" w:cs="Times New Roman" w:eastAsia="Times New Roman" w:hAnsi="Times New Roman"/>
+                <w:color w:val="000000"/>
+                <w:sz w:val="20"/>
+                <w:szCs w:val="20"/>
+              </w:rPr>
+              <w:t xml:space="preserve">Wilcoxon</w:t>
+            </w:r>
+          </w:p>
+        </w:tc>
+        <w:tc>
+          <w:tcPr>
+            <w:tcW w:type="dxa" w:w="1900"/>
+            <w:tcBorders>
+              <w:top w:val="none"/>
+              <w:left w:val="none"/>
+              <w:bottom w:val="none"/>
+              <w:right w:val="none"/>
+            </w:tcBorders>
+            <w:tcMar>
+              <w:top w:type="dxa" w:w="30"/>
+              <w:left w:type="dxa" w:w="70"/>
+              <w:bottom w:type="dxa" w:w="30"/>
+              <w:right w:type="dxa" w:w="70"/>
+            </w:tcMar>
+            <w:vAlign w:val="center"/>
+          </w:tcPr>
+          <w:p>
+            <w:pPr>
+              <w:spacing w:after="0" w:line="240"/>
+              <w:jc w:val="left"/>
+            </w:pPr>
+            <w:r>
+              <w:rPr>
+                <w:rFonts w:ascii="Times New Roman" w:cs="Times New Roman" w:eastAsia="Times New Roman" w:hAnsi="Times New Roman"/>
+                <w:b/>
+                <w:bCs/>
+                <w:color w:val="000000"/>
+                <w:sz w:val="20"/>
+                <w:szCs w:val="20"/>
+              </w:rPr>
+              <w:t xml:space="preserve">PTH</w:t>
+            </w:r>
+          </w:p>
+        </w:tc>
+        <w:tc>
+          <w:tcPr>
+            <w:tcW w:type="dxa" w:w="1400"/>
+            <w:tcBorders>
+              <w:top w:val="none"/>
+              <w:left w:val="none"/>
+              <w:bottom w:val="none"/>
+              <w:right w:val="none"/>
+            </w:tcBorders>
+            <w:tcMar>
+              <w:top w:type="dxa" w:w="30"/>
+              <w:left w:type="dxa" w:w="70"/>
+              <w:bottom w:type="dxa" w:w="30"/>
+              <w:right w:type="dxa" w:w="70"/>
+            </w:tcMar>
+            <w:vAlign w:val="center"/>
+          </w:tcPr>
+          <w:p>
+            <w:pPr>
+              <w:spacing w:after="0" w:line="240"/>
+              <w:jc w:val="center"/>
+            </w:pPr>
+            <w:r>
+              <w:rPr>
+                <w:rFonts w:ascii="Times New Roman" w:cs="Times New Roman" w:eastAsia="Times New Roman" w:hAnsi="Times New Roman"/>
+                <w:color w:val="000000"/>
+                <w:sz w:val="20"/>
+                <w:szCs w:val="20"/>
+              </w:rPr>
+              <w:t xml:space="preserve">0,104</w:t>
+            </w:r>
+          </w:p>
+        </w:tc>
+        <w:tc>
+          <w:tcPr>
+            <w:tcW w:type="dxa" w:w="1400"/>
+            <w:tcBorders>
+              <w:top w:val="none"/>
+              <w:left w:val="none"/>
+              <w:bottom w:val="none"/>
+              <w:right w:val="none"/>
+            </w:tcBorders>
+            <w:tcMar>
+              <w:top w:type="dxa" w:w="30"/>
+              <w:left w:type="dxa" w:w="70"/>
+              <w:bottom w:type="dxa" w:w="30"/>
+              <w:right w:type="dxa" w:w="70"/>
+            </w:tcMar>
+            <w:vAlign w:val="center"/>
+          </w:tcPr>
+          <w:p>
+            <w:pPr>
+              <w:spacing w:after="0" w:line="240"/>
+              <w:jc w:val="center"/>
+            </w:pPr>
+            <w:r>
+              <w:rPr>
+                <w:rFonts w:ascii="Times New Roman" w:cs="Times New Roman" w:eastAsia="Times New Roman" w:hAnsi="Times New Roman"/>
+                <w:color w:val="3f3f3f"/>
+                <w:sz w:val="20"/>
+                <w:szCs w:val="20"/>
+              </w:rPr>
+              <w:t xml:space="preserve">0,146</w:t>
+            </w:r>
+          </w:p>
+        </w:tc>
+        <w:tc>
+          <w:tcPr>
+            <w:tcW w:type="dxa" w:w="1400"/>
+            <w:tcBorders>
+              <w:top w:val="none"/>
+              <w:left w:val="none"/>
+              <w:bottom w:val="none"/>
+              <w:right w:val="none"/>
+            </w:tcBorders>
+            <w:tcMar>
+              <w:top w:type="dxa" w:w="30"/>
+              <w:left w:type="dxa" w:w="70"/>
+              <w:bottom w:type="dxa" w:w="30"/>
+              <w:right w:type="dxa" w:w="70"/>
+            </w:tcMar>
+            <w:vAlign w:val="center"/>
+          </w:tcPr>
+          <w:p>
+            <w:pPr>
+              <w:spacing w:after="0" w:line="240"/>
+              <w:jc w:val="center"/>
+            </w:pPr>
+            <w:r>
+              <w:rPr>
+                <w:rFonts w:ascii="Times New Roman" w:cs="Times New Roman" w:eastAsia="Times New Roman" w:hAnsi="Times New Roman"/>
+                <w:color w:val="3f3f3f"/>
+                <w:sz w:val="20"/>
+                <w:szCs w:val="20"/>
+              </w:rPr>
+              <w:t xml:space="preserve">0,728</w:t>
+            </w:r>
+          </w:p>
+        </w:tc>
+        <w:tc>
+          <w:tcPr>
+            <w:tcW w:type="dxa" w:w="1705"/>
+            <w:tcBorders>
+              <w:top w:val="none"/>
+              <w:left w:val="none"/>
+              <w:bottom w:val="none"/>
+              <w:right w:val="none"/>
+            </w:tcBorders>
+            <w:tcMar>
+              <w:top w:type="dxa" w:w="30"/>
+              <w:left w:type="dxa" w:w="70"/>
+              <w:bottom w:type="dxa" w:w="30"/>
+              <w:right w:type="dxa" w:w="70"/>
+            </w:tcMar>
+            <w:vAlign w:val="center"/>
+          </w:tcPr>
+          <w:p>
+            <w:pPr>
+              <w:spacing w:after="0" w:line="240"/>
+              <w:jc w:val="center"/>
+            </w:pPr>
+            <w:r>
+              <w:rPr>
+                <w:rFonts w:ascii="Times New Roman" w:cs="Times New Roman" w:eastAsia="Times New Roman" w:hAnsi="Times New Roman"/>
+                <w:b w:val="false"/>
+                <w:bCs w:val="false"/>
+                <w:color w:val="3f3f3f"/>
+                <w:sz w:val="20"/>
+                <w:szCs w:val="20"/>
+              </w:rPr>
+              <w:t xml:space="preserve">não</w:t>
+            </w:r>
+          </w:p>
+        </w:tc>
+      </w:tr>
+      <w:tr>
+        <w:tc>
+          <w:tcPr>
+            <w:tcW w:type="dxa" w:w="1700"/>
+            <w:tcBorders>
+              <w:top w:val="none"/>
+              <w:left w:val="none"/>
+              <w:bottom w:val="single" w:color="000000" w:sz="6"/>
+              <w:right w:val="none"/>
+            </w:tcBorders>
+            <w:tcMar>
+              <w:top w:type="dxa" w:w="30"/>
+              <w:left w:type="dxa" w:w="70"/>
+              <w:bottom w:type="dxa" w:w="30"/>
+              <w:right w:type="dxa" w:w="70"/>
+            </w:tcMar>
+            <w:vAlign w:val="center"/>
+          </w:tcPr>
+          <w:p>
+            <w:pPr>
+              <w:spacing w:after="0" w:line="240"/>
+              <w:jc w:val="left"/>
+            </w:pPr>
+            <w:r>
+              <w:rPr>
+                <w:rFonts w:ascii="Times New Roman" w:cs="Times New Roman" w:eastAsia="Times New Roman" w:hAnsi="Times New Roman"/>
+                <w:color w:val="000000"/>
+                <w:sz w:val="20"/>
+                <w:szCs w:val="20"/>
+              </w:rPr>
+              <w:t xml:space="preserve">Friedman</w:t>
+            </w:r>
+          </w:p>
+        </w:tc>
+        <w:tc>
+          <w:tcPr>
+            <w:tcW w:type="dxa" w:w="1900"/>
+            <w:tcBorders>
+              <w:top w:val="none"/>
+              <w:left w:val="none"/>
+              <w:bottom w:val="single" w:color="000000" w:sz="6"/>
+              <w:right w:val="none"/>
+            </w:tcBorders>
+            <w:tcMar>
+              <w:top w:type="dxa" w:w="30"/>
+              <w:left w:type="dxa" w:w="70"/>
+              <w:bottom w:type="dxa" w:w="30"/>
+              <w:right w:type="dxa" w:w="70"/>
+            </w:tcMar>
+            <w:vAlign w:val="center"/>
+          </w:tcPr>
+          <w:p>
+            <w:pPr>
+              <w:spacing w:after="0" w:line="240"/>
+              <w:jc w:val="left"/>
+            </w:pPr>
+            <w:r>
+              <w:rPr>
+                <w:rFonts w:ascii="Times New Roman" w:cs="Times New Roman" w:eastAsia="Times New Roman" w:hAnsi="Times New Roman"/>
+                <w:b/>
+                <w:bCs/>
+                <w:color w:val="000000"/>
+                <w:sz w:val="20"/>
+                <w:szCs w:val="20"/>
+              </w:rPr>
+              <w:t xml:space="preserve">PTH</w:t>
+            </w:r>
+          </w:p>
+        </w:tc>
+        <w:tc>
+          <w:tcPr>
+            <w:tcW w:type="dxa" w:w="1400"/>
+            <w:tcBorders>
+              <w:top w:val="none"/>
+              <w:left w:val="none"/>
+              <w:bottom w:val="single" w:color="000000" w:sz="6"/>
+              <w:right w:val="none"/>
+            </w:tcBorders>
+            <w:tcMar>
+              <w:top w:type="dxa" w:w="30"/>
+              <w:left w:type="dxa" w:w="70"/>
+              <w:bottom w:type="dxa" w:w="30"/>
+              <w:right w:type="dxa" w:w="70"/>
+            </w:tcMar>
+            <w:vAlign w:val="center"/>
+          </w:tcPr>
+          <w:p>
+            <w:pPr>
+              <w:spacing w:after="0" w:line="240"/>
+              <w:jc w:val="center"/>
+            </w:pPr>
+            <w:r>
+              <w:rPr>
+                <w:rFonts w:ascii="Times New Roman" w:cs="Times New Roman" w:eastAsia="Times New Roman" w:hAnsi="Times New Roman"/>
+                <w:color w:val="000000"/>
+                <w:sz w:val="20"/>
+                <w:szCs w:val="20"/>
+              </w:rPr>
+              <w:t xml:space="preserve">0,269</w:t>
+            </w:r>
+          </w:p>
+        </w:tc>
+        <w:tc>
+          <w:tcPr>
+            <w:tcW w:type="dxa" w:w="1400"/>
+            <w:tcBorders>
+              <w:top w:val="none"/>
+              <w:left w:val="none"/>
+              <w:bottom w:val="single" w:color="000000" w:sz="6"/>
+              <w:right w:val="none"/>
+            </w:tcBorders>
+            <w:tcMar>
+              <w:top w:type="dxa" w:w="30"/>
+              <w:left w:type="dxa" w:w="70"/>
+              <w:bottom w:type="dxa" w:w="30"/>
+              <w:right w:type="dxa" w:w="70"/>
+            </w:tcMar>
+            <w:vAlign w:val="center"/>
+          </w:tcPr>
+          <w:p>
+            <w:pPr>
+              <w:spacing w:after="0" w:line="240"/>
+              <w:jc w:val="center"/>
+            </w:pPr>
+            <w:r>
+              <w:rPr>
+                <w:rFonts w:ascii="Times New Roman" w:cs="Times New Roman" w:eastAsia="Times New Roman" w:hAnsi="Times New Roman"/>
+                <w:color w:val="3f3f3f"/>
+                <w:sz w:val="20"/>
+                <w:szCs w:val="20"/>
+              </w:rPr>
+              <w:t xml:space="preserve">0,314</w:t>
+            </w:r>
+          </w:p>
+        </w:tc>
+        <w:tc>
+          <w:tcPr>
+            <w:tcW w:type="dxa" w:w="1400"/>
+            <w:tcBorders>
+              <w:top w:val="none"/>
+              <w:left w:val="none"/>
+              <w:bottom w:val="single" w:color="000000" w:sz="6"/>
+              <w:right w:val="none"/>
+            </w:tcBorders>
+            <w:tcMar>
+              <w:top w:type="dxa" w:w="30"/>
+              <w:left w:type="dxa" w:w="70"/>
+              <w:bottom w:type="dxa" w:w="30"/>
+              <w:right w:type="dxa" w:w="70"/>
+            </w:tcMar>
+            <w:vAlign w:val="center"/>
+          </w:tcPr>
+          <w:p>
+            <w:pPr>
+              <w:spacing w:after="0" w:line="240"/>
+              <w:jc w:val="center"/>
+            </w:pPr>
+            <w:r>
+              <w:rPr>
+                <w:rFonts w:ascii="Times New Roman" w:cs="Times New Roman" w:eastAsia="Times New Roman" w:hAnsi="Times New Roman"/>
+                <w:color w:val="3f3f3f"/>
+                <w:sz w:val="20"/>
+                <w:szCs w:val="20"/>
+              </w:rPr>
+              <w:t xml:space="preserve">1,000</w:t>
+            </w:r>
+          </w:p>
+        </w:tc>
+        <w:tc>
+          <w:tcPr>
+            <w:tcW w:type="dxa" w:w="1705"/>
+            <w:tcBorders>
+              <w:top w:val="none"/>
+              <w:left w:val="none"/>
+              <w:bottom w:val="single" w:color="000000" w:sz="6"/>
+              <w:right w:val="none"/>
+            </w:tcBorders>
+            <w:tcMar>
+              <w:top w:type="dxa" w:w="30"/>
+              <w:left w:type="dxa" w:w="70"/>
+              <w:bottom w:type="dxa" w:w="30"/>
+              <w:right w:type="dxa" w:w="70"/>
+            </w:tcMar>
+            <w:vAlign w:val="center"/>
+          </w:tcPr>
+          <w:p>
+            <w:pPr>
+              <w:spacing w:after="0" w:line="240"/>
+              <w:jc w:val="center"/>
+            </w:pPr>
+            <w:r>
+              <w:rPr>
+                <w:rFonts w:ascii="Times New Roman" w:cs="Times New Roman" w:eastAsia="Times New Roman" w:hAnsi="Times New Roman"/>
+                <w:b w:val="false"/>
+                <w:bCs w:val="false"/>
+                <w:color w:val="3f3f3f"/>
+                <w:sz w:val="20"/>
+                <w:szCs w:val="20"/>
+              </w:rPr>
+              <w:t xml:space="preserve">não</w:t>
+            </w:r>
+          </w:p>
+        </w:tc>
+      </w:tr>
+    </w:tbl>
+    <w:p>
+      <w:pPr>
+        <w:spacing w:after="180" w:before="40" w:line="240"/>
+        <w:jc w:val="left"/>
+      </w:pPr>
+      <w:r>
+        <w:rPr>
+          <w:rFonts w:ascii="Times New Roman" w:cs="Times New Roman" w:eastAsia="Times New Roman" w:hAnsi="Times New Roman"/>
+          <w:color w:val="3f3f3f"/>
+          <w:sz w:val="20"/>
+          <w:szCs w:val="20"/>
+        </w:rPr>
+        <w:t xml:space="preserve">Nota: FDR = Benjamini-Hochberg; correção aplicada dentro de cada família. Dos 14 testes, 7 são significativos sem correção, 4 sobrevivem ao FDR e 3 ao Bonferroni. Fonte: Dados da pesquisa (2026).</w:t>
+      </w:r>
+    </w:p>
+    <w:p>
+      <w:pPr>
+        <w:spacing w:after="0" w:before="0" w:line="360" w:lineRule="auto"/>
+        <w:ind w:firstLine="709"/>
+        <w:jc w:val="both"/>
+      </w:pPr>
+      <w:r>
+        <w:rPr>
+          <w:rFonts w:ascii="Times New Roman" w:cs="Times New Roman" w:eastAsia="Times New Roman" w:hAnsi="Times New Roman"/>
+          <w:color w:val="000000"/>
+          <w:sz w:val="24"/>
+          <w:szCs w:val="24"/>
+        </w:rPr>
+        <w:t xml:space="preserve">O resultado da correção reforça o núcleo do estudo. Os efeitos que resistem concentram-se no eixo energético, isto é, no vigor e na fadiga, e em dimensões de padrão semanal forte, ao passo que os efeitos afetivos, pequenos e numerosos, não sobrevivem, o que recomenda lê-los como tendência convergente, e não como achados isolados.</w:t>
+      </w:r>
+    </w:p>
+    <w:p>
+      <w:pPr>
+        <w:keepNext/>
+        <w:spacing w:after="90" w:before="200" w:line="360" w:lineRule="auto"/>
+      </w:pPr>
+      <w:r>
+        <w:rPr>
+          <w:rFonts w:ascii="Times New Roman" w:cs="Times New Roman" w:eastAsia="Times New Roman" w:hAnsi="Times New Roman"/>
+          <w:b/>
+          <w:bCs/>
+          <w:color w:val="000000"/>
+          <w:sz w:val="24"/>
+          <w:szCs w:val="24"/>
+        </w:rPr>
+        <w:t xml:space="preserve">7.5 Rede psicométrica e dinâmica defasada</w:t>
+      </w:r>
+    </w:p>
+    <w:p>
+      <w:pPr>
+        <w:spacing w:after="0" w:before="0" w:line="360" w:lineRule="auto"/>
+        <w:ind w:firstLine="709"/>
+        <w:jc w:val="both"/>
+      </w:pPr>
+      <w:r>
+        <w:rPr>
+          <w:rFonts w:ascii="Times New Roman" w:cs="Times New Roman" w:eastAsia="Times New Roman" w:hAnsi="Times New Roman"/>
+          <w:color w:val="000000"/>
+          <w:sz w:val="24"/>
+          <w:szCs w:val="24"/>
+        </w:rPr>
+        <w:t xml:space="preserve">Duas leituras complementam a análise multivariada e o modelo autorregressivo. A rede gaussiana estima as correlações parciais entre as dimensões, a sonolência e o estresse, ou seja, a associação entre duas medidas quando se controlam todas as demais, o que revela as ligações diretas. A Figura 20 apresenta essa rede, na qual as arestas verdes indicam associação positiva e as vermelhas, negativa, com espessura proporcional à força. As dimensões negativas ligam-se entre si, com destaque para o par depressão e confusão, e o vigor liga-se de modo negativo à fadiga e à sonolência, o que reproduz o eixo de energia e perturbação na forma de rede de dependências diretas.</w:t>
+      </w:r>
+    </w:p>
+    <w:p>
+      <w:pPr>
+        <w:keepNext/>
+        <w:spacing w:after="40" w:before="160" w:line="240"/>
+        <w:jc w:val="center"/>
+      </w:pPr>
+      <w:r>
+        <w:rPr>
+          <w:rFonts w:ascii="Times New Roman" w:cs="Times New Roman" w:eastAsia="Times New Roman" w:hAnsi="Times New Roman"/>
+          <w:b/>
+          <w:bCs/>
+          <w:color w:val="000000"/>
+          <w:sz w:val="20"/>
+          <w:szCs w:val="20"/>
+        </w:rPr>
+        <w:t xml:space="preserve">Figura 20</w:t>
+      </w:r>
+      <w:r>
+        <w:rPr>
+          <w:rFonts w:ascii="Times New Roman" w:cs="Times New Roman" w:eastAsia="Times New Roman" w:hAnsi="Times New Roman"/>
+          <w:color w:val="000000"/>
+          <w:sz w:val="20"/>
+          <w:szCs w:val="20"/>
+        </w:rPr>
+        <w:t xml:space="preserve"> – Rede de correlações parciais entre as dimensões do humor, a sonolência e o estresse</w:t>
+      </w:r>
+    </w:p>
+    <w:p>
+      <w:pPr>
+        <w:spacing w:after="0" w:before="40"/>
+        <w:jc w:val="center"/>
+      </w:pPr>
+      <w:r>
+        <w:drawing>
+          <wp:inline distT="0" distB="0" distL="0" distR="0">
+            <wp:extent cx="4953000" cy="2914650"/>
+            <wp:effectExtent t="0" r="0" b="0" l="0"/>
+            <wp:docPr id="1" name="" descr="" title=""/>
+            <wp:cNvGraphicFramePr>
+              <a:graphicFrameLocks xmlns:a="http://schemas.openxmlformats.org/drawingml/2006/main" noChangeAspect="1"/>
+            </wp:cNvGraphicFramePr>
+            <a:graphic xmlns:a="http://schemas.openxmlformats.org/drawingml/2006/main">
+              <a:graphicData uri="http://schemas.openxmlformats.org/drawingml/2006/picture">
+                <pic:pic xmlns:pic="http://schemas.openxmlformats.org/drawingml/2006/picture">
+                  <pic:nvPicPr>
+                    <pic:cNvPr id="0" name="" descr=""/>
+                    <pic:cNvPicPr>
+                      <a:picLocks noChangeAspect="1" noChangeArrowheads="1"/>
+                    </pic:cNvPicPr>
+                  </pic:nvPicPr>
+                  <pic:blipFill>
+                    <a:blip r:embed="rId27" cstate="none"/>
+                    <a:srcRect/>
+                    <a:stretch>
+                      <a:fillRect/>
+                    </a:stretch>
+                  </pic:blipFill>
+                  <pic:spPr bwMode="auto">
+                    <a:xfrm>
+                      <a:off x="0" y="0"/>
+                      <a:ext cx="4953000" cy="2914650"/>
+                    </a:xfrm>
+                    <a:prstGeom prst="rect">
+                      <a:avLst/>
+                    </a:prstGeom>
+                  </pic:spPr>
+                </pic:pic>
+              </a:graphicData>
+            </a:graphic>
+          </wp:inline>
+        </w:drawing>
+      </w:r>
+    </w:p>
+    <w:p>
+      <w:pPr>
+        <w:spacing w:after="180" w:before="40" w:line="240"/>
+        <w:jc w:val="center"/>
+      </w:pPr>
+      <w:r>
+        <w:rPr>
+          <w:rFonts w:ascii="Times New Roman" w:cs="Times New Roman" w:eastAsia="Times New Roman" w:hAnsi="Times New Roman"/>
+          <w:color w:val="3f3f3f"/>
+          <w:sz w:val="20"/>
+          <w:szCs w:val="20"/>
+        </w:rPr>
+        <w:t xml:space="preserve">Nota: aresta = correlação parcial (associação entre duas medidas com controle das demais); tamanho do nó proporcional à força na rede. Fonte: Elaborado pelos autores (2026).</w:t>
+      </w:r>
+    </w:p>
+    <w:p>
+      <w:pPr>
+        <w:keepNext/>
+        <w:spacing w:after="40" w:before="160" w:line="240"/>
+        <w:jc w:val="left"/>
+      </w:pPr>
+      <w:r>
+        <w:rPr>
+          <w:rFonts w:ascii="Times New Roman" w:cs="Times New Roman" w:eastAsia="Times New Roman" w:hAnsi="Times New Roman"/>
+          <w:b/>
+          <w:bCs/>
+          <w:color w:val="000000"/>
+          <w:sz w:val="20"/>
+          <w:szCs w:val="20"/>
+        </w:rPr>
+        <w:t xml:space="preserve">Tabela 33</w:t>
+      </w:r>
+      <w:r>
+        <w:rPr>
+          <w:rFonts w:ascii="Times New Roman" w:cs="Times New Roman" w:eastAsia="Times New Roman" w:hAnsi="Times New Roman"/>
+          <w:color w:val="000000"/>
+          <w:sz w:val="20"/>
+          <w:szCs w:val="20"/>
+        </w:rPr>
+        <w:t xml:space="preserve"> – Ligações diretas mais fortes na rede (correlações parciais)</w:t>
+      </w:r>
+    </w:p>
+    <w:tbl>
+      <w:tblPr>
+        <w:tblW w:type="dxa" w:w="9505"/>
+        <w:tblBorders>
+          <w:top w:val="single" w:color="000000" w:sz="6"/>
+          <w:left w:val="none"/>
+          <w:bottom w:val="single" w:color="000000" w:sz="6"/>
+          <w:right w:val="none"/>
+          <w:insideH w:val="none"/>
+          <w:insideV w:val="none"/>
+        </w:tblBorders>
+      </w:tblPr>
+      <w:tblGrid>
+        <w:gridCol w:w="4505"/>
+        <w:gridCol w:w="2500"/>
+        <w:gridCol w:w="2500"/>
+      </w:tblGrid>
+      <w:tr>
+        <w:trPr>
+          <w:tblHeader/>
+        </w:trPr>
+        <w:tc>
+          <w:tcPr>
+            <w:tcW w:type="dxa" w:w="4505"/>
+            <w:tcBorders>
+              <w:top w:val="single" w:color="000000" w:sz="6"/>
+              <w:left w:val="none"/>
+              <w:bottom w:val="single" w:color="000000" w:sz="6"/>
+              <w:right w:val="none"/>
+            </w:tcBorders>
+            <w:tcMar>
+              <w:top w:type="dxa" w:w="40"/>
+              <w:left w:type="dxa" w:w="70"/>
+              <w:bottom w:type="dxa" w:w="40"/>
+              <w:right w:type="dxa" w:w="70"/>
+            </w:tcMar>
+            <w:vAlign w:val="center"/>
+          </w:tcPr>
+          <w:p>
+            <w:pPr>
+              <w:spacing w:after="0" w:line="240"/>
+              <w:jc w:val="left"/>
+            </w:pPr>
+            <w:r>
+              <w:rPr>
+                <w:rFonts w:ascii="Times New Roman" w:cs="Times New Roman" w:eastAsia="Times New Roman" w:hAnsi="Times New Roman"/>
+                <w:b/>
+                <w:bCs/>
+                <w:color w:val="000000"/>
+                <w:sz w:val="20"/>
+                <w:szCs w:val="20"/>
+              </w:rPr>
+              <w:t xml:space="preserve">Par de dimensões</w:t>
+            </w:r>
+          </w:p>
+        </w:tc>
+        <w:tc>
+          <w:tcPr>
+            <w:tcW w:type="dxa" w:w="2500"/>
+            <w:tcBorders>
+              <w:top w:val="single" w:color="000000" w:sz="6"/>
+              <w:left w:val="none"/>
+              <w:bottom w:val="single" w:color="000000" w:sz="6"/>
+              <w:right w:val="none"/>
+            </w:tcBorders>
+            <w:tcMar>
+              <w:top w:type="dxa" w:w="40"/>
+              <w:left w:type="dxa" w:w="70"/>
+              <w:bottom w:type="dxa" w:w="40"/>
+              <w:right w:type="dxa" w:w="70"/>
+            </w:tcMar>
+            <w:vAlign w:val="center"/>
+          </w:tcPr>
+          <w:p>
+            <w:pPr>
+              <w:spacing w:after="0" w:line="240"/>
+              <w:jc w:val="center"/>
+            </w:pPr>
+            <w:r>
+              <w:rPr>
+                <w:rFonts w:ascii="Times New Roman" w:cs="Times New Roman" w:eastAsia="Times New Roman" w:hAnsi="Times New Roman"/>
+                <w:b/>
+                <w:bCs/>
+                <w:color w:val="000000"/>
+                <w:sz w:val="20"/>
+                <w:szCs w:val="20"/>
+              </w:rPr>
+              <w:t xml:space="preserve">Correlação parcial</w:t>
+            </w:r>
+          </w:p>
+        </w:tc>
+        <w:tc>
+          <w:tcPr>
+            <w:tcW w:type="dxa" w:w="2500"/>
+            <w:tcBorders>
+              <w:top w:val="single" w:color="000000" w:sz="6"/>
+              <w:left w:val="none"/>
+              <w:bottom w:val="single" w:color="000000" w:sz="6"/>
+              <w:right w:val="none"/>
+            </w:tcBorders>
+            <w:tcMar>
+              <w:top w:type="dxa" w:w="40"/>
+              <w:left w:type="dxa" w:w="70"/>
+              <w:bottom w:type="dxa" w:w="40"/>
+              <w:right w:type="dxa" w:w="70"/>
+            </w:tcMar>
+            <w:vAlign w:val="center"/>
+          </w:tcPr>
+          <w:p>
+            <w:pPr>
+              <w:spacing w:after="0" w:line="240"/>
+              <w:jc w:val="center"/>
+            </w:pPr>
+            <w:r>
+              <w:rPr>
+                <w:rFonts w:ascii="Times New Roman" w:cs="Times New Roman" w:eastAsia="Times New Roman" w:hAnsi="Times New Roman"/>
+                <w:b/>
+                <w:bCs/>
+                <w:color w:val="000000"/>
+                <w:sz w:val="20"/>
+                <w:szCs w:val="20"/>
+              </w:rPr>
+              <w:t xml:space="preserve">Sinal</w:t>
+            </w:r>
+          </w:p>
+        </w:tc>
+      </w:tr>
+      <w:tr>
+        <w:tc>
+          <w:tcPr>
+            <w:tcW w:type="dxa" w:w="4505"/>
+            <w:tcBorders>
+              <w:top w:val="none"/>
+              <w:left w:val="none"/>
+              <w:bottom w:val="none"/>
+              <w:right w:val="none"/>
+            </w:tcBorders>
+            <w:tcMar>
+              <w:top w:type="dxa" w:w="30"/>
+              <w:left w:type="dxa" w:w="70"/>
+              <w:bottom w:type="dxa" w:w="30"/>
+              <w:right w:type="dxa" w:w="70"/>
+            </w:tcMar>
+            <w:vAlign w:val="center"/>
+          </w:tcPr>
+          <w:p>
+            <w:pPr>
+              <w:spacing w:after="0" w:line="240"/>
+              <w:jc w:val="left"/>
+            </w:pPr>
+            <w:r>
+              <w:rPr>
+                <w:rFonts w:ascii="Times New Roman" w:cs="Times New Roman" w:eastAsia="Times New Roman" w:hAnsi="Times New Roman"/>
+                <w:b/>
+                <w:bCs/>
+                <w:color w:val="000000"/>
+                <w:sz w:val="20"/>
+                <w:szCs w:val="20"/>
+              </w:rPr>
+              <w:t xml:space="preserve">Depressão e Confusão</w:t>
+            </w:r>
+          </w:p>
+        </w:tc>
+        <w:tc>
+          <w:tcPr>
+            <w:tcW w:type="dxa" w:w="2500"/>
+            <w:tcBorders>
+              <w:top w:val="none"/>
+              <w:left w:val="none"/>
+              <w:bottom w:val="none"/>
+              <w:right w:val="none"/>
+            </w:tcBorders>
+            <w:tcMar>
+              <w:top w:type="dxa" w:w="30"/>
+              <w:left w:type="dxa" w:w="70"/>
+              <w:bottom w:type="dxa" w:w="30"/>
+              <w:right w:type="dxa" w:w="70"/>
+            </w:tcMar>
+            <w:vAlign w:val="center"/>
+          </w:tcPr>
+          <w:p>
+            <w:pPr>
+              <w:spacing w:after="0" w:line="240"/>
+              <w:jc w:val="center"/>
+            </w:pPr>
+            <w:r>
+              <w:rPr>
+                <w:rFonts w:ascii="Times New Roman" w:cs="Times New Roman" w:eastAsia="Times New Roman" w:hAnsi="Times New Roman"/>
+                <w:b/>
+                <w:bCs/>
+                <w:color w:val="1b7a3d"/>
+                <w:sz w:val="20"/>
+                <w:szCs w:val="20"/>
+              </w:rPr>
+              <w:t xml:space="preserve">+0,58</w:t>
+            </w:r>
+          </w:p>
+        </w:tc>
+        <w:tc>
+          <w:tcPr>
+            <w:tcW w:type="dxa" w:w="2500"/>
+            <w:tcBorders>
+              <w:top w:val="none"/>
+              <w:left w:val="none"/>
+              <w:bottom w:val="none"/>
+              <w:right w:val="none"/>
+            </w:tcBorders>
+            <w:tcMar>
+              <w:top w:type="dxa" w:w="30"/>
+              <w:left w:type="dxa" w:w="70"/>
+              <w:bottom w:type="dxa" w:w="30"/>
+              <w:right w:type="dxa" w:w="70"/>
+            </w:tcMar>
+            <w:vAlign w:val="center"/>
+          </w:tcPr>
+          <w:p>
+            <w:pPr>
+              <w:spacing w:after="0" w:line="240"/>
+              <w:jc w:val="center"/>
+            </w:pPr>
+            <w:r>
+              <w:rPr>
+                <w:rFonts w:ascii="Times New Roman" w:cs="Times New Roman" w:eastAsia="Times New Roman" w:hAnsi="Times New Roman"/>
+                <w:color w:val="000000"/>
+                <w:sz w:val="20"/>
+                <w:szCs w:val="20"/>
+              </w:rPr>
+              <w:t xml:space="preserve">positiva</w:t>
+            </w:r>
+          </w:p>
+        </w:tc>
+      </w:tr>
+      <w:tr>
+        <w:tc>
+          <w:tcPr>
+            <w:tcW w:type="dxa" w:w="4505"/>
+            <w:tcBorders>
+              <w:top w:val="none"/>
+              <w:left w:val="none"/>
+              <w:bottom w:val="none"/>
+              <w:right w:val="none"/>
+            </w:tcBorders>
+            <w:tcMar>
+              <w:top w:type="dxa" w:w="30"/>
+              <w:left w:type="dxa" w:w="70"/>
+              <w:bottom w:type="dxa" w:w="30"/>
+              <w:right w:type="dxa" w:w="70"/>
+            </w:tcMar>
+            <w:vAlign w:val="center"/>
+          </w:tcPr>
+          <w:p>
+            <w:pPr>
+              <w:spacing w:after="0" w:line="240"/>
+              <w:jc w:val="left"/>
+            </w:pPr>
+            <w:r>
+              <w:rPr>
+                <w:rFonts w:ascii="Times New Roman" w:cs="Times New Roman" w:eastAsia="Times New Roman" w:hAnsi="Times New Roman"/>
+                <w:b/>
+                <w:bCs/>
+                <w:color w:val="000000"/>
+                <w:sz w:val="20"/>
+                <w:szCs w:val="20"/>
+              </w:rPr>
+              <w:t xml:space="preserve">Fadiga e Raiva</w:t>
+            </w:r>
+          </w:p>
+        </w:tc>
+        <w:tc>
+          <w:tcPr>
+            <w:tcW w:type="dxa" w:w="2500"/>
+            <w:tcBorders>
+              <w:top w:val="none"/>
+              <w:left w:val="none"/>
+              <w:bottom w:val="none"/>
+              <w:right w:val="none"/>
+            </w:tcBorders>
+            <w:tcMar>
+              <w:top w:type="dxa" w:w="30"/>
+              <w:left w:type="dxa" w:w="70"/>
+              <w:bottom w:type="dxa" w:w="30"/>
+              <w:right w:type="dxa" w:w="70"/>
+            </w:tcMar>
+            <w:vAlign w:val="center"/>
+          </w:tcPr>
+          <w:p>
+            <w:pPr>
+              <w:spacing w:after="0" w:line="240"/>
+              <w:jc w:val="center"/>
+            </w:pPr>
+            <w:r>
+              <w:rPr>
+                <w:rFonts w:ascii="Times New Roman" w:cs="Times New Roman" w:eastAsia="Times New Roman" w:hAnsi="Times New Roman"/>
+                <w:b/>
+                <w:bCs/>
+                <w:color w:val="1b7a3d"/>
+                <w:sz w:val="20"/>
+                <w:szCs w:val="20"/>
+              </w:rPr>
+              <w:t xml:space="preserve">+0,30</w:t>
+            </w:r>
+          </w:p>
+        </w:tc>
+        <w:tc>
+          <w:tcPr>
+            <w:tcW w:type="dxa" w:w="2500"/>
+            <w:tcBorders>
+              <w:top w:val="none"/>
+              <w:left w:val="none"/>
+              <w:bottom w:val="none"/>
+              <w:right w:val="none"/>
+            </w:tcBorders>
+            <w:tcMar>
+              <w:top w:type="dxa" w:w="30"/>
+              <w:left w:type="dxa" w:w="70"/>
+              <w:bottom w:type="dxa" w:w="30"/>
+              <w:right w:type="dxa" w:w="70"/>
+            </w:tcMar>
+            <w:vAlign w:val="center"/>
+          </w:tcPr>
+          <w:p>
+            <w:pPr>
+              <w:spacing w:after="0" w:line="240"/>
+              <w:jc w:val="center"/>
+            </w:pPr>
+            <w:r>
+              <w:rPr>
+                <w:rFonts w:ascii="Times New Roman" w:cs="Times New Roman" w:eastAsia="Times New Roman" w:hAnsi="Times New Roman"/>
+                <w:color w:val="000000"/>
+                <w:sz w:val="20"/>
+                <w:szCs w:val="20"/>
+              </w:rPr>
+              <w:t xml:space="preserve">positiva</w:t>
+            </w:r>
+          </w:p>
+        </w:tc>
+      </w:tr>
+      <w:tr>
+        <w:tc>
+          <w:tcPr>
+            <w:tcW w:type="dxa" w:w="4505"/>
+            <w:tcBorders>
+              <w:top w:val="none"/>
+              <w:left w:val="none"/>
+              <w:bottom w:val="none"/>
+              <w:right w:val="none"/>
+            </w:tcBorders>
+            <w:tcMar>
+              <w:top w:type="dxa" w:w="30"/>
+              <w:left w:type="dxa" w:w="70"/>
+              <w:bottom w:type="dxa" w:w="30"/>
+              <w:right w:type="dxa" w:w="70"/>
+            </w:tcMar>
+            <w:vAlign w:val="center"/>
+          </w:tcPr>
+          <w:p>
+            <w:pPr>
+              <w:spacing w:after="0" w:line="240"/>
+              <w:jc w:val="left"/>
+            </w:pPr>
+            <w:r>
+              <w:rPr>
+                <w:rFonts w:ascii="Times New Roman" w:cs="Times New Roman" w:eastAsia="Times New Roman" w:hAnsi="Times New Roman"/>
+                <w:b/>
+                <w:bCs/>
+                <w:color w:val="000000"/>
+                <w:sz w:val="20"/>
+                <w:szCs w:val="20"/>
+              </w:rPr>
+              <w:t xml:space="preserve">Fadiga e Depressão</w:t>
+            </w:r>
+          </w:p>
+        </w:tc>
+        <w:tc>
+          <w:tcPr>
+            <w:tcW w:type="dxa" w:w="2500"/>
+            <w:tcBorders>
+              <w:top w:val="none"/>
+              <w:left w:val="none"/>
+              <w:bottom w:val="none"/>
+              <w:right w:val="none"/>
+            </w:tcBorders>
+            <w:tcMar>
+              <w:top w:type="dxa" w:w="30"/>
+              <w:left w:type="dxa" w:w="70"/>
+              <w:bottom w:type="dxa" w:w="30"/>
+              <w:right w:type="dxa" w:w="70"/>
+            </w:tcMar>
+            <w:vAlign w:val="center"/>
+          </w:tcPr>
+          <w:p>
+            <w:pPr>
+              <w:spacing w:after="0" w:line="240"/>
+              <w:jc w:val="center"/>
+            </w:pPr>
+            <w:r>
+              <w:rPr>
+                <w:rFonts w:ascii="Times New Roman" w:cs="Times New Roman" w:eastAsia="Times New Roman" w:hAnsi="Times New Roman"/>
+                <w:b/>
+                <w:bCs/>
+                <w:color w:val="1b7a3d"/>
+                <w:sz w:val="20"/>
+                <w:szCs w:val="20"/>
+              </w:rPr>
+              <w:t xml:space="preserve">+0,29</w:t>
+            </w:r>
+          </w:p>
+        </w:tc>
+        <w:tc>
+          <w:tcPr>
+            <w:tcW w:type="dxa" w:w="2500"/>
+            <w:tcBorders>
+              <w:top w:val="none"/>
+              <w:left w:val="none"/>
+              <w:bottom w:val="none"/>
+              <w:right w:val="none"/>
+            </w:tcBorders>
+            <w:tcMar>
+              <w:top w:type="dxa" w:w="30"/>
+              <w:left w:type="dxa" w:w="70"/>
+              <w:bottom w:type="dxa" w:w="30"/>
+              <w:right w:type="dxa" w:w="70"/>
+            </w:tcMar>
+            <w:vAlign w:val="center"/>
+          </w:tcPr>
+          <w:p>
+            <w:pPr>
+              <w:spacing w:after="0" w:line="240"/>
+              <w:jc w:val="center"/>
+            </w:pPr>
+            <w:r>
+              <w:rPr>
+                <w:rFonts w:ascii="Times New Roman" w:cs="Times New Roman" w:eastAsia="Times New Roman" w:hAnsi="Times New Roman"/>
+                <w:color w:val="000000"/>
+                <w:sz w:val="20"/>
+                <w:szCs w:val="20"/>
+              </w:rPr>
+              <w:t xml:space="preserve">positiva</w:t>
+            </w:r>
+          </w:p>
+        </w:tc>
+      </w:tr>
+      <w:tr>
+        <w:tc>
+          <w:tcPr>
+            <w:tcW w:type="dxa" w:w="4505"/>
+            <w:tcBorders>
+              <w:top w:val="none"/>
+              <w:left w:val="none"/>
+              <w:bottom w:val="none"/>
+              <w:right w:val="none"/>
+            </w:tcBorders>
+            <w:tcMar>
+              <w:top w:type="dxa" w:w="30"/>
+              <w:left w:type="dxa" w:w="70"/>
+              <w:bottom w:type="dxa" w:w="30"/>
+              <w:right w:type="dxa" w:w="70"/>
+            </w:tcMar>
+            <w:vAlign w:val="center"/>
+          </w:tcPr>
+          <w:p>
+            <w:pPr>
+              <w:spacing w:after="0" w:line="240"/>
+              <w:jc w:val="left"/>
+            </w:pPr>
+            <w:r>
+              <w:rPr>
+                <w:rFonts w:ascii="Times New Roman" w:cs="Times New Roman" w:eastAsia="Times New Roman" w:hAnsi="Times New Roman"/>
+                <w:b/>
+                <w:bCs/>
+                <w:color w:val="000000"/>
+                <w:sz w:val="20"/>
+                <w:szCs w:val="20"/>
+              </w:rPr>
+              <w:t xml:space="preserve">Vigor e Tensão</w:t>
+            </w:r>
+          </w:p>
+        </w:tc>
+        <w:tc>
+          <w:tcPr>
+            <w:tcW w:type="dxa" w:w="2500"/>
+            <w:tcBorders>
+              <w:top w:val="none"/>
+              <w:left w:val="none"/>
+              <w:bottom w:val="none"/>
+              <w:right w:val="none"/>
+            </w:tcBorders>
+            <w:tcMar>
+              <w:top w:type="dxa" w:w="30"/>
+              <w:left w:type="dxa" w:w="70"/>
+              <w:bottom w:type="dxa" w:w="30"/>
+              <w:right w:type="dxa" w:w="70"/>
+            </w:tcMar>
+            <w:vAlign w:val="center"/>
+          </w:tcPr>
+          <w:p>
+            <w:pPr>
+              <w:spacing w:after="0" w:line="240"/>
+              <w:jc w:val="center"/>
+            </w:pPr>
+            <w:r>
+              <w:rPr>
+                <w:rFonts w:ascii="Times New Roman" w:cs="Times New Roman" w:eastAsia="Times New Roman" w:hAnsi="Times New Roman"/>
+                <w:b/>
+                <w:bCs/>
+                <w:color w:val="1b7a3d"/>
+                <w:sz w:val="20"/>
+                <w:szCs w:val="20"/>
+              </w:rPr>
+              <w:t xml:space="preserve">+0,27</w:t>
+            </w:r>
+          </w:p>
+        </w:tc>
+        <w:tc>
+          <w:tcPr>
+            <w:tcW w:type="dxa" w:w="2500"/>
+            <w:tcBorders>
+              <w:top w:val="none"/>
+              <w:left w:val="none"/>
+              <w:bottom w:val="none"/>
+              <w:right w:val="none"/>
+            </w:tcBorders>
+            <w:tcMar>
+              <w:top w:type="dxa" w:w="30"/>
+              <w:left w:type="dxa" w:w="70"/>
+              <w:bottom w:type="dxa" w:w="30"/>
+              <w:right w:type="dxa" w:w="70"/>
+            </w:tcMar>
+            <w:vAlign w:val="center"/>
+          </w:tcPr>
+          <w:p>
+            <w:pPr>
+              <w:spacing w:after="0" w:line="240"/>
+              <w:jc w:val="center"/>
+            </w:pPr>
+            <w:r>
+              <w:rPr>
+                <w:rFonts w:ascii="Times New Roman" w:cs="Times New Roman" w:eastAsia="Times New Roman" w:hAnsi="Times New Roman"/>
+                <w:color w:val="000000"/>
+                <w:sz w:val="20"/>
+                <w:szCs w:val="20"/>
+              </w:rPr>
+              <w:t xml:space="preserve">positiva</w:t>
+            </w:r>
+          </w:p>
+        </w:tc>
+      </w:tr>
+      <w:tr>
+        <w:tc>
+          <w:tcPr>
+            <w:tcW w:type="dxa" w:w="4505"/>
+            <w:tcBorders>
+              <w:top w:val="none"/>
+              <w:left w:val="none"/>
+              <w:bottom w:val="none"/>
+              <w:right w:val="none"/>
+            </w:tcBorders>
+            <w:tcMar>
+              <w:top w:type="dxa" w:w="30"/>
+              <w:left w:type="dxa" w:w="70"/>
+              <w:bottom w:type="dxa" w:w="30"/>
+              <w:right w:type="dxa" w:w="70"/>
+            </w:tcMar>
+            <w:vAlign w:val="center"/>
+          </w:tcPr>
+          <w:p>
+            <w:pPr>
+              <w:spacing w:after="0" w:line="240"/>
+              <w:jc w:val="left"/>
+            </w:pPr>
+            <w:r>
+              <w:rPr>
+                <w:rFonts w:ascii="Times New Roman" w:cs="Times New Roman" w:eastAsia="Times New Roman" w:hAnsi="Times New Roman"/>
+                <w:b/>
+                <w:bCs/>
+                <w:color w:val="000000"/>
+                <w:sz w:val="20"/>
+                <w:szCs w:val="20"/>
+              </w:rPr>
+              <w:t xml:space="preserve">Vigor e Fadiga</w:t>
+            </w:r>
+          </w:p>
+        </w:tc>
+        <w:tc>
+          <w:tcPr>
+            <w:tcW w:type="dxa" w:w="2500"/>
+            <w:tcBorders>
+              <w:top w:val="none"/>
+              <w:left w:val="none"/>
+              <w:bottom w:val="none"/>
+              <w:right w:val="none"/>
+            </w:tcBorders>
+            <w:tcMar>
+              <w:top w:type="dxa" w:w="30"/>
+              <w:left w:type="dxa" w:w="70"/>
+              <w:bottom w:type="dxa" w:w="30"/>
+              <w:right w:type="dxa" w:w="70"/>
+            </w:tcMar>
+            <w:vAlign w:val="center"/>
+          </w:tcPr>
+          <w:p>
+            <w:pPr>
+              <w:spacing w:after="0" w:line="240"/>
+              <w:jc w:val="center"/>
+            </w:pPr>
+            <w:r>
+              <w:rPr>
+                <w:rFonts w:ascii="Times New Roman" w:cs="Times New Roman" w:eastAsia="Times New Roman" w:hAnsi="Times New Roman"/>
+                <w:b/>
+                <w:bCs/>
+                <w:color w:val="a12222"/>
+                <w:sz w:val="20"/>
+                <w:szCs w:val="20"/>
+              </w:rPr>
+              <w:t xml:space="preserve">-0,26</w:t>
+            </w:r>
+          </w:p>
+        </w:tc>
+        <w:tc>
+          <w:tcPr>
+            <w:tcW w:type="dxa" w:w="2500"/>
+            <w:tcBorders>
+              <w:top w:val="none"/>
+              <w:left w:val="none"/>
+              <w:bottom w:val="none"/>
+              <w:right w:val="none"/>
+            </w:tcBorders>
+            <w:tcMar>
+              <w:top w:type="dxa" w:w="30"/>
+              <w:left w:type="dxa" w:w="70"/>
+              <w:bottom w:type="dxa" w:w="30"/>
+              <w:right w:type="dxa" w:w="70"/>
+            </w:tcMar>
+            <w:vAlign w:val="center"/>
+          </w:tcPr>
+          <w:p>
+            <w:pPr>
+              <w:spacing w:after="0" w:line="240"/>
+              <w:jc w:val="center"/>
+            </w:pPr>
+            <w:r>
+              <w:rPr>
+                <w:rFonts w:ascii="Times New Roman" w:cs="Times New Roman" w:eastAsia="Times New Roman" w:hAnsi="Times New Roman"/>
+                <w:color w:val="000000"/>
+                <w:sz w:val="20"/>
+                <w:szCs w:val="20"/>
+              </w:rPr>
+              <w:t xml:space="preserve">negativa</w:t>
+            </w:r>
+          </w:p>
+        </w:tc>
+      </w:tr>
+      <w:tr>
+        <w:tc>
+          <w:tcPr>
+            <w:tcW w:type="dxa" w:w="4505"/>
+            <w:tcBorders>
+              <w:top w:val="none"/>
+              <w:left w:val="none"/>
+              <w:bottom w:val="single" w:color="000000" w:sz="6"/>
+              <w:right w:val="none"/>
+            </w:tcBorders>
+            <w:tcMar>
+              <w:top w:type="dxa" w:w="30"/>
+              <w:left w:type="dxa" w:w="70"/>
+              <w:bottom w:type="dxa" w:w="30"/>
+              <w:right w:type="dxa" w:w="70"/>
+            </w:tcMar>
+            <w:vAlign w:val="center"/>
+          </w:tcPr>
+          <w:p>
+            <w:pPr>
+              <w:spacing w:after="0" w:line="240"/>
+              <w:jc w:val="left"/>
+            </w:pPr>
+            <w:r>
+              <w:rPr>
+                <w:rFonts w:ascii="Times New Roman" w:cs="Times New Roman" w:eastAsia="Times New Roman" w:hAnsi="Times New Roman"/>
+                <w:b/>
+                <w:bCs/>
+                <w:color w:val="000000"/>
+                <w:sz w:val="20"/>
+                <w:szCs w:val="20"/>
+              </w:rPr>
+              <w:t xml:space="preserve">Vigor e Sonolência</w:t>
+            </w:r>
+          </w:p>
+        </w:tc>
+        <w:tc>
+          <w:tcPr>
+            <w:tcW w:type="dxa" w:w="2500"/>
+            <w:tcBorders>
+              <w:top w:val="none"/>
+              <w:left w:val="none"/>
+              <w:bottom w:val="single" w:color="000000" w:sz="6"/>
+              <w:right w:val="none"/>
+            </w:tcBorders>
+            <w:tcMar>
+              <w:top w:type="dxa" w:w="30"/>
+              <w:left w:type="dxa" w:w="70"/>
+              <w:bottom w:type="dxa" w:w="30"/>
+              <w:right w:type="dxa" w:w="70"/>
+            </w:tcMar>
+            <w:vAlign w:val="center"/>
+          </w:tcPr>
+          <w:p>
+            <w:pPr>
+              <w:spacing w:after="0" w:line="240"/>
+              <w:jc w:val="center"/>
+            </w:pPr>
+            <w:r>
+              <w:rPr>
+                <w:rFonts w:ascii="Times New Roman" w:cs="Times New Roman" w:eastAsia="Times New Roman" w:hAnsi="Times New Roman"/>
+                <w:b/>
+                <w:bCs/>
+                <w:color w:val="a12222"/>
+                <w:sz w:val="20"/>
+                <w:szCs w:val="20"/>
+              </w:rPr>
+              <w:t xml:space="preserve">-0,18</w:t>
+            </w:r>
+          </w:p>
+        </w:tc>
+        <w:tc>
+          <w:tcPr>
+            <w:tcW w:type="dxa" w:w="2500"/>
+            <w:tcBorders>
+              <w:top w:val="none"/>
+              <w:left w:val="none"/>
+              <w:bottom w:val="single" w:color="000000" w:sz="6"/>
+              <w:right w:val="none"/>
+            </w:tcBorders>
+            <w:tcMar>
+              <w:top w:type="dxa" w:w="30"/>
+              <w:left w:type="dxa" w:w="70"/>
+              <w:bottom w:type="dxa" w:w="30"/>
+              <w:right w:type="dxa" w:w="70"/>
+            </w:tcMar>
+            <w:vAlign w:val="center"/>
+          </w:tcPr>
+          <w:p>
+            <w:pPr>
+              <w:spacing w:after="0" w:line="240"/>
+              <w:jc w:val="center"/>
+            </w:pPr>
+            <w:r>
+              <w:rPr>
+                <w:rFonts w:ascii="Times New Roman" w:cs="Times New Roman" w:eastAsia="Times New Roman" w:hAnsi="Times New Roman"/>
+                <w:color w:val="000000"/>
+                <w:sz w:val="20"/>
+                <w:szCs w:val="20"/>
+              </w:rPr>
+              <w:t xml:space="preserve">negativa</w:t>
+            </w:r>
+          </w:p>
+        </w:tc>
+      </w:tr>
+    </w:tbl>
+    <w:p>
+      <w:pPr>
+        <w:spacing w:after="180" w:before="40" w:line="240"/>
+        <w:jc w:val="left"/>
+      </w:pPr>
+      <w:r>
+        <w:rPr>
+          <w:rFonts w:ascii="Times New Roman" w:cs="Times New Roman" w:eastAsia="Times New Roman" w:hAnsi="Times New Roman"/>
+          <w:color w:val="3f3f3f"/>
+          <w:sz w:val="20"/>
+          <w:szCs w:val="20"/>
+        </w:rPr>
+        <w:t xml:space="preserve">Nota: correlação parcial de cada par com controle de todas as demais medidas; regularização por Graphical Lasso com validação cruzada. Fonte: Dados da pesquisa (2026).</w:t>
+      </w:r>
+    </w:p>
+    <w:p>
+      <w:pPr>
+        <w:spacing w:after="0" w:before="0" w:line="360" w:lineRule="auto"/>
+        <w:ind w:firstLine="709"/>
+        <w:jc w:val="both"/>
+      </w:pPr>
+      <w:r>
+        <w:rPr>
+          <w:rFonts w:ascii="Times New Roman" w:cs="Times New Roman" w:eastAsia="Times New Roman" w:hAnsi="Times New Roman"/>
+          <w:color w:val="000000"/>
+          <w:sz w:val="24"/>
+          <w:szCs w:val="24"/>
+        </w:rPr>
+        <w:t xml:space="preserve">A segunda leitura testa a precedência temporal por meio de um painel cruzado defasado, no qual cada dimensão no dia seguinte é explicada pela própria inércia e pela defasagem de outra dimensão. O resultado é nulo, pois nenhuma defasagem cruzada atinge significância. No nível do dia, a dinâmica é dominada pela inércia de cada dimensão e pela associação contemporânea retratada na rede, e não por uma precedência temporal clara entre dimensões, leitura coerente com a curta janela de sete dias e com o tamanho reduzido da amostra.</w:t>
       </w:r>
     </w:p>
     <w:p>

</xml_diff>